<commit_message>
System description v1.1: hardware bring-up complete
Co-Authored-By: Claude Opus 5.5 <noreply@anthropic.com>
</commit_message>
<xml_diff>
--- a/docs/lunaZCU111_System_Description.docx
+++ b/docs/lunaZCU111_System_Description.docx
@@ -78,7 +78,7 @@
           <w:sz w:val="22"/>
           <w:szCs w:val="22"/>
         </w:rPr>
-        <w:t xml:space="preserve">Document version 1.0 — 28 September 2026</w:t>
+        <w:t xml:space="preserve">Document version 1.1 — 2 October 2026</w:t>
       </w:r>
     </w:p>
     <w:p>
@@ -93,7 +93,7 @@
           <w:sz w:val="21"/>
           <w:szCs w:val="21"/>
         </w:rPr>
-        <w:t xml:space="preserve">Status: FPGA design, simulations, Linux image and software complete; hardware bring-up pending.</w:t>
+        <w:t xml:space="preserve">Status: complete and working on hardware. Clocks, RF converters and multi-tile sync, triggering, DMA readout and network streaming are verified on the ZCU111, and event data is being collected.</w:t>
       </w:r>
     </w:p>
     <w:p>
@@ -3854,7 +3854,7 @@
                 <w:sz w:val="19"/>
                 <w:szCs w:val="19"/>
               </w:rPr>
-              <w:t xml:space="preserve">Trigger logic matches a brute-force Python model on 22 configurations; full-system capture test verifies centring, sample continuity, cross-channel alignment, bank rotation and lost-trigger counting</w:t>
+              <w:t xml:space="preserve">Trigger logic matches a brute-force Python model on 22 configurations; full-system capture test verifies centring, sample continuity, cross-channel alignment, bank rotation and lost-trigger counting. On hardware: clock programming, MTS, triggering, DMA readout and network streaming confirmed on the ZCU111 (October 2026)</w:t>
             </w:r>
           </w:p>
         </w:tc>
@@ -3886,7 +3886,7 @@
         <w:spacing w:after="120" w:line="276"/>
       </w:pPr>
       <w:r>
-        <w:t xml:space="preserve">The PS runs PetaLinux 2023.2 built from the ZCU111 board support package. The complete root file system is contained in the boot image (image.ub), so the SD card needs a single FAT partition. The PL blocks are accessed from user space through UIO devices defined in the device tree; the RF data converter is controlled with the Xilinx rfdc library (librfdc / libmetal).</w:t>
+        <w:t xml:space="preserve">The PS runs PetaLinux 2023.2 built from the ZCU111 board support package. The complete root file system is contained in the boot image (image.ub), so the SD card needs a single FAT partition. The PL blocks are accessed from user space through UIO devices defined in the device tree; the RF data converter is controlled with the Xilinx rfdc library (librfdc / libmetal). Because this boot image is about 110 MB uncompressed, larger than U-Boot’s default 100 MiB kernel limit, setup.sh raises CONFIG_SYS_BOOTM_LEN to 256 MiB.</w:t>
       </w:r>
     </w:p>
     <w:p>
@@ -6223,6 +6223,14 @@
       </w:pPr>
       <w:r>
         <w:t xml:space="preserve">7.1  Bring-up checks</w:t>
+      </w:r>
+    </w:p>
+    <w:p>
+      <w:pPr>
+        <w:spacing w:after="120" w:line="276"/>
+      </w:pPr>
+      <w:r>
+        <w:t xml:space="preserve">Bring-up on the ZCU111 was completed in October 2026. The clocks, RF data converters and multi-tile synchronisation, threshold triggering, DMA readout and network streaming all work, and event data is being collected. The checks below remain the procedure for a new board or SD card.</w:t>
       </w:r>
     </w:p>
     <w:p>

</xml_diff>

<commit_message>
docs: update diagrams and system description for spectrometer
- block_diagram.svg: spectrometer column (input select, 2:1 gearbox,
  pfb32x16t, subband select, dfb4096x1c, spectrum memory), clk_spec,
  IRQ [3], TCP 5002, new client tools, legend
- system_overview.svg/.png: spectrometer panel, spectrum readout/server
  in lunaserver, spectrum frame, updated status badge
- vivado_bd.svg/.pdf: re-exported from current BD (spectrometer,
  rst_spec, 4-input irq_concat)
- System Description v1.2: new 3.8 Integrating spectrometer and
  5.2 Spectrum frame, updated clocking, implementation results,
  server flow, ports, SPEC commands, client, build and bring-up

Co-Authored-By: Claude Opus 5.5 <noreply@anthropic.com>
</commit_message>
<xml_diff>
--- a/docs/lunaZCU111_System_Description.docx
+++ b/docs/lunaZCU111_System_Description.docx
@@ -27,7 +27,7 @@
           <w:sz w:val="36"/>
           <w:szCs w:val="36"/>
         </w:rPr>
-        <w:t xml:space="preserve">8-Channel 3.93 GS/s Transient Trigger and Capture System</w:t>
+        <w:t xml:space="preserve">8-Channel 3.93 GS/s Transient Trigger and Capture System with Integrating Spectrometer</w:t>
       </w:r>
     </w:p>
     <w:p>
@@ -78,7 +78,7 @@
           <w:sz w:val="22"/>
           <w:szCs w:val="22"/>
         </w:rPr>
-        <w:t xml:space="preserve">Document version 1.1 — 2 October 2026</w:t>
+        <w:t xml:space="preserve">Document version 1.2 — 8 October 2026</w:t>
       </w:r>
     </w:p>
     <w:p>
@@ -93,7 +93,7 @@
           <w:sz w:val="21"/>
           <w:szCs w:val="21"/>
         </w:rPr>
-        <w:t xml:space="preserve">Status: complete and working on hardware. Clocks, RF converters and multi-tile sync, triggering, DMA readout and network streaming are verified on the ZCU111, and event data is being collected.</w:t>
+        <w:t xml:space="preserve">Status: the trigger and capture system is complete and working on hardware: clocks, RF converters and multi-tile sync, triggering, DMA readout and network streaming are verified on the ZCU111, and event data is being collected. The integrating spectrometer (branch spectrometer) is implemented, simulated with the CSIRO filter-bank cores and built with all timing constraints met; testing on the board is pending.</w:t>
       </w:r>
     </w:p>
     <w:p>
@@ -131,6 +131,19 @@
       <w:r>
         <w:t xml:space="preserve"> using the RF data converters of the XCZU28DR RFSoC on a ZCU111 board. Every sample of every channel is compared in real time with a programmable per-channel threshold. When the combination of threshold crossings meets the selected trigger condition, a snapshot of all eight channels is captured simultaneously, with the trigger point in the centre of the record. The snapshots are read by software running on the ARM processors of the RFSoC and streamed over Gigabit Ethernet to one or more client computers, which also set the thresholds and trigger conditions over the network.</w:t>
       </w:r>
+      <w:r>
+        <w:t xml:space="preserve"> In addition, any one of the eight channels (selectable) feeds an </w:t>
+      </w:r>
+      <w:r>
+        <w:rPr>
+          <w:b/>
+          <w:bCs/>
+        </w:rPr>
+        <w:t xml:space="preserve">integrating spectrometer</w:t>
+      </w:r>
+      <w:r>
+        <w:t xml:space="preserve">: a polyphase filter bank splits it into 17 subbands of 122.88 MHz, a selected subband is split again into 4096 channels of 30 kHz, and the power in each channel is integrated (6 s by default) and streamed to the clients on a separate TCP port.</w:t>
+      </w:r>
     </w:p>
     <w:p>
       <w:pPr>
@@ -138,6 +151,9 @@
       </w:pPr>
       <w:r>
         <w:t xml:space="preserve">The design targets the detection of short, rare transients (for example nanosecond radio pulses) where the waveform on all channels around the event is required, and where coincidence or anti-coincidence between channels is used to reject local interference.</w:t>
+      </w:r>
+      <w:r>
+        <w:t xml:space="preserve"> The spectrometer runs alongside the trigger and gives a continuous, high-resolution spectrum of one input without interrupting event capture.</w:t>
       </w:r>
     </w:p>
     <w:p>
@@ -791,7 +807,131 @@
                 <w:sz w:val="19"/>
                 <w:szCs w:val="19"/>
               </w:rPr>
-              <w:t xml:space="preserve">Text commands on TCP port 5001 — thresholds etc. can be changed while events stream on port 5000</w:t>
+              <w:t xml:space="preserve">Text commands on TCP port 5001 — trigger and spectrometer settings can be changed while events stream on port 5000 and spectra on port 5002</w:t>
+            </w:r>
+          </w:p>
+        </w:tc>
+      </w:tr>
+      <w:tr>
+        <w:tc>
+          <w:tcPr>
+            <w:tcW w:type="dxa" w:w="2600"/>
+            <w:tcBorders>
+              <w:top w:val="single" w:color="A6A6A6" w:sz="4"/>
+              <w:left w:val="single" w:color="A6A6A6" w:sz="4"/>
+              <w:bottom w:val="single" w:color="A6A6A6" w:sz="4"/>
+              <w:right w:val="single" w:color="A6A6A6" w:sz="4"/>
+            </w:tcBorders>
+            <w:tcMar>
+              <w:top w:type="dxa" w:w="60"/>
+              <w:left w:type="dxa" w:w="100"/>
+              <w:bottom w:type="dxa" w:w="60"/>
+              <w:right w:type="dxa" w:w="100"/>
+            </w:tcMar>
+            <w:vAlign w:val="center"/>
+          </w:tcPr>
+          <w:p>
+            <w:pPr>
+              <w:spacing w:after="0"/>
+            </w:pPr>
+            <w:r>
+              <w:rPr>
+                <w:sz w:val="19"/>
+                <w:szCs w:val="19"/>
+              </w:rPr>
+              <w:t xml:space="preserve">Spectrometer</w:t>
+            </w:r>
+          </w:p>
+        </w:tc>
+        <w:tc>
+          <w:tcPr>
+            <w:tcW w:type="dxa" w:w="7038"/>
+            <w:tcBorders>
+              <w:top w:val="single" w:color="A6A6A6" w:sz="4"/>
+              <w:left w:val="single" w:color="A6A6A6" w:sz="4"/>
+              <w:bottom w:val="single" w:color="A6A6A6" w:sz="4"/>
+              <w:right w:val="single" w:color="A6A6A6" w:sz="4"/>
+            </w:tcBorders>
+            <w:tcMar>
+              <w:top w:type="dxa" w:w="60"/>
+              <w:left w:type="dxa" w:w="100"/>
+              <w:bottom w:type="dxa" w:w="60"/>
+              <w:right w:type="dxa" w:w="100"/>
+            </w:tcMar>
+            <w:vAlign w:val="center"/>
+          </w:tcPr>
+          <w:p>
+            <w:pPr>
+              <w:spacing w:after="0"/>
+            </w:pPr>
+            <w:r>
+              <w:rPr>
+                <w:sz w:val="19"/>
+                <w:szCs w:val="19"/>
+              </w:rPr>
+              <w:t xml:space="preserve">Any one of the 8 channels (default 0): 17 coarse subbands of 122.88 MHz (polyphase filter bank); the selected subband (default 12, centred on 1474.56 MHz) is split into 4096 fine channels of 30 kHz</w:t>
+            </w:r>
+          </w:p>
+        </w:tc>
+      </w:tr>
+      <w:tr>
+        <w:tc>
+          <w:tcPr>
+            <w:tcW w:type="dxa" w:w="2600"/>
+            <w:tcBorders>
+              <w:top w:val="single" w:color="A6A6A6" w:sz="4"/>
+              <w:left w:val="single" w:color="A6A6A6" w:sz="4"/>
+              <w:bottom w:val="single" w:color="A6A6A6" w:sz="4"/>
+              <w:right w:val="single" w:color="A6A6A6" w:sz="4"/>
+            </w:tcBorders>
+            <w:tcMar>
+              <w:top w:type="dxa" w:w="60"/>
+              <w:left w:type="dxa" w:w="100"/>
+              <w:bottom w:type="dxa" w:w="60"/>
+              <w:right w:type="dxa" w:w="100"/>
+            </w:tcMar>
+            <w:vAlign w:val="center"/>
+          </w:tcPr>
+          <w:p>
+            <w:pPr>
+              <w:spacing w:after="0"/>
+            </w:pPr>
+            <w:r>
+              <w:rPr>
+                <w:sz w:val="19"/>
+                <w:szCs w:val="19"/>
+              </w:rPr>
+              <w:t xml:space="preserve">Spectrometer integration</w:t>
+            </w:r>
+          </w:p>
+        </w:tc>
+        <w:tc>
+          <w:tcPr>
+            <w:tcW w:type="dxa" w:w="7038"/>
+            <w:tcBorders>
+              <w:top w:val="single" w:color="A6A6A6" w:sz="4"/>
+              <w:left w:val="single" w:color="A6A6A6" w:sz="4"/>
+              <w:bottom w:val="single" w:color="A6A6A6" w:sz="4"/>
+              <w:right w:val="single" w:color="A6A6A6" w:sz="4"/>
+            </w:tcBorders>
+            <w:tcMar>
+              <w:top w:type="dxa" w:w="60"/>
+              <w:left w:type="dxa" w:w="100"/>
+              <w:bottom w:type="dxa" w:w="60"/>
+              <w:right w:type="dxa" w:w="100"/>
+            </w:tcMar>
+            <w:vAlign w:val="center"/>
+          </w:tcPr>
+          <w:p>
+            <w:pPr>
+              <w:spacing w:after="0"/>
+            </w:pPr>
+            <w:r>
+              <w:rPr>
+                <w:sz w:val="19"/>
+                <w:szCs w:val="19"/>
+              </w:rPr>
+              <w:t xml:space="preserve">Power accumulated (64 bit) over N spectra of 33.33 µs, default 180000 = 6.000 s; each integration streamed on TCP port 5002</w:t>
             </w:r>
           </w:p>
         </w:tc>
@@ -889,7 +1029,7 @@
         <w:t xml:space="preserve">processing system (PS)</w:t>
       </w:r>
       <w:r>
-        <w:t xml:space="preserve">, which runs Linux and the capture server that handles triggered events, configuration and networking.</w:t>
+        <w:t xml:space="preserve">, which runs Linux and the capture server that handles triggered events, spectra, configuration and networking.</w:t>
       </w:r>
     </w:p>
     <w:p>
@@ -911,7 +1051,7 @@
       <w:r>
         <w:drawing>
           <wp:inline distT="0" distB="0" distL="0" distR="0">
-            <wp:extent cx="9144000" cy="5743575"/>
+            <wp:extent cx="9144000" cy="5687656"/>
             <wp:effectExtent t="0" r="0" b="0" l="0"/>
             <wp:docPr id="1" name="system_overview" descr="lunaZCU111 system block diagram" title="System overview"/>
             <wp:cNvGraphicFramePr>
@@ -936,7 +1076,7 @@
                   <pic:spPr bwMode="auto">
                     <a:xfrm>
                       <a:off x="0" y="0"/>
-                      <a:ext cx="9144000" cy="5743575"/>
+                      <a:ext cx="9144000" cy="5687656"/>
                     </a:xfrm>
                     <a:prstGeom prst="rect">
                       <a:avLst/>
@@ -962,7 +1102,7 @@
           <w:sz w:val="19"/>
           <w:szCs w:val="19"/>
         </w:rPr>
-        <w:t xml:space="preserve">Figure 1 — System overview: RF inputs and clocking, FPGA (PL) signal processing, ARM (PS) software, and the Ethernet client.</w:t>
+        <w:t xml:space="preserve">Figure 1 — System overview: RF inputs and clocking, FPGA (PL) trigger, capture and spectrometer processing, ARM (PS) software, and the Ethernet clients.</w:t>
       </w:r>
     </w:p>
     <w:p>
@@ -2679,7 +2819,7 @@
                 <w:sz w:val="19"/>
                 <w:szCs w:val="19"/>
               </w:rPr>
-              <w:t xml:space="preserve">MMCM → 491.52 / 245.76 MHz fabric clocks</w:t>
+              <w:t xml:space="preserve">MMCM → 491.52 / 245.76 / 122.88 MHz fabric clocks</w:t>
             </w:r>
           </w:p>
         </w:tc>
@@ -3077,7 +3217,7 @@
         <w:spacing w:after="120" w:line="276"/>
       </w:pPr>
       <w:r>
-        <w:t xml:space="preserve">The PL design is a Vivado block design (Xilinx IP) with the trigger and capture logic written in VHDL. All trigger and capture logic runs at 245.76 MHz and processes 16 samples per channel per clock cycle.</w:t>
+        <w:t xml:space="preserve">The PL design is a Vivado block design (Xilinx IP) with the trigger, capture and spectrometer control logic written in VHDL; the spectrometer filter banks are CSIRO System Generator cores. All trigger and capture logic runs at 245.76 MHz and processes 16 samples per channel per clock cycle. The spectrometer runs at 122.88 MHz (clk_spec, a third output of the same MMCM, phase aligned with the 245.76 MHz clock) and processes 32 samples per clock cycle.</w:t>
       </w:r>
     </w:p>
     <w:p>
@@ -3110,6 +3250,9 @@
       </w:pPr>
       <w:r>
         <w:t xml:space="preserve">A small synchronous gearbox per channel combines two consecutive 8-sample words into one 16-sample word at 245.76 MHz. Only this one register stage runs at 491.52 MHz, which keeps timing closure straightforward. Each 16-sample word is tagged with a common cycle counter; the absolute sample index is cycle × 16 + lane.</w:t>
+      </w:r>
+      <w:r>
+        <w:t xml:space="preserve"> A second register stage at 245.76 MHz (one extra cycle of latency, the same on every channel) separates the half-period 491.52 → 245.76 MHz transfer from the wide fan-out to the detectors, the capture memory and the spectrometer, which receives the gearbox output of all eight channels together with the sample counter (section 3.8).</w:t>
       </w:r>
     </w:p>
     <w:p>
@@ -3512,13 +3655,579 @@
       <w:r>
         <w:t xml:space="preserve">An AXI-Lite register block holds the thresholds, trigger mode, N, window, channel mask, capture length, arm/interrupt enables, status and counters (see docs/register_map.md). A level interrupt to the PS is asserted while at least one captured event is waiting.</w:t>
       </w:r>
+      <w:r>
+        <w:t xml:space="preserve"> The spectrometer has its own register block and interrupt (section 3.8).</w:t>
+      </w:r>
     </w:p>
     <w:p>
       <w:pPr>
         <w:pStyle w:val="Heading2"/>
       </w:pPr>
       <w:r>
-        <w:t xml:space="preserve">3.8  Implementation results</w:t>
+        <w:t xml:space="preserve">3.8  Integrating spectrometer</w:t>
+      </w:r>
+    </w:p>
+    <w:p>
+      <w:pPr>
+        <w:spacing w:after="120" w:line="276"/>
+      </w:pPr>
+      <w:r>
+        <w:t xml:space="preserve">Any one of the eight channels can be fed to an integrating spectrometer that runs alongside the trigger (hw/hdl/spectrometer_top.vhd). Its two filter banks are cores developed at CSIRO with System Generator (pfb32x16t, dfb4096x1c and the rounding block rnd_23_18). They are not part of the repository: the build creates them as IP-catalog instances from a local folder (refernces/PFB).</w:t>
+      </w:r>
+    </w:p>
+    <w:tbl>
+      <w:tblPr>
+        <w:tblW w:type="dxa" w:w="9638"/>
+        <w:tblBorders>
+          <w:top w:val="single" w:color="auto" w:sz="4"/>
+          <w:left w:val="single" w:color="auto" w:sz="4"/>
+          <w:bottom w:val="single" w:color="auto" w:sz="4"/>
+          <w:right w:val="single" w:color="auto" w:sz="4"/>
+          <w:insideH w:val="single" w:color="auto" w:sz="4"/>
+          <w:insideV w:val="single" w:color="auto" w:sz="4"/>
+        </w:tblBorders>
+        <w:tblLayout w:type="fixed"/>
+      </w:tblPr>
+      <w:tblGrid>
+        <w:gridCol w:w="2900"/>
+        <w:gridCol w:w="6738"/>
+      </w:tblGrid>
+      <w:tr>
+        <w:trPr>
+          <w:tblHeader/>
+        </w:trPr>
+        <w:tc>
+          <w:tcPr>
+            <w:tcW w:type="dxa" w:w="2900"/>
+            <w:tcBorders>
+              <w:top w:val="single" w:color="A6A6A6" w:sz="4"/>
+              <w:left w:val="single" w:color="A6A6A6" w:sz="4"/>
+              <w:bottom w:val="single" w:color="A6A6A6" w:sz="4"/>
+              <w:right w:val="single" w:color="A6A6A6" w:sz="4"/>
+            </w:tcBorders>
+            <w:shd w:fill="1F4E79" w:color="auto" w:val="clear"/>
+            <w:tcMar>
+              <w:top w:type="dxa" w:w="60"/>
+              <w:left w:type="dxa" w:w="100"/>
+              <w:bottom w:type="dxa" w:w="60"/>
+              <w:right w:type="dxa" w:w="100"/>
+            </w:tcMar>
+            <w:vAlign w:val="center"/>
+          </w:tcPr>
+          <w:p>
+            <w:pPr>
+              <w:spacing w:after="0"/>
+            </w:pPr>
+            <w:r>
+              <w:rPr>
+                <w:b/>
+                <w:bCs/>
+                <w:color w:val="FFFFFF"/>
+                <w:sz w:val="19"/>
+                <w:szCs w:val="19"/>
+              </w:rPr>
+              <w:t xml:space="preserve">Stage</w:t>
+            </w:r>
+          </w:p>
+        </w:tc>
+        <w:tc>
+          <w:tcPr>
+            <w:tcW w:type="dxa" w:w="6738"/>
+            <w:tcBorders>
+              <w:top w:val="single" w:color="A6A6A6" w:sz="4"/>
+              <w:left w:val="single" w:color="A6A6A6" w:sz="4"/>
+              <w:bottom w:val="single" w:color="A6A6A6" w:sz="4"/>
+              <w:right w:val="single" w:color="A6A6A6" w:sz="4"/>
+            </w:tcBorders>
+            <w:shd w:fill="1F4E79" w:color="auto" w:val="clear"/>
+            <w:tcMar>
+              <w:top w:type="dxa" w:w="60"/>
+              <w:left w:type="dxa" w:w="100"/>
+              <w:bottom w:type="dxa" w:w="60"/>
+              <w:right w:type="dxa" w:w="100"/>
+            </w:tcMar>
+            <w:vAlign w:val="center"/>
+          </w:tcPr>
+          <w:p>
+            <w:pPr>
+              <w:spacing w:after="0"/>
+            </w:pPr>
+            <w:r>
+              <w:rPr>
+                <w:b/>
+                <w:bCs/>
+                <w:color w:val="FFFFFF"/>
+                <w:sz w:val="19"/>
+                <w:szCs w:val="19"/>
+              </w:rPr>
+              <w:t xml:space="preserve">Function</w:t>
+            </w:r>
+          </w:p>
+        </w:tc>
+      </w:tr>
+      <w:tr>
+        <w:tc>
+          <w:tcPr>
+            <w:tcW w:type="dxa" w:w="2900"/>
+            <w:tcBorders>
+              <w:top w:val="single" w:color="A6A6A6" w:sz="4"/>
+              <w:left w:val="single" w:color="A6A6A6" w:sz="4"/>
+              <w:bottom w:val="single" w:color="A6A6A6" w:sz="4"/>
+              <w:right w:val="single" w:color="A6A6A6" w:sz="4"/>
+            </w:tcBorders>
+            <w:tcMar>
+              <w:top w:type="dxa" w:w="60"/>
+              <w:left w:type="dxa" w:w="100"/>
+              <w:bottom w:type="dxa" w:w="60"/>
+              <w:right w:type="dxa" w:w="100"/>
+            </w:tcMar>
+            <w:vAlign w:val="center"/>
+          </w:tcPr>
+          <w:p>
+            <w:pPr>
+              <w:spacing w:after="0"/>
+            </w:pPr>
+            <w:r>
+              <w:rPr>
+                <w:sz w:val="19"/>
+                <w:szCs w:val="19"/>
+              </w:rPr>
+              <w:t xml:space="preserve">Input select</w:t>
+            </w:r>
+          </w:p>
+        </w:tc>
+        <w:tc>
+          <w:tcPr>
+            <w:tcW w:type="dxa" w:w="6738"/>
+            <w:tcBorders>
+              <w:top w:val="single" w:color="A6A6A6" w:sz="4"/>
+              <w:left w:val="single" w:color="A6A6A6" w:sz="4"/>
+              <w:bottom w:val="single" w:color="A6A6A6" w:sz="4"/>
+              <w:right w:val="single" w:color="A6A6A6" w:sz="4"/>
+            </w:tcBorders>
+            <w:tcMar>
+              <w:top w:type="dxa" w:w="60"/>
+              <w:left w:type="dxa" w:w="100"/>
+              <w:bottom w:type="dxa" w:w="60"/>
+              <w:right w:type="dxa" w:w="100"/>
+            </w:tcMar>
+            <w:vAlign w:val="center"/>
+          </w:tcPr>
+          <w:p>
+            <w:pPr>
+              <w:spacing w:after="0"/>
+            </w:pPr>
+            <w:r>
+              <w:rPr>
+                <w:sz w:val="19"/>
+                <w:szCs w:val="19"/>
+              </w:rPr>
+              <w:t xml:space="preserve">INPUT register (0 … 7, default 0) chooses one ADC channel from the trigger core’s gearbox output; pipelined 8:1 multiplexer at 245.76 MHz</w:t>
+            </w:r>
+          </w:p>
+        </w:tc>
+      </w:tr>
+      <w:tr>
+        <w:tc>
+          <w:tcPr>
+            <w:tcW w:type="dxa" w:w="2900"/>
+            <w:tcBorders>
+              <w:top w:val="single" w:color="A6A6A6" w:sz="4"/>
+              <w:left w:val="single" w:color="A6A6A6" w:sz="4"/>
+              <w:bottom w:val="single" w:color="A6A6A6" w:sz="4"/>
+              <w:right w:val="single" w:color="A6A6A6" w:sz="4"/>
+            </w:tcBorders>
+            <w:tcMar>
+              <w:top w:type="dxa" w:w="60"/>
+              <w:left w:type="dxa" w:w="100"/>
+              <w:bottom w:type="dxa" w:w="60"/>
+              <w:right w:type="dxa" w:w="100"/>
+            </w:tcMar>
+            <w:vAlign w:val="center"/>
+          </w:tcPr>
+          <w:p>
+            <w:pPr>
+              <w:spacing w:after="0"/>
+            </w:pPr>
+            <w:r>
+              <w:rPr>
+                <w:sz w:val="19"/>
+                <w:szCs w:val="19"/>
+              </w:rPr>
+              <w:t xml:space="preserve">Gearbox</w:t>
+            </w:r>
+          </w:p>
+        </w:tc>
+        <w:tc>
+          <w:tcPr>
+            <w:tcW w:type="dxa" w:w="6738"/>
+            <w:tcBorders>
+              <w:top w:val="single" w:color="A6A6A6" w:sz="4"/>
+              <w:left w:val="single" w:color="A6A6A6" w:sz="4"/>
+              <w:bottom w:val="single" w:color="A6A6A6" w:sz="4"/>
+              <w:right w:val="single" w:color="A6A6A6" w:sz="4"/>
+            </w:tcBorders>
+            <w:tcMar>
+              <w:top w:type="dxa" w:w="60"/>
+              <w:left w:type="dxa" w:w="100"/>
+              <w:bottom w:type="dxa" w:w="60"/>
+              <w:right w:type="dxa" w:w="100"/>
+            </w:tcMar>
+            <w:vAlign w:val="center"/>
+          </w:tcPr>
+          <w:p>
+            <w:pPr>
+              <w:spacing w:after="0"/>
+            </w:pPr>
+            <w:r>
+              <w:rPr>
+                <w:sz w:val="19"/>
+                <w:szCs w:val="19"/>
+              </w:rPr>
+              <w:t xml:space="preserve">2:1, 16 samples at 245.76 MHz → 32 samples at 122.88 MHz (clk_spec)</w:t>
+            </w:r>
+          </w:p>
+        </w:tc>
+      </w:tr>
+      <w:tr>
+        <w:tc>
+          <w:tcPr>
+            <w:tcW w:type="dxa" w:w="2900"/>
+            <w:tcBorders>
+              <w:top w:val="single" w:color="A6A6A6" w:sz="4"/>
+              <w:left w:val="single" w:color="A6A6A6" w:sz="4"/>
+              <w:bottom w:val="single" w:color="A6A6A6" w:sz="4"/>
+              <w:right w:val="single" w:color="A6A6A6" w:sz="4"/>
+            </w:tcBorders>
+            <w:tcMar>
+              <w:top w:type="dxa" w:w="60"/>
+              <w:left w:type="dxa" w:w="100"/>
+              <w:bottom w:type="dxa" w:w="60"/>
+              <w:right w:type="dxa" w:w="100"/>
+            </w:tcMar>
+            <w:vAlign w:val="center"/>
+          </w:tcPr>
+          <w:p>
+            <w:pPr>
+              <w:spacing w:after="0"/>
+            </w:pPr>
+            <w:r>
+              <w:rPr>
+                <w:sz w:val="19"/>
+                <w:szCs w:val="19"/>
+              </w:rPr>
+              <w:t xml:space="preserve">Coarse filter bank (pfb32x16t)</w:t>
+            </w:r>
+          </w:p>
+        </w:tc>
+        <w:tc>
+          <w:tcPr>
+            <w:tcW w:type="dxa" w:w="6738"/>
+            <w:tcBorders>
+              <w:top w:val="single" w:color="A6A6A6" w:sz="4"/>
+              <w:left w:val="single" w:color="A6A6A6" w:sz="4"/>
+              <w:bottom w:val="single" w:color="A6A6A6" w:sz="4"/>
+              <w:right w:val="single" w:color="A6A6A6" w:sz="4"/>
+            </w:tcBorders>
+            <w:tcMar>
+              <w:top w:type="dxa" w:w="60"/>
+              <w:left w:type="dxa" w:w="100"/>
+              <w:bottom w:type="dxa" w:w="60"/>
+              <w:right w:type="dxa" w:w="100"/>
+            </w:tcMar>
+            <w:vAlign w:val="center"/>
+          </w:tcPr>
+          <w:p>
+            <w:pPr>
+              <w:spacing w:after="0"/>
+            </w:pPr>
+            <w:r>
+              <w:rPr>
+                <w:sz w:val="19"/>
+                <w:szCs w:val="19"/>
+              </w:rPr>
+              <w:t xml:space="preserve">16-channel polyphase filter bank: 32 real samples per clock → 17 complex subbands of 122.88 MHz, sampled at 122.88 MS/s; subband k is centred on k × 122.88 MHz (subbands 0 and 16 are real)</w:t>
+            </w:r>
+          </w:p>
+        </w:tc>
+      </w:tr>
+      <w:tr>
+        <w:tc>
+          <w:tcPr>
+            <w:tcW w:type="dxa" w:w="2900"/>
+            <w:tcBorders>
+              <w:top w:val="single" w:color="A6A6A6" w:sz="4"/>
+              <w:left w:val="single" w:color="A6A6A6" w:sz="4"/>
+              <w:bottom w:val="single" w:color="A6A6A6" w:sz="4"/>
+              <w:right w:val="single" w:color="A6A6A6" w:sz="4"/>
+            </w:tcBorders>
+            <w:tcMar>
+              <w:top w:type="dxa" w:w="60"/>
+              <w:left w:type="dxa" w:w="100"/>
+              <w:bottom w:type="dxa" w:w="60"/>
+              <w:right w:type="dxa" w:w="100"/>
+            </w:tcMar>
+            <w:vAlign w:val="center"/>
+          </w:tcPr>
+          <w:p>
+            <w:pPr>
+              <w:spacing w:after="0"/>
+            </w:pPr>
+            <w:r>
+              <w:rPr>
+                <w:sz w:val="19"/>
+                <w:szCs w:val="19"/>
+              </w:rPr>
+              <w:t xml:space="preserve">Subband select</w:t>
+            </w:r>
+          </w:p>
+        </w:tc>
+        <w:tc>
+          <w:tcPr>
+            <w:tcW w:type="dxa" w:w="6738"/>
+            <w:tcBorders>
+              <w:top w:val="single" w:color="A6A6A6" w:sz="4"/>
+              <w:left w:val="single" w:color="A6A6A6" w:sz="4"/>
+              <w:bottom w:val="single" w:color="A6A6A6" w:sz="4"/>
+              <w:right w:val="single" w:color="A6A6A6" w:sz="4"/>
+            </w:tcBorders>
+            <w:tcMar>
+              <w:top w:type="dxa" w:w="60"/>
+              <w:left w:type="dxa" w:w="100"/>
+              <w:bottom w:type="dxa" w:w="60"/>
+              <w:right w:type="dxa" w:w="100"/>
+            </w:tcMar>
+            <w:vAlign w:val="center"/>
+          </w:tcPr>
+          <w:p>
+            <w:pPr>
+              <w:spacing w:after="0"/>
+            </w:pPr>
+            <w:r>
+              <w:rPr>
+                <w:sz w:val="19"/>
+                <w:szCs w:val="19"/>
+              </w:rPr>
+              <w:t xml:space="preserve">SUBBAND register (0 … 16, default 12 = 1474.56 MHz) selects one subband; rnd_23_18 rounds it from 23 to 18 bits</w:t>
+            </w:r>
+          </w:p>
+        </w:tc>
+      </w:tr>
+      <w:tr>
+        <w:tc>
+          <w:tcPr>
+            <w:tcW w:type="dxa" w:w="2900"/>
+            <w:tcBorders>
+              <w:top w:val="single" w:color="A6A6A6" w:sz="4"/>
+              <w:left w:val="single" w:color="A6A6A6" w:sz="4"/>
+              <w:bottom w:val="single" w:color="A6A6A6" w:sz="4"/>
+              <w:right w:val="single" w:color="A6A6A6" w:sz="4"/>
+            </w:tcBorders>
+            <w:tcMar>
+              <w:top w:type="dxa" w:w="60"/>
+              <w:left w:type="dxa" w:w="100"/>
+              <w:bottom w:type="dxa" w:w="60"/>
+              <w:right w:type="dxa" w:w="100"/>
+            </w:tcMar>
+            <w:vAlign w:val="center"/>
+          </w:tcPr>
+          <w:p>
+            <w:pPr>
+              <w:spacing w:after="0"/>
+            </w:pPr>
+            <w:r>
+              <w:rPr>
+                <w:sz w:val="19"/>
+                <w:szCs w:val="19"/>
+              </w:rPr>
+              <w:t xml:space="preserve">Fine filter bank (dfb4096x1c)</w:t>
+            </w:r>
+          </w:p>
+        </w:tc>
+        <w:tc>
+          <w:tcPr>
+            <w:tcW w:type="dxa" w:w="6738"/>
+            <w:tcBorders>
+              <w:top w:val="single" w:color="A6A6A6" w:sz="4"/>
+              <w:left w:val="single" w:color="A6A6A6" w:sz="4"/>
+              <w:bottom w:val="single" w:color="A6A6A6" w:sz="4"/>
+              <w:right w:val="single" w:color="A6A6A6" w:sz="4"/>
+            </w:tcBorders>
+            <w:tcMar>
+              <w:top w:type="dxa" w:w="60"/>
+              <w:left w:type="dxa" w:w="100"/>
+              <w:bottom w:type="dxa" w:w="60"/>
+              <w:right w:type="dxa" w:w="100"/>
+            </w:tcMar>
+            <w:vAlign w:val="center"/>
+          </w:tcPr>
+          <w:p>
+            <w:pPr>
+              <w:spacing w:after="0"/>
+            </w:pPr>
+            <w:r>
+              <w:rPr>
+                <w:sz w:val="19"/>
+                <w:szCs w:val="19"/>
+              </w:rPr>
+              <w:t xml:space="preserve">4096 channels of 30 kHz, one spectrum every 33.33 µs; power accumulated in 64 bits over ACC_LEN + 1 spectra (default 180000 = 6.000 s)</w:t>
+            </w:r>
+          </w:p>
+        </w:tc>
+      </w:tr>
+      <w:tr>
+        <w:tc>
+          <w:tcPr>
+            <w:tcW w:type="dxa" w:w="2900"/>
+            <w:tcBorders>
+              <w:top w:val="single" w:color="A6A6A6" w:sz="4"/>
+              <w:left w:val="single" w:color="A6A6A6" w:sz="4"/>
+              <w:bottom w:val="single" w:color="A6A6A6" w:sz="4"/>
+              <w:right w:val="single" w:color="A6A6A6" w:sz="4"/>
+            </w:tcBorders>
+            <w:tcMar>
+              <w:top w:type="dxa" w:w="60"/>
+              <w:left w:type="dxa" w:w="100"/>
+              <w:bottom w:type="dxa" w:w="60"/>
+              <w:right w:type="dxa" w:w="100"/>
+            </w:tcMar>
+            <w:vAlign w:val="center"/>
+          </w:tcPr>
+          <w:p>
+            <w:pPr>
+              <w:spacing w:after="0"/>
+            </w:pPr>
+            <w:r>
+              <w:rPr>
+                <w:sz w:val="19"/>
+                <w:szCs w:val="19"/>
+              </w:rPr>
+              <w:t xml:space="preserve">Spectrum memory</w:t>
+            </w:r>
+          </w:p>
+        </w:tc>
+        <w:tc>
+          <w:tcPr>
+            <w:tcW w:type="dxa" w:w="6738"/>
+            <w:tcBorders>
+              <w:top w:val="single" w:color="A6A6A6" w:sz="4"/>
+              <w:left w:val="single" w:color="A6A6A6" w:sz="4"/>
+              <w:bottom w:val="single" w:color="A6A6A6" w:sz="4"/>
+              <w:right w:val="single" w:color="A6A6A6" w:sz="4"/>
+            </w:tcBorders>
+            <w:tcMar>
+              <w:top w:type="dxa" w:w="60"/>
+              <w:left w:type="dxa" w:w="100"/>
+              <w:bottom w:type="dxa" w:w="60"/>
+              <w:right w:type="dxa" w:w="100"/>
+            </w:tcMar>
+            <w:vAlign w:val="center"/>
+          </w:tcPr>
+          <w:p>
+            <w:pPr>
+              <w:spacing w:after="0"/>
+            </w:pPr>
+            <w:r>
+              <w:rPr>
+                <w:sz w:val="19"/>
+                <w:szCs w:val="19"/>
+              </w:rPr>
+              <w:t xml:space="preserve">2 banks × 4096 × 64 bit in UltraRAM; level interrupt (pl_ps_irq0[3], SPI 92) while a full bank is waiting; integrations arriving while both banks are full are counted as lost</w:t>
+            </w:r>
+          </w:p>
+        </w:tc>
+      </w:tr>
+      <w:tr>
+        <w:tc>
+          <w:tcPr>
+            <w:tcW w:type="dxa" w:w="2900"/>
+            <w:tcBorders>
+              <w:top w:val="single" w:color="A6A6A6" w:sz="4"/>
+              <w:left w:val="single" w:color="A6A6A6" w:sz="4"/>
+              <w:bottom w:val="single" w:color="A6A6A6" w:sz="4"/>
+              <w:right w:val="single" w:color="A6A6A6" w:sz="4"/>
+            </w:tcBorders>
+            <w:tcMar>
+              <w:top w:type="dxa" w:w="60"/>
+              <w:left w:type="dxa" w:w="100"/>
+              <w:bottom w:type="dxa" w:w="60"/>
+              <w:right w:type="dxa" w:w="100"/>
+            </w:tcMar>
+            <w:vAlign w:val="center"/>
+          </w:tcPr>
+          <w:p>
+            <w:pPr>
+              <w:spacing w:after="0"/>
+            </w:pPr>
+            <w:r>
+              <w:rPr>
+                <w:sz w:val="19"/>
+                <w:szCs w:val="19"/>
+              </w:rPr>
+              <w:t xml:space="preserve">Registers</w:t>
+            </w:r>
+          </w:p>
+        </w:tc>
+        <w:tc>
+          <w:tcPr>
+            <w:tcW w:type="dxa" w:w="6738"/>
+            <w:tcBorders>
+              <w:top w:val="single" w:color="A6A6A6" w:sz="4"/>
+              <w:left w:val="single" w:color="A6A6A6" w:sz="4"/>
+              <w:bottom w:val="single" w:color="A6A6A6" w:sz="4"/>
+              <w:right w:val="single" w:color="A6A6A6" w:sz="4"/>
+            </w:tcBorders>
+            <w:tcMar>
+              <w:top w:type="dxa" w:w="60"/>
+              <w:left w:type="dxa" w:w="100"/>
+              <w:bottom w:type="dxa" w:w="60"/>
+              <w:right w:type="dxa" w:w="100"/>
+            </w:tcMar>
+            <w:vAlign w:val="center"/>
+          </w:tcPr>
+          <w:p>
+            <w:pPr>
+              <w:spacing w:after="0"/>
+            </w:pPr>
+            <w:r>
+              <w:rPr>
+                <w:sz w:val="19"/>
+                <w:szCs w:val="19"/>
+              </w:rPr>
+              <w:t xml:space="preserve">AXI-Lite at 0xA014_0000 (128 KiB, clk_spec): enable, input, subband, integration length, status, counters and the header of the oldest bank; the banks are read at +0x10000</w:t>
+            </w:r>
+          </w:p>
+        </w:tc>
+      </w:tr>
+    </w:tbl>
+    <w:p>
+      <w:pPr>
+        <w:spacing w:after="120"/>
+      </w:pPr>
+    </w:p>
+    <w:p>
+      <w:pPr>
+        <w:spacing w:after="120" w:line="276"/>
+      </w:pPr>
+      <w:r>
+        <w:t xml:space="preserve">Enabling the spectrometer, a restart command, or a change of input, subband or integration length restarts the integration immediately. The fine filter bank needs about five spectra to re-synchronise its accumulator, so the wrapper ignores every output that begins within six spectra of a restart and stores an integration only when all 4096 channels have arrived. The first integration after a change therefore contains only new data; it is flagged as “first after restart” for information. Each stored integration carries its sequence number, input, subband, integration length and the ADC sample counter at its end, on the same time base as the trigger timestamps.</w:t>
+      </w:r>
+    </w:p>
+    <w:p>
+      <w:pPr>
+        <w:spacing w:after="120" w:line="276"/>
+      </w:pPr>
+      <w:r>
+        <w:t xml:space="preserve">The fine channels are in FFT order: channel k lies at subband × 122.88 MHz + k × 30 kHz for k &lt; 2048, and at subband × 122.88 MHz + (k − 4096) × 30 kHz for k ≥ 2048.</w:t>
+      </w:r>
+    </w:p>
+    <w:p>
+      <w:pPr>
+        <w:pStyle w:val="Heading2"/>
+        <w:keepNext/>
+      </w:pPr>
+      <w:r>
+        <w:t xml:space="preserve">3.9  Implementation results</w:t>
       </w:r>
     </w:p>
     <w:tbl>
@@ -3668,7 +4377,7 @@
                 <w:sz w:val="19"/>
                 <w:szCs w:val="19"/>
               </w:rPr>
-              <w:t xml:space="preserve">All constraints met: WNS +0.109 ns, WHS +0.010 ns</w:t>
+              <w:t xml:space="preserve">All constraints met: WNS +0.013 ns (gearbox 491.52 → 245.76 MHz half-period transfer), WHS +0.010 ns; spectrometer clock domain +2.05 ns</w:t>
             </w:r>
           </w:p>
         </w:tc>
@@ -3730,7 +4439,7 @@
                 <w:sz w:val="19"/>
                 <w:szCs w:val="19"/>
               </w:rPr>
-              <w:t xml:space="preserve">Setup slack +0.46 ns, hold slack +1.47 ns (±0.6 ns input budget)</w:t>
+              <w:t xml:space="preserve">Slack +0.75 ns (±0.6 ns input budget)</w:t>
             </w:r>
           </w:p>
         </w:tc>
@@ -3792,7 +4501,7 @@
                 <w:sz w:val="19"/>
                 <w:szCs w:val="19"/>
               </w:rPr>
-              <w:t xml:space="preserve">5.8 % LUTs, 3.3 % registers, 32 / 80 UltraRAM, 4 block RAM, 0 DSP</w:t>
+              <w:t xml:space="preserve">9.4 % LUTs, 9.5 % registers, 34 / 80 UltraRAM, 44.5 block RAM, 696 DSP (16 %; the coarse filter bank alone uses 646)</w:t>
             </w:r>
           </w:p>
         </w:tc>
@@ -3854,7 +4563,131 @@
                 <w:sz w:val="19"/>
                 <w:szCs w:val="19"/>
               </w:rPr>
-              <w:t xml:space="preserve">Trigger logic matches a brute-force Python model on 22 configurations; full-system capture test verifies centring, sample continuity, cross-channel alignment, bank rotation and lost-trigger counting. On hardware: clock programming, MTS, triggering, DMA readout and network streaming confirmed on the ZCU111 (October 2026)</w:t>
+              <w:t xml:space="preserve">Trigger logic matches a brute-force Python model on 22 configurations; full-system capture test verifies centring, sample continuity, cross-channel alignment, bank rotation and lost-trigger counting. On hardware: clock programming, MTS, triggering, DMA readout and network streaming confirmed on the ZCU111.</w:t>
+            </w:r>
+          </w:p>
+        </w:tc>
+      </w:tr>
+      <w:tr>
+        <w:tc>
+          <w:tcPr>
+            <w:tcW w:type="dxa" w:w="2600"/>
+            <w:tcBorders>
+              <w:top w:val="single" w:color="A6A6A6" w:sz="4"/>
+              <w:left w:val="single" w:color="A6A6A6" w:sz="4"/>
+              <w:bottom w:val="single" w:color="A6A6A6" w:sz="4"/>
+              <w:right w:val="single" w:color="A6A6A6" w:sz="4"/>
+            </w:tcBorders>
+            <w:tcMar>
+              <w:top w:type="dxa" w:w="60"/>
+              <w:left w:type="dxa" w:w="100"/>
+              <w:bottom w:type="dxa" w:w="60"/>
+              <w:right w:type="dxa" w:w="100"/>
+            </w:tcMar>
+            <w:vAlign w:val="center"/>
+          </w:tcPr>
+          <w:p>
+            <w:pPr>
+              <w:spacing w:after="0"/>
+            </w:pPr>
+            <w:r>
+              <w:rPr>
+                <w:sz w:val="19"/>
+                <w:szCs w:val="19"/>
+              </w:rPr>
+              <w:t xml:space="preserve">Spectrometer verification</w:t>
+            </w:r>
+          </w:p>
+        </w:tc>
+        <w:tc>
+          <w:tcPr>
+            <w:tcW w:type="dxa" w:w="7038"/>
+            <w:tcBorders>
+              <w:top w:val="single" w:color="A6A6A6" w:sz="4"/>
+              <w:left w:val="single" w:color="A6A6A6" w:sz="4"/>
+              <w:bottom w:val="single" w:color="A6A6A6" w:sz="4"/>
+              <w:right w:val="single" w:color="A6A6A6" w:sz="4"/>
+            </w:tcBorders>
+            <w:tcMar>
+              <w:top w:type="dxa" w:w="60"/>
+              <w:left w:type="dxa" w:w="100"/>
+              <w:bottom w:type="dxa" w:w="60"/>
+              <w:right w:type="dxa" w:w="100"/>
+            </w:tcMar>
+            <w:vAlign w:val="center"/>
+          </w:tcPr>
+          <w:p>
+            <w:pPr>
+              <w:spacing w:after="0"/>
+            </w:pPr>
+            <w:r>
+              <w:rPr>
+                <w:sz w:val="19"/>
+                <w:szCs w:val="19"/>
+              </w:rPr>
+              <w:t xml:space="preserve">xsim with the real CSIRO cores: with INPUT = 5, tones on ADC 5 at +25 and −100 fine channels of subband 12 appear in fine channels 25 and 3996 with the expected 16:1 power ratio and about 50 dB to the neighbouring channels; a decoy tone on another ADC does not appear; shortening the integration part way through gives a clean integration. Not yet tested on the board.</w:t>
+            </w:r>
+          </w:p>
+        </w:tc>
+      </w:tr>
+      <w:tr>
+        <w:tc>
+          <w:tcPr>
+            <w:tcW w:type="dxa" w:w="2600"/>
+            <w:tcBorders>
+              <w:top w:val="single" w:color="A6A6A6" w:sz="4"/>
+              <w:left w:val="single" w:color="A6A6A6" w:sz="4"/>
+              <w:bottom w:val="single" w:color="A6A6A6" w:sz="4"/>
+              <w:right w:val="single" w:color="A6A6A6" w:sz="4"/>
+            </w:tcBorders>
+            <w:tcMar>
+              <w:top w:type="dxa" w:w="60"/>
+              <w:left w:type="dxa" w:w="100"/>
+              <w:bottom w:type="dxa" w:w="60"/>
+              <w:right w:type="dxa" w:w="100"/>
+            </w:tcMar>
+            <w:vAlign w:val="center"/>
+          </w:tcPr>
+          <w:p>
+            <w:pPr>
+              <w:spacing w:after="0"/>
+            </w:pPr>
+            <w:r>
+              <w:rPr>
+                <w:sz w:val="19"/>
+                <w:szCs w:val="19"/>
+              </w:rPr>
+              <w:t xml:space="preserve">Trigger-only build (v1.1, on hardware)</w:t>
+            </w:r>
+          </w:p>
+        </w:tc>
+        <w:tc>
+          <w:tcPr>
+            <w:tcW w:type="dxa" w:w="7038"/>
+            <w:tcBorders>
+              <w:top w:val="single" w:color="A6A6A6" w:sz="4"/>
+              <w:left w:val="single" w:color="A6A6A6" w:sz="4"/>
+              <w:bottom w:val="single" w:color="A6A6A6" w:sz="4"/>
+              <w:right w:val="single" w:color="A6A6A6" w:sz="4"/>
+            </w:tcBorders>
+            <w:tcMar>
+              <w:top w:type="dxa" w:w="60"/>
+              <w:left w:type="dxa" w:w="100"/>
+              <w:bottom w:type="dxa" w:w="60"/>
+              <w:right w:type="dxa" w:w="100"/>
+            </w:tcMar>
+            <w:vAlign w:val="center"/>
+          </w:tcPr>
+          <w:p>
+            <w:pPr>
+              <w:spacing w:after="0"/>
+            </w:pPr>
+            <w:r>
+              <w:rPr>
+                <w:sz w:val="19"/>
+                <w:szCs w:val="19"/>
+              </w:rPr>
+              <w:t xml:space="preserve">WNS +0.109 ns, WHS +0.010 ns; 5.8 % LUTs, 32 / 80 UltraRAM, 4 block RAM, 0 DSP</w:t>
             </w:r>
           </w:p>
         </w:tc>
@@ -3954,7 +4787,7 @@
         <w:spacing w:after="60"/>
       </w:pPr>
       <w:r>
-        <w:t xml:space="preserve">Initialise the trigger core, apply the saved configuration and arm the trigger.</w:t>
+        <w:t xml:space="preserve">Initialise the trigger core and, if the bitstream contains it (trigger-core VERSION 2 or later), the spectrometer; apply the saved configuration and arm the trigger.</w:t>
       </w:r>
     </w:p>
     <w:p>
@@ -3967,7 +4800,7 @@
         <w:spacing w:after="60"/>
       </w:pPr>
       <w:r>
-        <w:t xml:space="preserve">Open TCP port 5000 (event data) and TCP port 5001 (control) and enter the event loop.</w:t>
+        <w:t xml:space="preserve">Open TCP ports 5000 (event data), 5001 (control) and 5002 (spectra) and enter the event loop.</w:t>
       </w:r>
     </w:p>
     <w:p>
@@ -3983,7 +4816,15 @@
         <w:spacing w:after="120" w:line="276"/>
       </w:pPr>
       <w:r>
-        <w:t xml:space="preserve">Settings changed over the network take effect immediately; the SAVE command writes them to lunaserver.conf on the SD card, from where they are reloaded at the next boot.</w:t>
+        <w:t xml:space="preserve">The spectrometer interrupt is handled in the same loop: the server reads the header registers and the 4096 × 64-bit powers of the oldest full bank over AXI-Lite (about 3 ms), releases the bank and queues the integration for every spectrum client on port 5002, again with a non-blocking queue per client.</w:t>
+      </w:r>
+    </w:p>
+    <w:p>
+      <w:pPr>
+        <w:spacing w:after="120" w:line="276"/>
+      </w:pPr>
+      <w:r>
+        <w:t xml:space="preserve">Settings changed over the network take effect immediately; the SAVE command writes them, including the spectrometer settings, to lunaserver.conf on the SD card, from where they are reloaded at the next boot.</w:t>
       </w:r>
     </w:p>
     <w:p>
@@ -4303,6 +5144,98 @@
           </w:p>
         </w:tc>
       </w:tr>
+      <w:tr>
+        <w:tc>
+          <w:tcPr>
+            <w:tcW w:type="dxa" w:w="1200"/>
+            <w:tcBorders>
+              <w:top w:val="single" w:color="A6A6A6" w:sz="4"/>
+              <w:left w:val="single" w:color="A6A6A6" w:sz="4"/>
+              <w:bottom w:val="single" w:color="A6A6A6" w:sz="4"/>
+              <w:right w:val="single" w:color="A6A6A6" w:sz="4"/>
+            </w:tcBorders>
+            <w:tcMar>
+              <w:top w:type="dxa" w:w="60"/>
+              <w:left w:type="dxa" w:w="100"/>
+              <w:bottom w:type="dxa" w:w="60"/>
+              <w:right w:type="dxa" w:w="100"/>
+            </w:tcMar>
+            <w:vAlign w:val="center"/>
+          </w:tcPr>
+          <w:p>
+            <w:pPr>
+              <w:spacing w:after="0"/>
+            </w:pPr>
+            <w:r>
+              <w:rPr>
+                <w:sz w:val="19"/>
+                <w:szCs w:val="19"/>
+              </w:rPr>
+              <w:t xml:space="preserve">5002</w:t>
+            </w:r>
+          </w:p>
+        </w:tc>
+        <w:tc>
+          <w:tcPr>
+            <w:tcW w:type="dxa" w:w="2000"/>
+            <w:tcBorders>
+              <w:top w:val="single" w:color="A6A6A6" w:sz="4"/>
+              <w:left w:val="single" w:color="A6A6A6" w:sz="4"/>
+              <w:bottom w:val="single" w:color="A6A6A6" w:sz="4"/>
+              <w:right w:val="single" w:color="A6A6A6" w:sz="4"/>
+            </w:tcBorders>
+            <w:tcMar>
+              <w:top w:type="dxa" w:w="60"/>
+              <w:left w:type="dxa" w:w="100"/>
+              <w:bottom w:type="dxa" w:w="60"/>
+              <w:right w:type="dxa" w:w="100"/>
+            </w:tcMar>
+            <w:vAlign w:val="center"/>
+          </w:tcPr>
+          <w:p>
+            <w:pPr>
+              <w:spacing w:after="0"/>
+            </w:pPr>
+            <w:r>
+              <w:rPr>
+                <w:sz w:val="19"/>
+                <w:szCs w:val="19"/>
+              </w:rPr>
+              <w:t xml:space="preserve">server → client</w:t>
+            </w:r>
+          </w:p>
+        </w:tc>
+        <w:tc>
+          <w:tcPr>
+            <w:tcW w:type="dxa" w:w="6438"/>
+            <w:tcBorders>
+              <w:top w:val="single" w:color="A6A6A6" w:sz="4"/>
+              <w:left w:val="single" w:color="A6A6A6" w:sz="4"/>
+              <w:bottom w:val="single" w:color="A6A6A6" w:sz="4"/>
+              <w:right w:val="single" w:color="A6A6A6" w:sz="4"/>
+            </w:tcBorders>
+            <w:tcMar>
+              <w:top w:type="dxa" w:w="60"/>
+              <w:left w:type="dxa" w:w="100"/>
+              <w:bottom w:type="dxa" w:w="60"/>
+              <w:right w:type="dxa" w:w="100"/>
+            </w:tcMar>
+            <w:vAlign w:val="center"/>
+          </w:tcPr>
+          <w:p>
+            <w:pPr>
+              <w:spacing w:after="0"/>
+            </w:pPr>
+            <w:r>
+              <w:rPr>
+                <w:sz w:val="19"/>
+                <w:szCs w:val="19"/>
+              </w:rPr>
+              <w:t xml:space="preserve">One binary frame per spectrometer integration, pushed to every connected client</w:t>
+            </w:r>
+          </w:p>
+        </w:tc>
+      </w:tr>
     </w:tbl>
     <w:p>
       <w:pPr>
@@ -4729,7 +5662,330 @@
         <w:pStyle w:val="Heading2"/>
       </w:pPr>
       <w:r>
-        <w:t xml:space="preserve">5.2  Control commands</w:t>
+        <w:t xml:space="preserve">5.2  Spectrum frame</w:t>
+      </w:r>
+    </w:p>
+    <w:tbl>
+      <w:tblPr>
+        <w:tblW w:type="dxa" w:w="9638"/>
+        <w:tblBorders>
+          <w:top w:val="single" w:color="auto" w:sz="4"/>
+          <w:left w:val="single" w:color="auto" w:sz="4"/>
+          <w:bottom w:val="single" w:color="auto" w:sz="4"/>
+          <w:right w:val="single" w:color="auto" w:sz="4"/>
+          <w:insideH w:val="single" w:color="auto" w:sz="4"/>
+          <w:insideV w:val="single" w:color="auto" w:sz="4"/>
+        </w:tblBorders>
+        <w:tblLayout w:type="fixed"/>
+      </w:tblPr>
+      <w:tblGrid>
+        <w:gridCol w:w="1800"/>
+        <w:gridCol w:w="1800"/>
+        <w:gridCol w:w="6038"/>
+      </w:tblGrid>
+      <w:tr>
+        <w:trPr>
+          <w:tblHeader/>
+        </w:trPr>
+        <w:tc>
+          <w:tcPr>
+            <w:tcW w:type="dxa" w:w="1800"/>
+            <w:tcBorders>
+              <w:top w:val="single" w:color="A6A6A6" w:sz="4"/>
+              <w:left w:val="single" w:color="A6A6A6" w:sz="4"/>
+              <w:bottom w:val="single" w:color="A6A6A6" w:sz="4"/>
+              <w:right w:val="single" w:color="A6A6A6" w:sz="4"/>
+            </w:tcBorders>
+            <w:shd w:fill="1F4E79" w:color="auto" w:val="clear"/>
+            <w:tcMar>
+              <w:top w:type="dxa" w:w="60"/>
+              <w:left w:type="dxa" w:w="100"/>
+              <w:bottom w:type="dxa" w:w="60"/>
+              <w:right w:type="dxa" w:w="100"/>
+            </w:tcMar>
+            <w:vAlign w:val="center"/>
+          </w:tcPr>
+          <w:p>
+            <w:pPr>
+              <w:spacing w:after="0"/>
+            </w:pPr>
+            <w:r>
+              <w:rPr>
+                <w:b/>
+                <w:bCs/>
+                <w:color w:val="FFFFFF"/>
+                <w:sz w:val="19"/>
+                <w:szCs w:val="19"/>
+              </w:rPr>
+              <w:t xml:space="preserve">Part</w:t>
+            </w:r>
+          </w:p>
+        </w:tc>
+        <w:tc>
+          <w:tcPr>
+            <w:tcW w:type="dxa" w:w="1800"/>
+            <w:tcBorders>
+              <w:top w:val="single" w:color="A6A6A6" w:sz="4"/>
+              <w:left w:val="single" w:color="A6A6A6" w:sz="4"/>
+              <w:bottom w:val="single" w:color="A6A6A6" w:sz="4"/>
+              <w:right w:val="single" w:color="A6A6A6" w:sz="4"/>
+            </w:tcBorders>
+            <w:shd w:fill="1F4E79" w:color="auto" w:val="clear"/>
+            <w:tcMar>
+              <w:top w:type="dxa" w:w="60"/>
+              <w:left w:type="dxa" w:w="100"/>
+              <w:bottom w:type="dxa" w:w="60"/>
+              <w:right w:type="dxa" w:w="100"/>
+            </w:tcMar>
+            <w:vAlign w:val="center"/>
+          </w:tcPr>
+          <w:p>
+            <w:pPr>
+              <w:spacing w:after="0"/>
+            </w:pPr>
+            <w:r>
+              <w:rPr>
+                <w:b/>
+                <w:bCs/>
+                <w:color w:val="FFFFFF"/>
+                <w:sz w:val="19"/>
+                <w:szCs w:val="19"/>
+              </w:rPr>
+              <w:t xml:space="preserve">Size</w:t>
+            </w:r>
+          </w:p>
+        </w:tc>
+        <w:tc>
+          <w:tcPr>
+            <w:tcW w:type="dxa" w:w="6038"/>
+            <w:tcBorders>
+              <w:top w:val="single" w:color="A6A6A6" w:sz="4"/>
+              <w:left w:val="single" w:color="A6A6A6" w:sz="4"/>
+              <w:bottom w:val="single" w:color="A6A6A6" w:sz="4"/>
+              <w:right w:val="single" w:color="A6A6A6" w:sz="4"/>
+            </w:tcBorders>
+            <w:shd w:fill="1F4E79" w:color="auto" w:val="clear"/>
+            <w:tcMar>
+              <w:top w:type="dxa" w:w="60"/>
+              <w:left w:type="dxa" w:w="100"/>
+              <w:bottom w:type="dxa" w:w="60"/>
+              <w:right w:type="dxa" w:w="100"/>
+            </w:tcMar>
+            <w:vAlign w:val="center"/>
+          </w:tcPr>
+          <w:p>
+            <w:pPr>
+              <w:spacing w:after="0"/>
+            </w:pPr>
+            <w:r>
+              <w:rPr>
+                <w:b/>
+                <w:bCs/>
+                <w:color w:val="FFFFFF"/>
+                <w:sz w:val="19"/>
+                <w:szCs w:val="19"/>
+              </w:rPr>
+              <w:t xml:space="preserve">Content</w:t>
+            </w:r>
+          </w:p>
+        </w:tc>
+      </w:tr>
+      <w:tr>
+        <w:tc>
+          <w:tcPr>
+            <w:tcW w:type="dxa" w:w="1800"/>
+            <w:tcBorders>
+              <w:top w:val="single" w:color="A6A6A6" w:sz="4"/>
+              <w:left w:val="single" w:color="A6A6A6" w:sz="4"/>
+              <w:bottom w:val="single" w:color="A6A6A6" w:sz="4"/>
+              <w:right w:val="single" w:color="A6A6A6" w:sz="4"/>
+            </w:tcBorders>
+            <w:tcMar>
+              <w:top w:type="dxa" w:w="60"/>
+              <w:left w:type="dxa" w:w="100"/>
+              <w:bottom w:type="dxa" w:w="60"/>
+              <w:right w:type="dxa" w:w="100"/>
+            </w:tcMar>
+            <w:vAlign w:val="center"/>
+          </w:tcPr>
+          <w:p>
+            <w:pPr>
+              <w:spacing w:after="0"/>
+            </w:pPr>
+            <w:r>
+              <w:rPr>
+                <w:sz w:val="19"/>
+                <w:szCs w:val="19"/>
+              </w:rPr>
+              <w:t xml:space="preserve">Header</w:t>
+            </w:r>
+          </w:p>
+        </w:tc>
+        <w:tc>
+          <w:tcPr>
+            <w:tcW w:type="dxa" w:w="1800"/>
+            <w:tcBorders>
+              <w:top w:val="single" w:color="A6A6A6" w:sz="4"/>
+              <w:left w:val="single" w:color="A6A6A6" w:sz="4"/>
+              <w:bottom w:val="single" w:color="A6A6A6" w:sz="4"/>
+              <w:right w:val="single" w:color="A6A6A6" w:sz="4"/>
+            </w:tcBorders>
+            <w:tcMar>
+              <w:top w:type="dxa" w:w="60"/>
+              <w:left w:type="dxa" w:w="100"/>
+              <w:bottom w:type="dxa" w:w="60"/>
+              <w:right w:type="dxa" w:w="100"/>
+            </w:tcMar>
+            <w:vAlign w:val="center"/>
+          </w:tcPr>
+          <w:p>
+            <w:pPr>
+              <w:spacing w:after="0"/>
+            </w:pPr>
+            <w:r>
+              <w:rPr>
+                <w:sz w:val="19"/>
+                <w:szCs w:val="19"/>
+              </w:rPr>
+              <w:t xml:space="preserve">64 bytes</w:t>
+            </w:r>
+          </w:p>
+        </w:tc>
+        <w:tc>
+          <w:tcPr>
+            <w:tcW w:type="dxa" w:w="6038"/>
+            <w:tcBorders>
+              <w:top w:val="single" w:color="A6A6A6" w:sz="4"/>
+              <w:left w:val="single" w:color="A6A6A6" w:sz="4"/>
+              <w:bottom w:val="single" w:color="A6A6A6" w:sz="4"/>
+              <w:right w:val="single" w:color="A6A6A6" w:sz="4"/>
+            </w:tcBorders>
+            <w:tcMar>
+              <w:top w:type="dxa" w:w="60"/>
+              <w:left w:type="dxa" w:w="100"/>
+              <w:bottom w:type="dxa" w:w="60"/>
+              <w:right w:type="dxa" w:w="100"/>
+            </w:tcMar>
+            <w:vAlign w:val="center"/>
+          </w:tcPr>
+          <w:p>
+            <w:pPr>
+              <w:spacing w:after="0"/>
+            </w:pPr>
+            <w:r>
+              <w:rPr>
+                <w:sz w:val="19"/>
+                <w:szCs w:val="19"/>
+              </w:rPr>
+              <w:t xml:space="preserve">Magic “LSPC”, version, frame size, flags (simulated data, first integration after a restart), host time of readout, ADC sample counter at the end of the integration, sample rate, sequence number, number of spectra, frames dropped for this client, integrations lost in the FPGA, number of channels, subband, ADC input, restart count</w:t>
+            </w:r>
+          </w:p>
+        </w:tc>
+      </w:tr>
+      <w:tr>
+        <w:tc>
+          <w:tcPr>
+            <w:tcW w:type="dxa" w:w="1800"/>
+            <w:tcBorders>
+              <w:top w:val="single" w:color="A6A6A6" w:sz="4"/>
+              <w:left w:val="single" w:color="A6A6A6" w:sz="4"/>
+              <w:bottom w:val="single" w:color="A6A6A6" w:sz="4"/>
+              <w:right w:val="single" w:color="A6A6A6" w:sz="4"/>
+            </w:tcBorders>
+            <w:tcMar>
+              <w:top w:type="dxa" w:w="60"/>
+              <w:left w:type="dxa" w:w="100"/>
+              <w:bottom w:type="dxa" w:w="60"/>
+              <w:right w:type="dxa" w:w="100"/>
+            </w:tcMar>
+            <w:vAlign w:val="center"/>
+          </w:tcPr>
+          <w:p>
+            <w:pPr>
+              <w:spacing w:after="0"/>
+            </w:pPr>
+            <w:r>
+              <w:rPr>
+                <w:sz w:val="19"/>
+                <w:szCs w:val="19"/>
+              </w:rPr>
+              <w:t xml:space="preserve">Power</w:t>
+            </w:r>
+          </w:p>
+        </w:tc>
+        <w:tc>
+          <w:tcPr>
+            <w:tcW w:type="dxa" w:w="1800"/>
+            <w:tcBorders>
+              <w:top w:val="single" w:color="A6A6A6" w:sz="4"/>
+              <w:left w:val="single" w:color="A6A6A6" w:sz="4"/>
+              <w:bottom w:val="single" w:color="A6A6A6" w:sz="4"/>
+              <w:right w:val="single" w:color="A6A6A6" w:sz="4"/>
+            </w:tcBorders>
+            <w:tcMar>
+              <w:top w:type="dxa" w:w="60"/>
+              <w:left w:type="dxa" w:w="100"/>
+              <w:bottom w:type="dxa" w:w="60"/>
+              <w:right w:type="dxa" w:w="100"/>
+            </w:tcMar>
+            <w:vAlign w:val="center"/>
+          </w:tcPr>
+          <w:p>
+            <w:pPr>
+              <w:spacing w:after="0"/>
+            </w:pPr>
+            <w:r>
+              <w:rPr>
+                <w:sz w:val="19"/>
+                <w:szCs w:val="19"/>
+              </w:rPr>
+              <w:t xml:space="preserve">4096 × 8 bytes</w:t>
+            </w:r>
+          </w:p>
+        </w:tc>
+        <w:tc>
+          <w:tcPr>
+            <w:tcW w:type="dxa" w:w="6038"/>
+            <w:tcBorders>
+              <w:top w:val="single" w:color="A6A6A6" w:sz="4"/>
+              <w:left w:val="single" w:color="A6A6A6" w:sz="4"/>
+              <w:bottom w:val="single" w:color="A6A6A6" w:sz="4"/>
+              <w:right w:val="single" w:color="A6A6A6" w:sz="4"/>
+            </w:tcBorders>
+            <w:tcMar>
+              <w:top w:type="dxa" w:w="60"/>
+              <w:left w:type="dxa" w:w="100"/>
+              <w:bottom w:type="dxa" w:w="60"/>
+              <w:right w:type="dxa" w:w="100"/>
+            </w:tcMar>
+            <w:vAlign w:val="center"/>
+          </w:tcPr>
+          <w:p>
+            <w:pPr>
+              <w:spacing w:after="0"/>
+            </w:pPr>
+            <w:r>
+              <w:rPr>
+                <w:sz w:val="19"/>
+                <w:szCs w:val="19"/>
+              </w:rPr>
+              <w:t xml:space="preserve">uint64 little endian, accumulated power per fine channel in FFT order; power / number of spectra is the mean power per spectrum</w:t>
+            </w:r>
+          </w:p>
+        </w:tc>
+      </w:tr>
+    </w:tbl>
+    <w:p>
+      <w:pPr>
+        <w:spacing w:after="120"/>
+      </w:pPr>
+    </w:p>
+    <w:p>
+      <w:pPr>
+        <w:pStyle w:val="Heading2"/>
+      </w:pPr>
+      <w:r>
+        <w:t xml:space="preserve">5.3  Control commands</w:t>
       </w:r>
     </w:p>
     <w:tbl>
@@ -5407,6 +6663,316 @@
                 <w:sz w:val="19"/>
                 <w:szCs w:val="19"/>
               </w:rPr>
+              <w:t xml:space="preserve">GET SPEC</w:t>
+            </w:r>
+          </w:p>
+        </w:tc>
+        <w:tc>
+          <w:tcPr>
+            <w:tcW w:type="dxa" w:w="6038"/>
+            <w:tcBorders>
+              <w:top w:val="single" w:color="A6A6A6" w:sz="4"/>
+              <w:left w:val="single" w:color="A6A6A6" w:sz="4"/>
+              <w:bottom w:val="single" w:color="A6A6A6" w:sz="4"/>
+              <w:right w:val="single" w:color="A6A6A6" w:sz="4"/>
+            </w:tcBorders>
+            <w:tcMar>
+              <w:top w:type="dxa" w:w="60"/>
+              <w:left w:type="dxa" w:w="100"/>
+              <w:bottom w:type="dxa" w:w="60"/>
+              <w:right w:type="dxa" w:w="100"/>
+            </w:tcMar>
+            <w:vAlign w:val="center"/>
+          </w:tcPr>
+          <w:p>
+            <w:pPr>
+              <w:spacing w:after="0"/>
+            </w:pPr>
+            <w:r>
+              <w:rPr>
+                <w:sz w:val="19"/>
+                <w:szCs w:val="19"/>
+              </w:rPr>
+              <w:t xml:space="preserve">Spectrometer settings and counters: input, subband, integration time, centre frequency, integrations, lost, restarts, clients</w:t>
+            </w:r>
+          </w:p>
+        </w:tc>
+      </w:tr>
+      <w:tr>
+        <w:tc>
+          <w:tcPr>
+            <w:tcW w:type="dxa" w:w="3600"/>
+            <w:tcBorders>
+              <w:top w:val="single" w:color="A6A6A6" w:sz="4"/>
+              <w:left w:val="single" w:color="A6A6A6" w:sz="4"/>
+              <w:bottom w:val="single" w:color="A6A6A6" w:sz="4"/>
+              <w:right w:val="single" w:color="A6A6A6" w:sz="4"/>
+            </w:tcBorders>
+            <w:tcMar>
+              <w:top w:type="dxa" w:w="60"/>
+              <w:left w:type="dxa" w:w="100"/>
+              <w:bottom w:type="dxa" w:w="60"/>
+              <w:right w:type="dxa" w:w="100"/>
+            </w:tcMar>
+            <w:vAlign w:val="center"/>
+          </w:tcPr>
+          <w:p>
+            <w:pPr>
+              <w:spacing w:after="0"/>
+            </w:pPr>
+            <w:r>
+              <w:rPr>
+                <w:sz w:val="19"/>
+                <w:szCs w:val="19"/>
+              </w:rPr>
+              <w:t xml:space="preserve">SPEC ON | OFF | RESTART</w:t>
+            </w:r>
+          </w:p>
+        </w:tc>
+        <w:tc>
+          <w:tcPr>
+            <w:tcW w:type="dxa" w:w="6038"/>
+            <w:tcBorders>
+              <w:top w:val="single" w:color="A6A6A6" w:sz="4"/>
+              <w:left w:val="single" w:color="A6A6A6" w:sz="4"/>
+              <w:bottom w:val="single" w:color="A6A6A6" w:sz="4"/>
+              <w:right w:val="single" w:color="A6A6A6" w:sz="4"/>
+            </w:tcBorders>
+            <w:tcMar>
+              <w:top w:type="dxa" w:w="60"/>
+              <w:left w:type="dxa" w:w="100"/>
+              <w:bottom w:type="dxa" w:w="60"/>
+              <w:right w:type="dxa" w:w="100"/>
+            </w:tcMar>
+            <w:vAlign w:val="center"/>
+          </w:tcPr>
+          <w:p>
+            <w:pPr>
+              <w:spacing w:after="0"/>
+            </w:pPr>
+            <w:r>
+              <w:rPr>
+                <w:sz w:val="19"/>
+                <w:szCs w:val="19"/>
+              </w:rPr>
+              <w:t xml:space="preserve">Enable or disable the spectrometer; start a fresh integration</w:t>
+            </w:r>
+          </w:p>
+        </w:tc>
+      </w:tr>
+      <w:tr>
+        <w:tc>
+          <w:tcPr>
+            <w:tcW w:type="dxa" w:w="3600"/>
+            <w:tcBorders>
+              <w:top w:val="single" w:color="A6A6A6" w:sz="4"/>
+              <w:left w:val="single" w:color="A6A6A6" w:sz="4"/>
+              <w:bottom w:val="single" w:color="A6A6A6" w:sz="4"/>
+              <w:right w:val="single" w:color="A6A6A6" w:sz="4"/>
+            </w:tcBorders>
+            <w:tcMar>
+              <w:top w:type="dxa" w:w="60"/>
+              <w:left w:type="dxa" w:w="100"/>
+              <w:bottom w:type="dxa" w:w="60"/>
+              <w:right w:type="dxa" w:w="100"/>
+            </w:tcMar>
+            <w:vAlign w:val="center"/>
+          </w:tcPr>
+          <w:p>
+            <w:pPr>
+              <w:spacing w:after="0"/>
+            </w:pPr>
+            <w:r>
+              <w:rPr>
+                <w:sz w:val="19"/>
+                <w:szCs w:val="19"/>
+              </w:rPr>
+              <w:t xml:space="preserve">SET SPEC_INPUT &lt;0-7&gt;</w:t>
+            </w:r>
+          </w:p>
+        </w:tc>
+        <w:tc>
+          <w:tcPr>
+            <w:tcW w:type="dxa" w:w="6038"/>
+            <w:tcBorders>
+              <w:top w:val="single" w:color="A6A6A6" w:sz="4"/>
+              <w:left w:val="single" w:color="A6A6A6" w:sz="4"/>
+              <w:bottom w:val="single" w:color="A6A6A6" w:sz="4"/>
+              <w:right w:val="single" w:color="A6A6A6" w:sz="4"/>
+            </w:tcBorders>
+            <w:tcMar>
+              <w:top w:type="dxa" w:w="60"/>
+              <w:left w:type="dxa" w:w="100"/>
+              <w:bottom w:type="dxa" w:w="60"/>
+              <w:right w:type="dxa" w:w="100"/>
+            </w:tcMar>
+            <w:vAlign w:val="center"/>
+          </w:tcPr>
+          <w:p>
+            <w:pPr>
+              <w:spacing w:after="0"/>
+            </w:pPr>
+            <w:r>
+              <w:rPr>
+                <w:sz w:val="19"/>
+                <w:szCs w:val="19"/>
+              </w:rPr>
+              <w:t xml:space="preserve">ADC channel feeding the spectrometer (default 0)</w:t>
+            </w:r>
+          </w:p>
+        </w:tc>
+      </w:tr>
+      <w:tr>
+        <w:tc>
+          <w:tcPr>
+            <w:tcW w:type="dxa" w:w="3600"/>
+            <w:tcBorders>
+              <w:top w:val="single" w:color="A6A6A6" w:sz="4"/>
+              <w:left w:val="single" w:color="A6A6A6" w:sz="4"/>
+              <w:bottom w:val="single" w:color="A6A6A6" w:sz="4"/>
+              <w:right w:val="single" w:color="A6A6A6" w:sz="4"/>
+            </w:tcBorders>
+            <w:tcMar>
+              <w:top w:type="dxa" w:w="60"/>
+              <w:left w:type="dxa" w:w="100"/>
+              <w:bottom w:type="dxa" w:w="60"/>
+              <w:right w:type="dxa" w:w="100"/>
+            </w:tcMar>
+            <w:vAlign w:val="center"/>
+          </w:tcPr>
+          <w:p>
+            <w:pPr>
+              <w:spacing w:after="0"/>
+            </w:pPr>
+            <w:r>
+              <w:rPr>
+                <w:sz w:val="19"/>
+                <w:szCs w:val="19"/>
+              </w:rPr>
+              <w:t xml:space="preserve">SET SPEC_SUBBAND &lt;0-16&gt;</w:t>
+            </w:r>
+          </w:p>
+        </w:tc>
+        <w:tc>
+          <w:tcPr>
+            <w:tcW w:type="dxa" w:w="6038"/>
+            <w:tcBorders>
+              <w:top w:val="single" w:color="A6A6A6" w:sz="4"/>
+              <w:left w:val="single" w:color="A6A6A6" w:sz="4"/>
+              <w:bottom w:val="single" w:color="A6A6A6" w:sz="4"/>
+              <w:right w:val="single" w:color="A6A6A6" w:sz="4"/>
+            </w:tcBorders>
+            <w:tcMar>
+              <w:top w:type="dxa" w:w="60"/>
+              <w:left w:type="dxa" w:w="100"/>
+              <w:bottom w:type="dxa" w:w="60"/>
+              <w:right w:type="dxa" w:w="100"/>
+            </w:tcMar>
+            <w:vAlign w:val="center"/>
+          </w:tcPr>
+          <w:p>
+            <w:pPr>
+              <w:spacing w:after="0"/>
+            </w:pPr>
+            <w:r>
+              <w:rPr>
+                <w:sz w:val="19"/>
+                <w:szCs w:val="19"/>
+              </w:rPr>
+              <w:t xml:space="preserve">Coarse subband, centred on k × 122.88 MHz (default 12)</w:t>
+            </w:r>
+          </w:p>
+        </w:tc>
+      </w:tr>
+      <w:tr>
+        <w:tc>
+          <w:tcPr>
+            <w:tcW w:type="dxa" w:w="3600"/>
+            <w:tcBorders>
+              <w:top w:val="single" w:color="A6A6A6" w:sz="4"/>
+              <w:left w:val="single" w:color="A6A6A6" w:sz="4"/>
+              <w:bottom w:val="single" w:color="A6A6A6" w:sz="4"/>
+              <w:right w:val="single" w:color="A6A6A6" w:sz="4"/>
+            </w:tcBorders>
+            <w:tcMar>
+              <w:top w:type="dxa" w:w="60"/>
+              <w:left w:type="dxa" w:w="100"/>
+              <w:bottom w:type="dxa" w:w="60"/>
+              <w:right w:type="dxa" w:w="100"/>
+            </w:tcMar>
+            <w:vAlign w:val="center"/>
+          </w:tcPr>
+          <w:p>
+            <w:pPr>
+              <w:spacing w:after="0"/>
+            </w:pPr>
+            <w:r>
+              <w:rPr>
+                <w:sz w:val="19"/>
+                <w:szCs w:val="19"/>
+              </w:rPr>
+              <w:t xml:space="preserve">SET SPEC_TINT &lt;s&gt; | SPEC_NSPEC &lt;n&gt;</w:t>
+            </w:r>
+          </w:p>
+        </w:tc>
+        <w:tc>
+          <w:tcPr>
+            <w:tcW w:type="dxa" w:w="6038"/>
+            <w:tcBorders>
+              <w:top w:val="single" w:color="A6A6A6" w:sz="4"/>
+              <w:left w:val="single" w:color="A6A6A6" w:sz="4"/>
+              <w:bottom w:val="single" w:color="A6A6A6" w:sz="4"/>
+              <w:right w:val="single" w:color="A6A6A6" w:sz="4"/>
+            </w:tcBorders>
+            <w:tcMar>
+              <w:top w:type="dxa" w:w="60"/>
+              <w:left w:type="dxa" w:w="100"/>
+              <w:bottom w:type="dxa" w:w="60"/>
+              <w:right w:type="dxa" w:w="100"/>
+            </w:tcMar>
+            <w:vAlign w:val="center"/>
+          </w:tcPr>
+          <w:p>
+            <w:pPr>
+              <w:spacing w:after="0"/>
+            </w:pPr>
+            <w:r>
+              <w:rPr>
+                <w:sz w:val="19"/>
+                <w:szCs w:val="19"/>
+              </w:rPr>
+              <w:t xml:space="preserve">Integration time in seconds or in spectra of 33.33 µs (default 6.0 s = 180000); any spectrometer setting restarts the integration</w:t>
+            </w:r>
+          </w:p>
+        </w:tc>
+      </w:tr>
+      <w:tr>
+        <w:tc>
+          <w:tcPr>
+            <w:tcW w:type="dxa" w:w="3600"/>
+            <w:tcBorders>
+              <w:top w:val="single" w:color="A6A6A6" w:sz="4"/>
+              <w:left w:val="single" w:color="A6A6A6" w:sz="4"/>
+              <w:bottom w:val="single" w:color="A6A6A6" w:sz="4"/>
+              <w:right w:val="single" w:color="A6A6A6" w:sz="4"/>
+            </w:tcBorders>
+            <w:tcMar>
+              <w:top w:type="dxa" w:w="60"/>
+              <w:left w:type="dxa" w:w="100"/>
+              <w:bottom w:type="dxa" w:w="60"/>
+              <w:right w:type="dxa" w:w="100"/>
+            </w:tcMar>
+            <w:vAlign w:val="center"/>
+          </w:tcPr>
+          <w:p>
+            <w:pPr>
+              <w:spacing w:after="0"/>
+            </w:pPr>
+            <w:r>
+              <w:rPr>
+                <w:sz w:val="19"/>
+                <w:szCs w:val="19"/>
+              </w:rPr>
               <w:t xml:space="preserve">RESYNC / SAVE / HELP</w:t>
             </w:r>
           </w:p>
@@ -5437,7 +7003,7 @@
                 <w:sz w:val="19"/>
                 <w:szCs w:val="19"/>
               </w:rPr>
-              <w:t xml:space="preserve">Repeat multi-tile sync; save settings; list commands</w:t>
+              <w:t xml:space="preserve">Repeat multi-tile sync; save settings (including the spectrometer); list commands</w:t>
             </w:r>
           </w:p>
         </w:tc>
@@ -5453,7 +7019,7 @@
         <w:pStyle w:val="Heading2"/>
       </w:pPr>
       <w:r>
-        <w:t xml:space="preserve">5.3  Python client</w:t>
+        <w:t xml:space="preserve">5.4  Python client</w:t>
       </w:r>
     </w:p>
     <w:p>
@@ -5461,7 +7027,7 @@
         <w:spacing w:after="120" w:line="276"/>
       </w:pPr>
       <w:r>
-        <w:t xml:space="preserve">The client library lunaclient (Python and numpy) provides an EventStream class that returns each event as an 8 × L numpy array with its metadata, a Control class for the commands, and the luna-client command line tool (status, set, watch, record to .npz files). Because data and control use separate connections, a program can adjust thresholds while it receives events, for example to hold the event rate constant:</w:t>
+        <w:t xml:space="preserve">The client library lunaclient (Python and numpy) provides an EventStream class that returns each event as an 8 × L numpy array with its metadata, a SpectrumStream class that returns each spectrometer integration with its frequency axis, a Control class for the commands, and the luna-client and luna-spec command line tools (status, set, watch, record to .npz files; luna-spec also plots live). Because data and control use separate connections, a program can adjust thresholds while it receives events, for example to hold the event rate constant:</w:t>
       </w:r>
     </w:p>
     <w:p>
@@ -5652,7 +7218,54 @@
         <w:t xml:space="preserve">luna-client record -o data/</w:t>
       </w:r>
       <w:r>
+        <w:t xml:space="preserve">, </w:t>
+      </w:r>
+      <w:r>
+        <w:rPr>
+          <w:rFonts w:ascii="Consolas" w:cs="Consolas" w:eastAsia="Consolas" w:hAnsi="Consolas"/>
+          <w:sz w:val="19"/>
+          <w:szCs w:val="19"/>
+        </w:rPr>
+        <w:t xml:space="preserve">luna-spec set --input 0 --subband 12 --tint 6 --on --save</w:t>
+      </w:r>
+      <w:r>
+        <w:t xml:space="preserve">, </w:t>
+      </w:r>
+      <w:r>
+        <w:rPr>
+          <w:rFonts w:ascii="Consolas" w:cs="Consolas" w:eastAsia="Consolas" w:hAnsi="Consolas"/>
+          <w:sz w:val="19"/>
+          <w:szCs w:val="19"/>
+        </w:rPr>
+        <w:t xml:space="preserve">luna-spec record -o spectra/ --skip-first</w:t>
+      </w:r>
+      <w:r>
         <w:t xml:space="preserve">.</w:t>
+      </w:r>
+    </w:p>
+    <w:p>
+      <w:pPr>
+        <w:spacing w:after="120" w:line="276"/>
+      </w:pPr>
+      <w:r>
+        <w:rPr>
+          <w:b/>
+          <w:bCs/>
+        </w:rPr>
+        <w:t xml:space="preserve">lunaGUI</w:t>
+      </w:r>
+      <w:r>
+        <w:t xml:space="preserve"> (PyQt6) is a graphical front end built on the same library: a control panel for the trigger and the spectrometer, live plots of each event (time trace, spectrum and histogram per channel), a spectrum window for the spectrometer, and recording to .npz files. </w:t>
+      </w:r>
+      <w:r>
+        <w:rPr>
+          <w:b/>
+          <w:bCs/>
+        </w:rPr>
+        <w:t xml:space="preserve">lunaAnalyser</w:t>
+      </w:r>
+      <w:r>
+        <w:t xml:space="preserve"> (sw/lunaAnalyser) is an offline viewer that steps through a directory of recorded events with the same plots, markers and PNG export.</w:t>
       </w:r>
     </w:p>
     <w:p>
@@ -6125,6 +7738,192 @@
           </w:p>
         </w:tc>
       </w:tr>
+      <w:tr>
+        <w:tc>
+          <w:tcPr>
+            <w:tcW w:type="dxa" w:w="3400"/>
+            <w:tcBorders>
+              <w:top w:val="single" w:color="A6A6A6" w:sz="4"/>
+              <w:left w:val="single" w:color="A6A6A6" w:sz="4"/>
+              <w:bottom w:val="single" w:color="A6A6A6" w:sz="4"/>
+              <w:right w:val="single" w:color="A6A6A6" w:sz="4"/>
+            </w:tcBorders>
+            <w:tcMar>
+              <w:top w:type="dxa" w:w="60"/>
+              <w:left w:type="dxa" w:w="100"/>
+              <w:bottom w:type="dxa" w:w="60"/>
+              <w:right w:type="dxa" w:w="100"/>
+            </w:tcMar>
+            <w:vAlign w:val="center"/>
+          </w:tcPr>
+          <w:p>
+            <w:pPr>
+              <w:spacing w:after="0"/>
+            </w:pPr>
+            <w:r>
+              <w:rPr>
+                <w:sz w:val="19"/>
+                <w:szCs w:val="19"/>
+              </w:rPr>
+              <w:t xml:space="preserve">Spectrometer resolution</w:t>
+            </w:r>
+          </w:p>
+        </w:tc>
+        <w:tc>
+          <w:tcPr>
+            <w:tcW w:type="dxa" w:w="6238"/>
+            <w:tcBorders>
+              <w:top w:val="single" w:color="A6A6A6" w:sz="4"/>
+              <w:left w:val="single" w:color="A6A6A6" w:sz="4"/>
+              <w:bottom w:val="single" w:color="A6A6A6" w:sz="4"/>
+              <w:right w:val="single" w:color="A6A6A6" w:sz="4"/>
+            </w:tcBorders>
+            <w:tcMar>
+              <w:top w:type="dxa" w:w="60"/>
+              <w:left w:type="dxa" w:w="100"/>
+              <w:bottom w:type="dxa" w:w="60"/>
+              <w:right w:type="dxa" w:w="100"/>
+            </w:tcMar>
+            <w:vAlign w:val="center"/>
+          </w:tcPr>
+          <w:p>
+            <w:pPr>
+              <w:spacing w:after="0"/>
+            </w:pPr>
+            <w:r>
+              <w:rPr>
+                <w:sz w:val="19"/>
+                <w:szCs w:val="19"/>
+              </w:rPr>
+              <w:t xml:space="preserve">30 kHz fine channels (4096 per 122.88 MHz subband); one spectrum every 33.33 µs</w:t>
+            </w:r>
+          </w:p>
+        </w:tc>
+      </w:tr>
+      <w:tr>
+        <w:tc>
+          <w:tcPr>
+            <w:tcW w:type="dxa" w:w="3400"/>
+            <w:tcBorders>
+              <w:top w:val="single" w:color="A6A6A6" w:sz="4"/>
+              <w:left w:val="single" w:color="A6A6A6" w:sz="4"/>
+              <w:bottom w:val="single" w:color="A6A6A6" w:sz="4"/>
+              <w:right w:val="single" w:color="A6A6A6" w:sz="4"/>
+            </w:tcBorders>
+            <w:tcMar>
+              <w:top w:type="dxa" w:w="60"/>
+              <w:left w:type="dxa" w:w="100"/>
+              <w:bottom w:type="dxa" w:w="60"/>
+              <w:right w:type="dxa" w:w="100"/>
+            </w:tcMar>
+            <w:vAlign w:val="center"/>
+          </w:tcPr>
+          <w:p>
+            <w:pPr>
+              <w:spacing w:after="0"/>
+            </w:pPr>
+            <w:r>
+              <w:rPr>
+                <w:sz w:val="19"/>
+                <w:szCs w:val="19"/>
+              </w:rPr>
+              <w:t xml:space="preserve">Spectrometer integration time</w:t>
+            </w:r>
+          </w:p>
+        </w:tc>
+        <w:tc>
+          <w:tcPr>
+            <w:tcW w:type="dxa" w:w="6238"/>
+            <w:tcBorders>
+              <w:top w:val="single" w:color="A6A6A6" w:sz="4"/>
+              <w:left w:val="single" w:color="A6A6A6" w:sz="4"/>
+              <w:bottom w:val="single" w:color="A6A6A6" w:sz="4"/>
+              <w:right w:val="single" w:color="A6A6A6" w:sz="4"/>
+            </w:tcBorders>
+            <w:tcMar>
+              <w:top w:type="dxa" w:w="60"/>
+              <w:left w:type="dxa" w:w="100"/>
+              <w:bottom w:type="dxa" w:w="60"/>
+              <w:right w:type="dxa" w:w="100"/>
+            </w:tcMar>
+            <w:vAlign w:val="center"/>
+          </w:tcPr>
+          <w:p>
+            <w:pPr>
+              <w:spacing w:after="0"/>
+            </w:pPr>
+            <w:r>
+              <w:rPr>
+                <w:sz w:val="19"/>
+                <w:szCs w:val="19"/>
+              </w:rPr>
+              <w:t xml:space="preserve">N × 33.33 µs, default 6.000 s. Integrations shorter than about 50 ms can be lost: 2 banks, about 3 ms server readout each</w:t>
+            </w:r>
+          </w:p>
+        </w:tc>
+      </w:tr>
+      <w:tr>
+        <w:tc>
+          <w:tcPr>
+            <w:tcW w:type="dxa" w:w="3400"/>
+            <w:tcBorders>
+              <w:top w:val="single" w:color="A6A6A6" w:sz="4"/>
+              <w:left w:val="single" w:color="A6A6A6" w:sz="4"/>
+              <w:bottom w:val="single" w:color="A6A6A6" w:sz="4"/>
+              <w:right w:val="single" w:color="A6A6A6" w:sz="4"/>
+            </w:tcBorders>
+            <w:tcMar>
+              <w:top w:type="dxa" w:w="60"/>
+              <w:left w:type="dxa" w:w="100"/>
+              <w:bottom w:type="dxa" w:w="60"/>
+              <w:right w:type="dxa" w:w="100"/>
+            </w:tcMar>
+            <w:vAlign w:val="center"/>
+          </w:tcPr>
+          <w:p>
+            <w:pPr>
+              <w:spacing w:after="0"/>
+            </w:pPr>
+            <w:r>
+              <w:rPr>
+                <w:sz w:val="19"/>
+                <w:szCs w:val="19"/>
+              </w:rPr>
+              <w:t xml:space="preserve">Spectrum data rate</w:t>
+            </w:r>
+          </w:p>
+        </w:tc>
+        <w:tc>
+          <w:tcPr>
+            <w:tcW w:type="dxa" w:w="6238"/>
+            <w:tcBorders>
+              <w:top w:val="single" w:color="A6A6A6" w:sz="4"/>
+              <w:left w:val="single" w:color="A6A6A6" w:sz="4"/>
+              <w:bottom w:val="single" w:color="A6A6A6" w:sz="4"/>
+              <w:right w:val="single" w:color="A6A6A6" w:sz="4"/>
+            </w:tcBorders>
+            <w:tcMar>
+              <w:top w:type="dxa" w:w="60"/>
+              <w:left w:type="dxa" w:w="100"/>
+              <w:bottom w:type="dxa" w:w="60"/>
+              <w:right w:type="dxa" w:w="100"/>
+            </w:tcMar>
+            <w:vAlign w:val="center"/>
+          </w:tcPr>
+          <w:p>
+            <w:pPr>
+              <w:spacing w:after="0"/>
+            </w:pPr>
+            <w:r>
+              <w:rPr>
+                <w:sz w:val="19"/>
+                <w:szCs w:val="19"/>
+              </w:rPr>
+              <w:t xml:space="preserve">32 KiB per integration (≈ 5.5 KiB/s at 6 s), negligible next to the event stream</w:t>
+            </w:r>
+          </w:p>
+        </w:tc>
+      </w:tr>
     </w:tbl>
     <w:p>
       <w:pPr>
@@ -6149,7 +7948,7 @@
         <w:spacing w:after="60"/>
       </w:pPr>
       <w:r>
-        <w:t xml:space="preserve">Simulate the VHDL: hw/sim/run_sim.sh</w:t>
+        <w:t xml:space="preserve">Simulate the VHDL: hw/sim/run_sim.sh (trigger and capture); hw/sim/run_sim.sh spec (spectrometer with the CSIRO cores, much longer)</w:t>
       </w:r>
     </w:p>
     <w:p>
@@ -6162,7 +7961,7 @@
         <w:spacing w:after="60"/>
       </w:pPr>
       <w:r>
-        <w:t xml:space="preserve">Build the FPGA (about 1 hour): vivado -mode batch -source hw/scripts/build.tcl -tclargs all 3</w:t>
+        <w:t xml:space="preserve">Build the FPGA (about 1 hour; needs the CSIRO cores in refernces/PFB or LUNA_PFB_IP): vivado -mode batch -source hw/scripts/build.tcl -tclargs all 3</w:t>
       </w:r>
     </w:p>
     <w:p>
@@ -6214,7 +8013,7 @@
         <w:spacing w:after="60"/>
       </w:pPr>
       <w:r>
-        <w:t xml:space="preserve">On the client PC: cd sw/client; uv sync; uv run luna-client status</w:t>
+        <w:t xml:space="preserve">On the client PC: cd sw/client; uv sync; uv run luna-client status; uv run luna-spec status</w:t>
       </w:r>
     </w:p>
     <w:p>
@@ -6231,6 +8030,9 @@
       </w:pPr>
       <w:r>
         <w:t xml:space="preserve">Bring-up on the ZCU111 was completed in October 2026. The clocks, RF data converters and multi-tile synchronisation, threshold triggering, DMA readout and network streaming all work, and event data is being collected. The checks below remain the procedure for a new board or SD card.</w:t>
+      </w:r>
+      <w:r>
+        <w:t xml:space="preserve"> The spectrometer has not yet been tested on the board; the last three checks are its bring-up procedure.</w:t>
       </w:r>
     </w:p>
     <w:p>
@@ -6283,6 +8085,45 @@
       </w:pPr>
       <w:r>
         <w:t xml:space="preserve">A short pulse split to all eight inputs appears at the same sample index on every channel and at the trigger offset.</w:t>
+      </w:r>
+    </w:p>
+    <w:p>
+      <w:pPr>
+        <w:pStyle w:val="ListParagraph"/>
+        <w:numPr>
+          <w:ilvl w:val="0"/>
+          <w:numId w:val="2"/>
+        </w:numPr>
+        <w:spacing w:after="60"/>
+      </w:pPr>
+      <w:r>
+        <w:t xml:space="preserve">The server log shows “spec: spectrometer v1.1, 2 banks” and GET SPEC shows present=1, enabled=1, input 0, subband 12 and an integration time of 6 s.</w:t>
+      </w:r>
+    </w:p>
+    <w:p>
+      <w:pPr>
+        <w:pStyle w:val="ListParagraph"/>
+        <w:numPr>
+          <w:ilvl w:val="0"/>
+          <w:numId w:val="2"/>
+        </w:numPr>
+        <w:spacing w:after="60"/>
+      </w:pPr>
+      <w:r>
+        <w:t xml:space="preserve">A CW tone of 1476.06 MHz on ADC 0 (subband 12 centre + 1.5 MHz) appears at 1476.06 MHz in every 6 s integration, and disappears with SET SPEC_SUBBAND 11.</w:t>
+      </w:r>
+    </w:p>
+    <w:p>
+      <w:pPr>
+        <w:pStyle w:val="ListParagraph"/>
+        <w:numPr>
+          <w:ilvl w:val="0"/>
+          <w:numId w:val="2"/>
+        </w:numPr>
+        <w:spacing w:after="60"/>
+      </w:pPr>
+      <w:r>
+        <w:t xml:space="preserve">With the tone moved to ADC 5, SET SPEC_INPUT 5 shows it again and the spectra report ADC 5; SET SPEC_TINT 0.1 gives integrations every 0.1 s with nothing lost.</w:t>
       </w:r>
     </w:p>
     <w:p>
@@ -6440,7 +8281,7 @@
                 <w:sz w:val="19"/>
                 <w:szCs w:val="19"/>
               </w:rPr>
-              <w:t xml:space="preserve">VHDL: gearbox, detector, trigger logic, capture banks, readout, registers, SYSREF capture</w:t>
+              <w:t xml:space="preserve">VHDL: gearbox, detector, trigger logic, capture banks, readout, registers, SYSREF capture, spectrometer (spectrometer_top, spec_regs_axil)</w:t>
             </w:r>
           </w:p>
         </w:tc>
@@ -6502,7 +8343,7 @@
                 <w:sz w:val="19"/>
                 <w:szCs w:val="19"/>
               </w:rPr>
-              <w:t xml:space="preserve">Vivado block design and build scripts</w:t>
+              <w:t xml:space="preserve">Vivado block design and build scripts; spec_ip.tcl creates the CSIRO filter-bank IP</w:t>
             </w:r>
           </w:p>
         </w:tc>
@@ -6564,7 +8405,7 @@
                 <w:sz w:val="19"/>
                 <w:szCs w:val="19"/>
               </w:rPr>
-              <w:t xml:space="preserve">Testbenches, Python golden model, simulation script</w:t>
+              <w:t xml:space="preserve">Testbenches, Python golden models, simulation script (spec: spectrometer with the CSIRO cores)</w:t>
             </w:r>
           </w:p>
         </w:tc>
@@ -6626,7 +8467,7 @@
                 <w:sz w:val="19"/>
                 <w:szCs w:val="19"/>
               </w:rPr>
-              <w:t xml:space="preserve">lunaserver (C): clocks, RFDC/MTS, trigger interrupt, DMA, TCP servers</w:t>
+              <w:t xml:space="preserve">lunaserver (C): clocks, RFDC/MTS, trigger interrupt, DMA, spectrometer readout, TCP servers</w:t>
             </w:r>
           </w:p>
         </w:tc>
@@ -6688,7 +8529,7 @@
                 <w:sz w:val="19"/>
                 <w:szCs w:val="19"/>
               </w:rPr>
-              <w:t xml:space="preserve">Python client library and luna-client command line tool</w:t>
+              <w:t xml:space="preserve">Python client library, luna-client and luna-spec command line tools, lunaGUI (PyQt6)</w:t>
             </w:r>
           </w:p>
         </w:tc>
@@ -6720,6 +8561,68 @@
                 <w:sz w:val="19"/>
                 <w:szCs w:val="19"/>
               </w:rPr>
+              <w:t xml:space="preserve">sw/lunaAnalyser/</w:t>
+            </w:r>
+          </w:p>
+        </w:tc>
+        <w:tc>
+          <w:tcPr>
+            <w:tcW w:type="dxa" w:w="7238"/>
+            <w:tcBorders>
+              <w:top w:val="single" w:color="A6A6A6" w:sz="4"/>
+              <w:left w:val="single" w:color="A6A6A6" w:sz="4"/>
+              <w:bottom w:val="single" w:color="A6A6A6" w:sz="4"/>
+              <w:right w:val="single" w:color="A6A6A6" w:sz="4"/>
+            </w:tcBorders>
+            <w:tcMar>
+              <w:top w:type="dxa" w:w="60"/>
+              <w:left w:type="dxa" w:w="100"/>
+              <w:bottom w:type="dxa" w:w="60"/>
+              <w:right w:type="dxa" w:w="100"/>
+            </w:tcMar>
+            <w:vAlign w:val="center"/>
+          </w:tcPr>
+          <w:p>
+            <w:pPr>
+              <w:spacing w:after="0"/>
+            </w:pPr>
+            <w:r>
+              <w:rPr>
+                <w:sz w:val="19"/>
+                <w:szCs w:val="19"/>
+              </w:rPr>
+              <w:t xml:space="preserve">lunaAnalyser (PyQt6): offline viewer for recorded events</w:t>
+            </w:r>
+          </w:p>
+        </w:tc>
+      </w:tr>
+      <w:tr>
+        <w:tc>
+          <w:tcPr>
+            <w:tcW w:type="dxa" w:w="2400"/>
+            <w:tcBorders>
+              <w:top w:val="single" w:color="A6A6A6" w:sz="4"/>
+              <w:left w:val="single" w:color="A6A6A6" w:sz="4"/>
+              <w:bottom w:val="single" w:color="A6A6A6" w:sz="4"/>
+              <w:right w:val="single" w:color="A6A6A6" w:sz="4"/>
+            </w:tcBorders>
+            <w:tcMar>
+              <w:top w:type="dxa" w:w="60"/>
+              <w:left w:type="dxa" w:w="100"/>
+              <w:bottom w:type="dxa" w:w="60"/>
+              <w:right w:type="dxa" w:w="100"/>
+            </w:tcMar>
+            <w:vAlign w:val="center"/>
+          </w:tcPr>
+          <w:p>
+            <w:pPr>
+              <w:spacing w:after="0"/>
+            </w:pPr>
+            <w:r>
+              <w:rPr>
+                <w:sz w:val="19"/>
+                <w:szCs w:val="19"/>
+              </w:rPr>
               <w:t xml:space="preserve">sw/petalinux/</w:t>
             </w:r>
           </w:p>
@@ -6812,7 +8715,69 @@
                 <w:sz w:val="19"/>
                 <w:szCs w:val="19"/>
               </w:rPr>
-              <w:t xml:space="preserve">System overview diagram, register map, network protocol</w:t>
+              <w:t xml:space="preserve">System overview and block diagrams, Vivado block design picture, register map, network protocol, this document</w:t>
+            </w:r>
+          </w:p>
+        </w:tc>
+      </w:tr>
+      <w:tr>
+        <w:tc>
+          <w:tcPr>
+            <w:tcW w:type="dxa" w:w="2400"/>
+            <w:tcBorders>
+              <w:top w:val="single" w:color="A6A6A6" w:sz="4"/>
+              <w:left w:val="single" w:color="A6A6A6" w:sz="4"/>
+              <w:bottom w:val="single" w:color="A6A6A6" w:sz="4"/>
+              <w:right w:val="single" w:color="A6A6A6" w:sz="4"/>
+            </w:tcBorders>
+            <w:tcMar>
+              <w:top w:type="dxa" w:w="60"/>
+              <w:left w:type="dxa" w:w="100"/>
+              <w:bottom w:type="dxa" w:w="60"/>
+              <w:right w:type="dxa" w:w="100"/>
+            </w:tcMar>
+            <w:vAlign w:val="center"/>
+          </w:tcPr>
+          <w:p>
+            <w:pPr>
+              <w:spacing w:after="0"/>
+            </w:pPr>
+            <w:r>
+              <w:rPr>
+                <w:sz w:val="19"/>
+                <w:szCs w:val="19"/>
+              </w:rPr>
+              <w:t xml:space="preserve">refernces/PFB/</w:t>
+            </w:r>
+          </w:p>
+        </w:tc>
+        <w:tc>
+          <w:tcPr>
+            <w:tcW w:type="dxa" w:w="7238"/>
+            <w:tcBorders>
+              <w:top w:val="single" w:color="A6A6A6" w:sz="4"/>
+              <w:left w:val="single" w:color="A6A6A6" w:sz="4"/>
+              <w:bottom w:val="single" w:color="A6A6A6" w:sz="4"/>
+              <w:right w:val="single" w:color="A6A6A6" w:sz="4"/>
+            </w:tcBorders>
+            <w:tcMar>
+              <w:top w:type="dxa" w:w="60"/>
+              <w:left w:type="dxa" w:w="100"/>
+              <w:bottom w:type="dxa" w:w="60"/>
+              <w:right w:type="dxa" w:w="100"/>
+            </w:tcMar>
+            <w:vAlign w:val="center"/>
+          </w:tcPr>
+          <w:p>
+            <w:pPr>
+              <w:spacing w:after="0"/>
+            </w:pPr>
+            <w:r>
+              <w:rPr>
+                <w:sz w:val="19"/>
+                <w:szCs w:val="19"/>
+              </w:rPr>
+              <w:t xml:space="preserve">Not in git (CSIRO IP, kept locally): System Generator cores pfb32x16t, dfb4096x1c and rnd_23_18, needed by the FPGA build and the spectrometer simulation</w:t>
             </w:r>
           </w:p>
         </w:tc>

</xml_diff>

<commit_message>
docs: veto and hardware status; spectrometer docs from the spectrometer branch
- Bring in the spectrometer doc updates from d62e476 (block diagram,
  system overview, Vivado BD picture, System Description v1.2)
- system_overview.svg/.png: veto in the trigger logic, registers, event
  header v2, control and lunaGUI (rate CSV log); status badge: trigger,
  capture, spectrometer and veto verified on hardware
- block_diagram.svg: veto in trig_logic, VETO register (core v2.1),
  header veto byte; labels shortened or moved so none run past their boxes
- System Description v1.3: veto mode row and description, VETO register,
  header byte 52, SET VETO command, implementation results of the veto
  build, client/GUI/analyser changes, veto bring-up checks, tested on
  hardware
- README, client and analyser READMEs: veto usage, Event.veto, status

Co-Authored-By: Claude Opus 5.5 <noreply@anthropic.com>
</commit_message>
<xml_diff>
--- a/docs/lunaZCU111_System_Description.docx
+++ b/docs/lunaZCU111_System_Description.docx
@@ -27,7 +27,7 @@
           <w:sz w:val="36"/>
           <w:szCs w:val="36"/>
         </w:rPr>
-        <w:t xml:space="preserve">8-Channel 3.93 GS/s Transient Trigger and Capture System</w:t>
+        <w:t xml:space="preserve">8-Channel 3.93 GS/s Transient Trigger and Capture System with Integrating Spectrometer</w:t>
       </w:r>
     </w:p>
     <w:p>
@@ -78,7 +78,7 @@
           <w:sz w:val="22"/>
           <w:szCs w:val="22"/>
         </w:rPr>
-        <w:t xml:space="preserve">Document version 1.1 — 2 October 2026</w:t>
+        <w:t xml:space="preserve">Document version 1.3 — 14 October 2026</w:t>
       </w:r>
     </w:p>
     <w:p>
@@ -93,7 +93,7 @@
           <w:sz w:val="21"/>
           <w:szCs w:val="21"/>
         </w:rPr>
-        <w:t xml:space="preserve">Status: complete and working on hardware. Clocks, RF converters and multi-tile sync, triggering, DMA readout and network streaming are verified on the ZCU111, and event data is being collected.</w:t>
+        <w:t xml:space="preserve">Status: the trigger and capture system is complete and working on hardware: clocks, RF converters and multi-tile sync, triggering, DMA readout and network streaming are verified on the ZCU111, and event data is being collected. The integrating spectrometer and the anti-coincidence veto channel (branch veto, which includes the spectrometer) are implemented, simulated (the spectrometer with the CSIRO filter-bank cores) and built with all timing constraints met, and both have been tested on the board (October 2026).</w:t>
       </w:r>
     </w:p>
     <w:p>
@@ -129,7 +129,17 @@
         <w:t xml:space="preserve">3932.16 MS/s</w:t>
       </w:r>
       <w:r>
-        <w:t xml:space="preserve"> using the RF data converters of the XCZU28DR RFSoC on a ZCU111 board. Every sample of every channel is compared in real time with a programmable per-channel threshold. When the combination of threshold crossings meets the selected trigger condition, a snapshot of all eight channels is captured simultaneously, with the trigger point in the centre of the record. The snapshots are read by software running on the ARM processors of the RFSoC and streamed over Gigabit Ethernet to one or more client computers, which also set the thresholds and trigger conditions over the network.</w:t>
+        <w:t xml:space="preserve"> using the RF data converters of the XCZU28DR RFSoC on a ZCU111 board. Every sample of every channel is compared in real time with a programmable per-channel threshold. When the combination of threshold crossings meets the selected trigger condition, a snapshot of all eight channels is captured simultaneously, with the trigger point in the centre of the record. The snapshots are read by software running on the ARM processors of the RFSoC and streamed over Gigabit Ethernet to one or more client computers, which also set the thresholds and trigger conditions over the network. In addition, any one of the eight channels (selectable) feeds an </w:t>
+      </w:r>
+      <w:r>
+        <w:rPr>
+          <w:b/>
+          <w:bCs/>
+        </w:rPr>
+        <w:t xml:space="preserve">integrating spectrometer</w:t>
+      </w:r>
+      <w:r>
+        <w:t xml:space="preserve">: a polyphase filter bank splits it into 17 subbands of 122.88 MHz, a selected subband is split again into 4096 channels of 30 kHz, and the power in each channel is integrated (6 s by default) and streamed to the clients on a separate TCP port.</w:t>
       </w:r>
     </w:p>
     <w:p>
@@ -137,7 +147,7 @@
         <w:spacing w:after="120" w:line="276"/>
       </w:pPr>
       <w:r>
-        <w:t xml:space="preserve">The design targets the detection of short, rare transients (for example nanosecond radio pulses) where the waveform on all channels around the event is required, and where coincidence or anti-coincidence between channels is used to reject local interference.</w:t>
+        <w:t xml:space="preserve">The design targets the detection of short, rare transients (for example nanosecond radio pulses) where the waveform on all channels around the event is required, and where coincidence or anti-coincidence between channels is used to reject local interference. In anti-coincidence mode one channel can also be set aside as a veto: it blocks triggers but never starts one. The spectrometer runs alongside the trigger and gives a continuous, high-resolution spectrum of one input without interrupting event capture.</w:t>
       </w:r>
     </w:p>
     <w:p>
@@ -543,7 +553,7 @@
                 <w:sz w:val="19"/>
                 <w:szCs w:val="19"/>
               </w:rPr>
-              <w:t xml:space="preserve">Coincidence (N of the enabled channels within a W-sample window, N = 1…8, W = 1…255, default 64); anti-coincidence (exactly one channel within ±W samples); software trigger</w:t>
+              <w:t xml:space="preserve">Coincidence (N of the enabled channels within a W-sample window, N = 1…8, W = 1…255, default 64); anti-coincidence (exactly one channel within ±W samples), optionally with one veto channel that blocks triggers but never starts one; software trigger</w:t>
             </w:r>
           </w:p>
         </w:tc>
@@ -791,7 +801,131 @@
                 <w:sz w:val="19"/>
                 <w:szCs w:val="19"/>
               </w:rPr>
-              <w:t xml:space="preserve">Text commands on TCP port 5001 — thresholds etc. can be changed while events stream on port 5000</w:t>
+              <w:t xml:space="preserve">Text commands on TCP port 5001 — trigger and spectrometer settings can be changed while events stream on port 5000 and spectra on port 5002</w:t>
+            </w:r>
+          </w:p>
+        </w:tc>
+      </w:tr>
+      <w:tr>
+        <w:tc>
+          <w:tcPr>
+            <w:tcW w:type="dxa" w:w="2600"/>
+            <w:tcBorders>
+              <w:top w:val="single" w:color="A6A6A6" w:sz="4"/>
+              <w:left w:val="single" w:color="A6A6A6" w:sz="4"/>
+              <w:bottom w:val="single" w:color="A6A6A6" w:sz="4"/>
+              <w:right w:val="single" w:color="A6A6A6" w:sz="4"/>
+            </w:tcBorders>
+            <w:tcMar>
+              <w:top w:type="dxa" w:w="60"/>
+              <w:left w:type="dxa" w:w="100"/>
+              <w:bottom w:type="dxa" w:w="60"/>
+              <w:right w:type="dxa" w:w="100"/>
+            </w:tcMar>
+            <w:vAlign w:val="center"/>
+          </w:tcPr>
+          <w:p>
+            <w:pPr>
+              <w:spacing w:after="0"/>
+            </w:pPr>
+            <w:r>
+              <w:rPr>
+                <w:sz w:val="19"/>
+                <w:szCs w:val="19"/>
+              </w:rPr>
+              <w:t xml:space="preserve">Spectrometer</w:t>
+            </w:r>
+          </w:p>
+        </w:tc>
+        <w:tc>
+          <w:tcPr>
+            <w:tcW w:type="dxa" w:w="7038"/>
+            <w:tcBorders>
+              <w:top w:val="single" w:color="A6A6A6" w:sz="4"/>
+              <w:left w:val="single" w:color="A6A6A6" w:sz="4"/>
+              <w:bottom w:val="single" w:color="A6A6A6" w:sz="4"/>
+              <w:right w:val="single" w:color="A6A6A6" w:sz="4"/>
+            </w:tcBorders>
+            <w:tcMar>
+              <w:top w:type="dxa" w:w="60"/>
+              <w:left w:type="dxa" w:w="100"/>
+              <w:bottom w:type="dxa" w:w="60"/>
+              <w:right w:type="dxa" w:w="100"/>
+            </w:tcMar>
+            <w:vAlign w:val="center"/>
+          </w:tcPr>
+          <w:p>
+            <w:pPr>
+              <w:spacing w:after="0"/>
+            </w:pPr>
+            <w:r>
+              <w:rPr>
+                <w:sz w:val="19"/>
+                <w:szCs w:val="19"/>
+              </w:rPr>
+              <w:t xml:space="preserve">Any one of the 8 channels (default 0): 17 coarse subbands of 122.88 MHz (polyphase filter bank); the selected subband (default 12, centred on 1474.56 MHz) is split into 4096 fine channels of 30 kHz</w:t>
+            </w:r>
+          </w:p>
+        </w:tc>
+      </w:tr>
+      <w:tr>
+        <w:tc>
+          <w:tcPr>
+            <w:tcW w:type="dxa" w:w="2600"/>
+            <w:tcBorders>
+              <w:top w:val="single" w:color="A6A6A6" w:sz="4"/>
+              <w:left w:val="single" w:color="A6A6A6" w:sz="4"/>
+              <w:bottom w:val="single" w:color="A6A6A6" w:sz="4"/>
+              <w:right w:val="single" w:color="A6A6A6" w:sz="4"/>
+            </w:tcBorders>
+            <w:tcMar>
+              <w:top w:type="dxa" w:w="60"/>
+              <w:left w:type="dxa" w:w="100"/>
+              <w:bottom w:type="dxa" w:w="60"/>
+              <w:right w:type="dxa" w:w="100"/>
+            </w:tcMar>
+            <w:vAlign w:val="center"/>
+          </w:tcPr>
+          <w:p>
+            <w:pPr>
+              <w:spacing w:after="0"/>
+            </w:pPr>
+            <w:r>
+              <w:rPr>
+                <w:sz w:val="19"/>
+                <w:szCs w:val="19"/>
+              </w:rPr>
+              <w:t xml:space="preserve">Spectrometer integration</w:t>
+            </w:r>
+          </w:p>
+        </w:tc>
+        <w:tc>
+          <w:tcPr>
+            <w:tcW w:type="dxa" w:w="7038"/>
+            <w:tcBorders>
+              <w:top w:val="single" w:color="A6A6A6" w:sz="4"/>
+              <w:left w:val="single" w:color="A6A6A6" w:sz="4"/>
+              <w:bottom w:val="single" w:color="A6A6A6" w:sz="4"/>
+              <w:right w:val="single" w:color="A6A6A6" w:sz="4"/>
+            </w:tcBorders>
+            <w:tcMar>
+              <w:top w:type="dxa" w:w="60"/>
+              <w:left w:type="dxa" w:w="100"/>
+              <w:bottom w:type="dxa" w:w="60"/>
+              <w:right w:type="dxa" w:w="100"/>
+            </w:tcMar>
+            <w:vAlign w:val="center"/>
+          </w:tcPr>
+          <w:p>
+            <w:pPr>
+              <w:spacing w:after="0"/>
+            </w:pPr>
+            <w:r>
+              <w:rPr>
+                <w:sz w:val="19"/>
+                <w:szCs w:val="19"/>
+              </w:rPr>
+              <w:t xml:space="preserve">Power accumulated (64 bit) over N spectra of 33.33 µs, default 180000 = 6.000 s; each integration streamed on TCP port 5002</w:t>
             </w:r>
           </w:p>
         </w:tc>
@@ -889,7 +1023,7 @@
         <w:t xml:space="preserve">processing system (PS)</w:t>
       </w:r>
       <w:r>
-        <w:t xml:space="preserve">, which runs Linux and the capture server that handles triggered events, configuration and networking.</w:t>
+        <w:t xml:space="preserve">, which runs Linux and the capture server that handles triggered events, spectra, configuration and networking.</w:t>
       </w:r>
     </w:p>
     <w:p>
@@ -911,7 +1045,7 @@
       <w:r>
         <w:drawing>
           <wp:inline distT="0" distB="0" distL="0" distR="0">
-            <wp:extent cx="9144000" cy="5743575"/>
+            <wp:extent cx="9144000" cy="5687656"/>
             <wp:effectExtent t="0" r="0" b="0" l="0"/>
             <wp:docPr id="1" name="system_overview" descr="lunaZCU111 system block diagram" title="System overview"/>
             <wp:cNvGraphicFramePr>
@@ -936,7 +1070,7 @@
                   <pic:spPr bwMode="auto">
                     <a:xfrm>
                       <a:off x="0" y="0"/>
-                      <a:ext cx="9144000" cy="5743575"/>
+                      <a:ext cx="9144000" cy="5687656"/>
                     </a:xfrm>
                     <a:prstGeom prst="rect">
                       <a:avLst/>
@@ -962,7 +1096,7 @@
           <w:sz w:val="19"/>
           <w:szCs w:val="19"/>
         </w:rPr>
-        <w:t xml:space="preserve">Figure 1 — System overview: RF inputs and clocking, FPGA (PL) signal processing, ARM (PS) software, and the Ethernet client.</w:t>
+        <w:t xml:space="preserve">Figure 1 — System overview: RF inputs and clocking, FPGA (PL) trigger, capture and spectrometer processing, ARM (PS) software, and the Ethernet clients.</w:t>
       </w:r>
     </w:p>
     <w:p>
@@ -2679,7 +2813,7 @@
                 <w:sz w:val="19"/>
                 <w:szCs w:val="19"/>
               </w:rPr>
-              <w:t xml:space="preserve">MMCM → 491.52 / 245.76 MHz fabric clocks</w:t>
+              <w:t xml:space="preserve">MMCM → 491.52 / 245.76 / 122.88 MHz fabric clocks</w:t>
             </w:r>
           </w:p>
         </w:tc>
@@ -3077,7 +3211,7 @@
         <w:spacing w:after="120" w:line="276"/>
       </w:pPr>
       <w:r>
-        <w:t xml:space="preserve">The PL design is a Vivado block design (Xilinx IP) with the trigger and capture logic written in VHDL. All trigger and capture logic runs at 245.76 MHz and processes 16 samples per channel per clock cycle.</w:t>
+        <w:t xml:space="preserve">The PL design is a Vivado block design (Xilinx IP) with the trigger, capture and spectrometer control logic written in VHDL; the spectrometer filter banks are CSIRO System Generator cores. All trigger and capture logic runs at 245.76 MHz and processes 16 samples per channel per clock cycle. The spectrometer runs at 122.88 MHz (clk_spec, a third output of the same MMCM, phase aligned with the 245.76 MHz clock) and processes 32 samples per clock cycle.</w:t>
       </w:r>
     </w:p>
     <w:p>
@@ -3109,7 +3243,7 @@
         <w:spacing w:after="120" w:line="276"/>
       </w:pPr>
       <w:r>
-        <w:t xml:space="preserve">A small synchronous gearbox per channel combines two consecutive 8-sample words into one 16-sample word at 245.76 MHz. Only this one register stage runs at 491.52 MHz, which keeps timing closure straightforward. Each 16-sample word is tagged with a common cycle counter; the absolute sample index is cycle × 16 + lane.</w:t>
+        <w:t xml:space="preserve">A small synchronous gearbox per channel combines two consecutive 8-sample words into one 16-sample word at 245.76 MHz. Only this one register stage runs at 491.52 MHz, which keeps timing closure straightforward. Each 16-sample word is tagged with a common cycle counter; the absolute sample index is cycle × 16 + lane. A second register stage at 245.76 MHz (one extra cycle of latency, the same on every channel) separates the half-period 491.52 → 245.76 MHz transfer from the wide fan-out to the detectors, the capture memory and the spectrometer, which receives the gearbox output of all eight channels together with the sample counter (section 3.8).</w:t>
       </w:r>
     </w:p>
     <w:p>
@@ -3141,7 +3275,7 @@
         <w:spacing w:after="120" w:line="276"/>
       </w:pPr>
       <w:r>
-        <w:t xml:space="preserve">The trigger logic evaluates all 16 sample positions of each clock cycle and reports at most one trigger per cycle (the earliest qualifying sample) together with its 64-bit sample index and the mask of participating channels. A channel mask selects which channels take part.</w:t>
+        <w:t xml:space="preserve">The trigger logic evaluates all 16 sample positions of each clock cycle and reports at most one trigger per cycle (the earliest qualifying sample) together with its 64-bit sample index and the mask of participating channels. A channel mask selects which channels take part; in anti-coincidence mode the VETO register can also name one veto channel.</w:t>
       </w:r>
     </w:p>
     <w:tbl>
@@ -3385,6 +3519,68 @@
                 <w:sz w:val="19"/>
                 <w:szCs w:val="19"/>
               </w:rPr>
+              <w:t xml:space="preserve">Veto (anti-coincidence only)</w:t>
+            </w:r>
+          </w:p>
+        </w:tc>
+        <w:tc>
+          <w:tcPr>
+            <w:tcW w:type="dxa" w:w="7438"/>
+            <w:tcBorders>
+              <w:top w:val="single" w:color="A6A6A6" w:sz="4"/>
+              <w:left w:val="single" w:color="A6A6A6" w:sz="4"/>
+              <w:bottom w:val="single" w:color="A6A6A6" w:sz="4"/>
+              <w:right w:val="single" w:color="A6A6A6" w:sz="4"/>
+            </w:tcBorders>
+            <w:tcMar>
+              <w:top w:type="dxa" w:w="60"/>
+              <w:left w:type="dxa" w:w="100"/>
+              <w:bottom w:type="dxa" w:w="60"/>
+              <w:right w:type="dxa" w:w="100"/>
+            </w:tcMar>
+            <w:vAlign w:val="center"/>
+          </w:tcPr>
+          <w:p>
+            <w:pPr>
+              <w:spacing w:after="0"/>
+            </w:pPr>
+            <w:r>
+              <w:rPr>
+                <w:sz w:val="19"/>
+                <w:szCs w:val="19"/>
+              </w:rPr>
+              <w:t xml:space="preserve">With the veto enabled on channel v, v never starts a trigger, but a hit on v in [p − W + 1, p + W − 1] blocks the trigger on channel r, whether or not v is set in the channel mask. The veto has no effect in coincidence mode.</w:t>
+            </w:r>
+          </w:p>
+        </w:tc>
+      </w:tr>
+      <w:tr>
+        <w:tc>
+          <w:tcPr>
+            <w:tcW w:type="dxa" w:w="2200"/>
+            <w:tcBorders>
+              <w:top w:val="single" w:color="A6A6A6" w:sz="4"/>
+              <w:left w:val="single" w:color="A6A6A6" w:sz="4"/>
+              <w:bottom w:val="single" w:color="A6A6A6" w:sz="4"/>
+              <w:right w:val="single" w:color="A6A6A6" w:sz="4"/>
+            </w:tcBorders>
+            <w:tcMar>
+              <w:top w:type="dxa" w:w="60"/>
+              <w:left w:type="dxa" w:w="100"/>
+              <w:bottom w:type="dxa" w:w="60"/>
+              <w:right w:type="dxa" w:w="100"/>
+            </w:tcMar>
+            <w:vAlign w:val="center"/>
+          </w:tcPr>
+          <w:p>
+            <w:pPr>
+              <w:spacing w:after="0"/>
+            </w:pPr>
+            <w:r>
+              <w:rPr>
+                <w:sz w:val="19"/>
+                <w:szCs w:val="19"/>
+              </w:rPr>
               <w:t xml:space="preserve">Software</w:t>
             </w:r>
           </w:p>
@@ -3425,6 +3621,14 @@
       <w:pPr>
         <w:spacing w:after="120"/>
       </w:pPr>
+    </w:p>
+    <w:p>
+      <w:pPr>
+        <w:spacing w:after="120" w:line="276"/>
+      </w:pPr>
+      <w:r>
+        <w:t xml:space="preserve">The veto is implemented by giving each channel two roles, both registered from the configuration: a channel may start a trigger if it is set in the mask and is not the veto channel, and its hits block other channels if it is set in the mask or is the veto channel. Plain anti-coincidence is the special case with the veto disabled. The veto adds no latency and about 120 LUTs. The VETO register (bit 8 enable, bits 2 … 0 channel) is present from trigger-core VERSION 2.1, and its value at the time of the trigger is recorded in the event header.</w:t>
+      </w:r>
     </w:p>
     <w:p>
       <w:pPr>
@@ -3494,7 +3698,7 @@
         <w:spacing w:after="120" w:line="276"/>
       </w:pPr>
       <w:r>
-        <w:t xml:space="preserve">On request from the software, the oldest full bank is streamed through a 128-bit AXI-Stream interface into an AXI DMA, which writes it to a reserved 16 MiB region of PS DDR memory. The stream consists of a 64-byte event header followed by the samples of channel 0 to 7 (L int16 values each). A 16384-sample event (256 KiB) takes about 70 µs to transfer.</w:t>
+        <w:t xml:space="preserve">On request from the software, the oldest full bank is streamed through a 128-bit AXI-Stream interface into an AXI DMA, which writes it to a reserved 16 MiB region of PS DDR memory. The stream consists of a 64-byte event header (version 2: byte 52 holds the VETO register at the time of the trigger) followed by the samples of channel 0 to 7 (L int16 values each). A 16384-sample event (256 KiB) takes about 70 µs to transfer.</w:t>
       </w:r>
     </w:p>
     <w:p>
@@ -3510,7 +3714,7 @@
         <w:spacing w:after="120" w:line="276"/>
       </w:pPr>
       <w:r>
-        <w:t xml:space="preserve">An AXI-Lite register block holds the thresholds, trigger mode, N, window, channel mask, capture length, arm/interrupt enables, status and counters (see docs/register_map.md). A level interrupt to the PS is asserted while at least one captured event is waiting.</w:t>
+        <w:t xml:space="preserve">An AXI-Lite register block holds the thresholds, trigger mode, N, window, channel mask, veto channel (VETO, trigger-core VERSION 2.1 or later), capture length, arm/interrupt enables, status and counters (see docs/register_map.md). A level interrupt to the PS is asserted while at least one captured event is waiting. The spectrometer has its own register block and interrupt (section 3.8).</w:t>
       </w:r>
     </w:p>
     <w:p>
@@ -3518,7 +3722,570 @@
         <w:pStyle w:val="Heading2"/>
       </w:pPr>
       <w:r>
-        <w:t xml:space="preserve">3.8  Implementation results</w:t>
+        <w:t xml:space="preserve">3.8  Integrating spectrometer</w:t>
+      </w:r>
+    </w:p>
+    <w:p>
+      <w:pPr>
+        <w:spacing w:after="120" w:line="276"/>
+      </w:pPr>
+      <w:r>
+        <w:t xml:space="preserve">Any one of the eight channels can be fed to an integrating spectrometer that runs alongside the trigger (hw/hdl/spectrometer_top.vhd). Its two filter banks are cores developed at CSIRO with System Generator (pfb32x16t, dfb4096x1c and the rounding block rnd_23_18). They are not part of the repository: the build creates them as IP-catalog instances from a local folder (refernces/PFB).</w:t>
+      </w:r>
+    </w:p>
+    <w:tbl>
+      <w:tblPr>
+        <w:tblW w:type="dxa" w:w="9638"/>
+        <w:tblBorders>
+          <w:top w:val="single" w:color="auto" w:sz="4"/>
+          <w:left w:val="single" w:color="auto" w:sz="4"/>
+          <w:bottom w:val="single" w:color="auto" w:sz="4"/>
+          <w:right w:val="single" w:color="auto" w:sz="4"/>
+          <w:insideH w:val="single" w:color="auto" w:sz="4"/>
+          <w:insideV w:val="single" w:color="auto" w:sz="4"/>
+        </w:tblBorders>
+        <w:tblLayout w:type="fixed"/>
+      </w:tblPr>
+      <w:tblGrid>
+        <w:gridCol w:w="2900"/>
+        <w:gridCol w:w="6738"/>
+      </w:tblGrid>
+      <w:tr>
+        <w:trPr>
+          <w:tblHeader/>
+        </w:trPr>
+        <w:tc>
+          <w:tcPr>
+            <w:tcW w:type="dxa" w:w="2900"/>
+            <w:tcBorders>
+              <w:top w:val="single" w:color="A6A6A6" w:sz="4"/>
+              <w:left w:val="single" w:color="A6A6A6" w:sz="4"/>
+              <w:bottom w:val="single" w:color="A6A6A6" w:sz="4"/>
+              <w:right w:val="single" w:color="A6A6A6" w:sz="4"/>
+            </w:tcBorders>
+            <w:shd w:fill="1F4E79" w:color="auto" w:val="clear"/>
+            <w:tcMar>
+              <w:top w:type="dxa" w:w="60"/>
+              <w:left w:type="dxa" w:w="100"/>
+              <w:bottom w:type="dxa" w:w="60"/>
+              <w:right w:type="dxa" w:w="100"/>
+            </w:tcMar>
+            <w:vAlign w:val="center"/>
+          </w:tcPr>
+          <w:p>
+            <w:pPr>
+              <w:spacing w:after="0"/>
+            </w:pPr>
+            <w:r>
+              <w:rPr>
+                <w:b/>
+                <w:bCs/>
+                <w:color w:val="FFFFFF"/>
+                <w:sz w:val="19"/>
+                <w:szCs w:val="19"/>
+              </w:rPr>
+              <w:t xml:space="preserve">Stage</w:t>
+            </w:r>
+          </w:p>
+        </w:tc>
+        <w:tc>
+          <w:tcPr>
+            <w:tcW w:type="dxa" w:w="6738"/>
+            <w:tcBorders>
+              <w:top w:val="single" w:color="A6A6A6" w:sz="4"/>
+              <w:left w:val="single" w:color="A6A6A6" w:sz="4"/>
+              <w:bottom w:val="single" w:color="A6A6A6" w:sz="4"/>
+              <w:right w:val="single" w:color="A6A6A6" w:sz="4"/>
+            </w:tcBorders>
+            <w:shd w:fill="1F4E79" w:color="auto" w:val="clear"/>
+            <w:tcMar>
+              <w:top w:type="dxa" w:w="60"/>
+              <w:left w:type="dxa" w:w="100"/>
+              <w:bottom w:type="dxa" w:w="60"/>
+              <w:right w:type="dxa" w:w="100"/>
+            </w:tcMar>
+            <w:vAlign w:val="center"/>
+          </w:tcPr>
+          <w:p>
+            <w:pPr>
+              <w:spacing w:after="0"/>
+            </w:pPr>
+            <w:r>
+              <w:rPr>
+                <w:b/>
+                <w:bCs/>
+                <w:color w:val="FFFFFF"/>
+                <w:sz w:val="19"/>
+                <w:szCs w:val="19"/>
+              </w:rPr>
+              <w:t xml:space="preserve">Function</w:t>
+            </w:r>
+          </w:p>
+        </w:tc>
+      </w:tr>
+      <w:tr>
+        <w:tc>
+          <w:tcPr>
+            <w:tcW w:type="dxa" w:w="2900"/>
+            <w:tcBorders>
+              <w:top w:val="single" w:color="A6A6A6" w:sz="4"/>
+              <w:left w:val="single" w:color="A6A6A6" w:sz="4"/>
+              <w:bottom w:val="single" w:color="A6A6A6" w:sz="4"/>
+              <w:right w:val="single" w:color="A6A6A6" w:sz="4"/>
+            </w:tcBorders>
+            <w:tcMar>
+              <w:top w:type="dxa" w:w="60"/>
+              <w:left w:type="dxa" w:w="100"/>
+              <w:bottom w:type="dxa" w:w="60"/>
+              <w:right w:type="dxa" w:w="100"/>
+            </w:tcMar>
+            <w:vAlign w:val="center"/>
+          </w:tcPr>
+          <w:p>
+            <w:pPr>
+              <w:spacing w:after="0"/>
+            </w:pPr>
+            <w:r>
+              <w:rPr>
+                <w:sz w:val="19"/>
+                <w:szCs w:val="19"/>
+              </w:rPr>
+              <w:t xml:space="preserve">Input select</w:t>
+            </w:r>
+          </w:p>
+        </w:tc>
+        <w:tc>
+          <w:tcPr>
+            <w:tcW w:type="dxa" w:w="6738"/>
+            <w:tcBorders>
+              <w:top w:val="single" w:color="A6A6A6" w:sz="4"/>
+              <w:left w:val="single" w:color="A6A6A6" w:sz="4"/>
+              <w:bottom w:val="single" w:color="A6A6A6" w:sz="4"/>
+              <w:right w:val="single" w:color="A6A6A6" w:sz="4"/>
+            </w:tcBorders>
+            <w:tcMar>
+              <w:top w:type="dxa" w:w="60"/>
+              <w:left w:type="dxa" w:w="100"/>
+              <w:bottom w:type="dxa" w:w="60"/>
+              <w:right w:type="dxa" w:w="100"/>
+            </w:tcMar>
+            <w:vAlign w:val="center"/>
+          </w:tcPr>
+          <w:p>
+            <w:pPr>
+              <w:spacing w:after="0"/>
+            </w:pPr>
+            <w:r>
+              <w:rPr>
+                <w:sz w:val="19"/>
+                <w:szCs w:val="19"/>
+              </w:rPr>
+              <w:t xml:space="preserve">INPUT register (0 … 7, default 0) chooses one ADC channel from the trigger core’s gearbox output; pipelined 8:1 multiplexer at 245.76 MHz</w:t>
+            </w:r>
+          </w:p>
+        </w:tc>
+      </w:tr>
+      <w:tr>
+        <w:tc>
+          <w:tcPr>
+            <w:tcW w:type="dxa" w:w="2900"/>
+            <w:tcBorders>
+              <w:top w:val="single" w:color="A6A6A6" w:sz="4"/>
+              <w:left w:val="single" w:color="A6A6A6" w:sz="4"/>
+              <w:bottom w:val="single" w:color="A6A6A6" w:sz="4"/>
+              <w:right w:val="single" w:color="A6A6A6" w:sz="4"/>
+            </w:tcBorders>
+            <w:tcMar>
+              <w:top w:type="dxa" w:w="60"/>
+              <w:left w:type="dxa" w:w="100"/>
+              <w:bottom w:type="dxa" w:w="60"/>
+              <w:right w:type="dxa" w:w="100"/>
+            </w:tcMar>
+            <w:vAlign w:val="center"/>
+          </w:tcPr>
+          <w:p>
+            <w:pPr>
+              <w:spacing w:after="0"/>
+            </w:pPr>
+            <w:r>
+              <w:rPr>
+                <w:sz w:val="19"/>
+                <w:szCs w:val="19"/>
+              </w:rPr>
+              <w:t xml:space="preserve">Gearbox</w:t>
+            </w:r>
+          </w:p>
+        </w:tc>
+        <w:tc>
+          <w:tcPr>
+            <w:tcW w:type="dxa" w:w="6738"/>
+            <w:tcBorders>
+              <w:top w:val="single" w:color="A6A6A6" w:sz="4"/>
+              <w:left w:val="single" w:color="A6A6A6" w:sz="4"/>
+              <w:bottom w:val="single" w:color="A6A6A6" w:sz="4"/>
+              <w:right w:val="single" w:color="A6A6A6" w:sz="4"/>
+            </w:tcBorders>
+            <w:tcMar>
+              <w:top w:type="dxa" w:w="60"/>
+              <w:left w:type="dxa" w:w="100"/>
+              <w:bottom w:type="dxa" w:w="60"/>
+              <w:right w:type="dxa" w:w="100"/>
+            </w:tcMar>
+            <w:vAlign w:val="center"/>
+          </w:tcPr>
+          <w:p>
+            <w:pPr>
+              <w:spacing w:after="0"/>
+            </w:pPr>
+            <w:r>
+              <w:rPr>
+                <w:sz w:val="19"/>
+                <w:szCs w:val="19"/>
+              </w:rPr>
+              <w:t xml:space="preserve">2:1, 16 samples at 245.76 MHz → 32 samples at 122.88 MHz (clk_spec)</w:t>
+            </w:r>
+          </w:p>
+        </w:tc>
+      </w:tr>
+      <w:tr>
+        <w:tc>
+          <w:tcPr>
+            <w:tcW w:type="dxa" w:w="2900"/>
+            <w:tcBorders>
+              <w:top w:val="single" w:color="A6A6A6" w:sz="4"/>
+              <w:left w:val="single" w:color="A6A6A6" w:sz="4"/>
+              <w:bottom w:val="single" w:color="A6A6A6" w:sz="4"/>
+              <w:right w:val="single" w:color="A6A6A6" w:sz="4"/>
+            </w:tcBorders>
+            <w:tcMar>
+              <w:top w:type="dxa" w:w="60"/>
+              <w:left w:type="dxa" w:w="100"/>
+              <w:bottom w:type="dxa" w:w="60"/>
+              <w:right w:type="dxa" w:w="100"/>
+            </w:tcMar>
+            <w:vAlign w:val="center"/>
+          </w:tcPr>
+          <w:p>
+            <w:pPr>
+              <w:spacing w:after="0"/>
+            </w:pPr>
+            <w:r>
+              <w:rPr>
+                <w:sz w:val="19"/>
+                <w:szCs w:val="19"/>
+              </w:rPr>
+              <w:t xml:space="preserve">Coarse filter bank (pfb32x16t)</w:t>
+            </w:r>
+          </w:p>
+        </w:tc>
+        <w:tc>
+          <w:tcPr>
+            <w:tcW w:type="dxa" w:w="6738"/>
+            <w:tcBorders>
+              <w:top w:val="single" w:color="A6A6A6" w:sz="4"/>
+              <w:left w:val="single" w:color="A6A6A6" w:sz="4"/>
+              <w:bottom w:val="single" w:color="A6A6A6" w:sz="4"/>
+              <w:right w:val="single" w:color="A6A6A6" w:sz="4"/>
+            </w:tcBorders>
+            <w:tcMar>
+              <w:top w:type="dxa" w:w="60"/>
+              <w:left w:type="dxa" w:w="100"/>
+              <w:bottom w:type="dxa" w:w="60"/>
+              <w:right w:type="dxa" w:w="100"/>
+            </w:tcMar>
+            <w:vAlign w:val="center"/>
+          </w:tcPr>
+          <w:p>
+            <w:pPr>
+              <w:spacing w:after="0"/>
+            </w:pPr>
+            <w:r>
+              <w:rPr>
+                <w:sz w:val="19"/>
+                <w:szCs w:val="19"/>
+              </w:rPr>
+              <w:t xml:space="preserve">16-channel polyphase filter bank: 32 real samples per clock → 17 complex subbands of 122.88 MHz, sampled at 122.88 MS/s; subband k is centred on k × 122.88 MHz (subbands 0 and 16 are real)</w:t>
+            </w:r>
+          </w:p>
+        </w:tc>
+      </w:tr>
+      <w:tr>
+        <w:tc>
+          <w:tcPr>
+            <w:tcW w:type="dxa" w:w="2900"/>
+            <w:tcBorders>
+              <w:top w:val="single" w:color="A6A6A6" w:sz="4"/>
+              <w:left w:val="single" w:color="A6A6A6" w:sz="4"/>
+              <w:bottom w:val="single" w:color="A6A6A6" w:sz="4"/>
+              <w:right w:val="single" w:color="A6A6A6" w:sz="4"/>
+            </w:tcBorders>
+            <w:tcMar>
+              <w:top w:type="dxa" w:w="60"/>
+              <w:left w:type="dxa" w:w="100"/>
+              <w:bottom w:type="dxa" w:w="60"/>
+              <w:right w:type="dxa" w:w="100"/>
+            </w:tcMar>
+            <w:vAlign w:val="center"/>
+          </w:tcPr>
+          <w:p>
+            <w:pPr>
+              <w:spacing w:after="0"/>
+            </w:pPr>
+            <w:r>
+              <w:rPr>
+                <w:sz w:val="19"/>
+                <w:szCs w:val="19"/>
+              </w:rPr>
+              <w:t xml:space="preserve">Subband select</w:t>
+            </w:r>
+          </w:p>
+        </w:tc>
+        <w:tc>
+          <w:tcPr>
+            <w:tcW w:type="dxa" w:w="6738"/>
+            <w:tcBorders>
+              <w:top w:val="single" w:color="A6A6A6" w:sz="4"/>
+              <w:left w:val="single" w:color="A6A6A6" w:sz="4"/>
+              <w:bottom w:val="single" w:color="A6A6A6" w:sz="4"/>
+              <w:right w:val="single" w:color="A6A6A6" w:sz="4"/>
+            </w:tcBorders>
+            <w:tcMar>
+              <w:top w:type="dxa" w:w="60"/>
+              <w:left w:type="dxa" w:w="100"/>
+              <w:bottom w:type="dxa" w:w="60"/>
+              <w:right w:type="dxa" w:w="100"/>
+            </w:tcMar>
+            <w:vAlign w:val="center"/>
+          </w:tcPr>
+          <w:p>
+            <w:pPr>
+              <w:spacing w:after="0"/>
+            </w:pPr>
+            <w:r>
+              <w:rPr>
+                <w:sz w:val="19"/>
+                <w:szCs w:val="19"/>
+              </w:rPr>
+              <w:t xml:space="preserve">SUBBAND register (0 … 16, default 12 = 1474.56 MHz) selects one subband; rnd_23_18 rounds it from 23 to 18 bits</w:t>
+            </w:r>
+          </w:p>
+        </w:tc>
+      </w:tr>
+      <w:tr>
+        <w:tc>
+          <w:tcPr>
+            <w:tcW w:type="dxa" w:w="2900"/>
+            <w:tcBorders>
+              <w:top w:val="single" w:color="A6A6A6" w:sz="4"/>
+              <w:left w:val="single" w:color="A6A6A6" w:sz="4"/>
+              <w:bottom w:val="single" w:color="A6A6A6" w:sz="4"/>
+              <w:right w:val="single" w:color="A6A6A6" w:sz="4"/>
+            </w:tcBorders>
+            <w:tcMar>
+              <w:top w:type="dxa" w:w="60"/>
+              <w:left w:type="dxa" w:w="100"/>
+              <w:bottom w:type="dxa" w:w="60"/>
+              <w:right w:type="dxa" w:w="100"/>
+            </w:tcMar>
+            <w:vAlign w:val="center"/>
+          </w:tcPr>
+          <w:p>
+            <w:pPr>
+              <w:spacing w:after="0"/>
+            </w:pPr>
+            <w:r>
+              <w:rPr>
+                <w:sz w:val="19"/>
+                <w:szCs w:val="19"/>
+              </w:rPr>
+              <w:t xml:space="preserve">Fine filter bank (dfb4096x1c)</w:t>
+            </w:r>
+          </w:p>
+        </w:tc>
+        <w:tc>
+          <w:tcPr>
+            <w:tcW w:type="dxa" w:w="6738"/>
+            <w:tcBorders>
+              <w:top w:val="single" w:color="A6A6A6" w:sz="4"/>
+              <w:left w:val="single" w:color="A6A6A6" w:sz="4"/>
+              <w:bottom w:val="single" w:color="A6A6A6" w:sz="4"/>
+              <w:right w:val="single" w:color="A6A6A6" w:sz="4"/>
+            </w:tcBorders>
+            <w:tcMar>
+              <w:top w:type="dxa" w:w="60"/>
+              <w:left w:type="dxa" w:w="100"/>
+              <w:bottom w:type="dxa" w:w="60"/>
+              <w:right w:type="dxa" w:w="100"/>
+            </w:tcMar>
+            <w:vAlign w:val="center"/>
+          </w:tcPr>
+          <w:p>
+            <w:pPr>
+              <w:spacing w:after="0"/>
+            </w:pPr>
+            <w:r>
+              <w:rPr>
+                <w:sz w:val="19"/>
+                <w:szCs w:val="19"/>
+              </w:rPr>
+              <w:t xml:space="preserve">4096 channels of 30 kHz, one spectrum every 33.33 µs; power accumulated in 64 bits over ACC_LEN + 1 spectra (default 180000 = 6.000 s)</w:t>
+            </w:r>
+          </w:p>
+        </w:tc>
+      </w:tr>
+      <w:tr>
+        <w:tc>
+          <w:tcPr>
+            <w:tcW w:type="dxa" w:w="2900"/>
+            <w:tcBorders>
+              <w:top w:val="single" w:color="A6A6A6" w:sz="4"/>
+              <w:left w:val="single" w:color="A6A6A6" w:sz="4"/>
+              <w:bottom w:val="single" w:color="A6A6A6" w:sz="4"/>
+              <w:right w:val="single" w:color="A6A6A6" w:sz="4"/>
+            </w:tcBorders>
+            <w:tcMar>
+              <w:top w:type="dxa" w:w="60"/>
+              <w:left w:type="dxa" w:w="100"/>
+              <w:bottom w:type="dxa" w:w="60"/>
+              <w:right w:type="dxa" w:w="100"/>
+            </w:tcMar>
+            <w:vAlign w:val="center"/>
+          </w:tcPr>
+          <w:p>
+            <w:pPr>
+              <w:spacing w:after="0"/>
+            </w:pPr>
+            <w:r>
+              <w:rPr>
+                <w:sz w:val="19"/>
+                <w:szCs w:val="19"/>
+              </w:rPr>
+              <w:t xml:space="preserve">Spectrum memory</w:t>
+            </w:r>
+          </w:p>
+        </w:tc>
+        <w:tc>
+          <w:tcPr>
+            <w:tcW w:type="dxa" w:w="6738"/>
+            <w:tcBorders>
+              <w:top w:val="single" w:color="A6A6A6" w:sz="4"/>
+              <w:left w:val="single" w:color="A6A6A6" w:sz="4"/>
+              <w:bottom w:val="single" w:color="A6A6A6" w:sz="4"/>
+              <w:right w:val="single" w:color="A6A6A6" w:sz="4"/>
+            </w:tcBorders>
+            <w:tcMar>
+              <w:top w:type="dxa" w:w="60"/>
+              <w:left w:type="dxa" w:w="100"/>
+              <w:bottom w:type="dxa" w:w="60"/>
+              <w:right w:type="dxa" w:w="100"/>
+            </w:tcMar>
+            <w:vAlign w:val="center"/>
+          </w:tcPr>
+          <w:p>
+            <w:pPr>
+              <w:spacing w:after="0"/>
+            </w:pPr>
+            <w:r>
+              <w:rPr>
+                <w:sz w:val="19"/>
+                <w:szCs w:val="19"/>
+              </w:rPr>
+              <w:t xml:space="preserve">2 banks × 4096 × 64 bit in UltraRAM; level interrupt (pl_ps_irq0[3], SPI 92) while a full bank is waiting; integrations arriving while both banks are full are counted as lost</w:t>
+            </w:r>
+          </w:p>
+        </w:tc>
+      </w:tr>
+      <w:tr>
+        <w:tc>
+          <w:tcPr>
+            <w:tcW w:type="dxa" w:w="2900"/>
+            <w:tcBorders>
+              <w:top w:val="single" w:color="A6A6A6" w:sz="4"/>
+              <w:left w:val="single" w:color="A6A6A6" w:sz="4"/>
+              <w:bottom w:val="single" w:color="A6A6A6" w:sz="4"/>
+              <w:right w:val="single" w:color="A6A6A6" w:sz="4"/>
+            </w:tcBorders>
+            <w:tcMar>
+              <w:top w:type="dxa" w:w="60"/>
+              <w:left w:type="dxa" w:w="100"/>
+              <w:bottom w:type="dxa" w:w="60"/>
+              <w:right w:type="dxa" w:w="100"/>
+            </w:tcMar>
+            <w:vAlign w:val="center"/>
+          </w:tcPr>
+          <w:p>
+            <w:pPr>
+              <w:spacing w:after="0"/>
+            </w:pPr>
+            <w:r>
+              <w:rPr>
+                <w:sz w:val="19"/>
+                <w:szCs w:val="19"/>
+              </w:rPr>
+              <w:t xml:space="preserve">Registers</w:t>
+            </w:r>
+          </w:p>
+        </w:tc>
+        <w:tc>
+          <w:tcPr>
+            <w:tcW w:type="dxa" w:w="6738"/>
+            <w:tcBorders>
+              <w:top w:val="single" w:color="A6A6A6" w:sz="4"/>
+              <w:left w:val="single" w:color="A6A6A6" w:sz="4"/>
+              <w:bottom w:val="single" w:color="A6A6A6" w:sz="4"/>
+              <w:right w:val="single" w:color="A6A6A6" w:sz="4"/>
+            </w:tcBorders>
+            <w:tcMar>
+              <w:top w:type="dxa" w:w="60"/>
+              <w:left w:type="dxa" w:w="100"/>
+              <w:bottom w:type="dxa" w:w="60"/>
+              <w:right w:type="dxa" w:w="100"/>
+            </w:tcMar>
+            <w:vAlign w:val="center"/>
+          </w:tcPr>
+          <w:p>
+            <w:pPr>
+              <w:spacing w:after="0"/>
+            </w:pPr>
+            <w:r>
+              <w:rPr>
+                <w:sz w:val="19"/>
+                <w:szCs w:val="19"/>
+              </w:rPr>
+              <w:t xml:space="preserve">AXI-Lite at 0xA014_0000 (128 KiB, clk_spec): enable, input, subband, integration length, status, counters and the header of the oldest bank; the banks are read at +0x10000</w:t>
+            </w:r>
+          </w:p>
+        </w:tc>
+      </w:tr>
+    </w:tbl>
+    <w:p>
+      <w:pPr>
+        <w:spacing w:after="120"/>
+      </w:pPr>
+    </w:p>
+    <w:p>
+      <w:pPr>
+        <w:spacing w:after="120" w:line="276"/>
+      </w:pPr>
+      <w:r>
+        <w:t xml:space="preserve">Enabling the spectrometer, a restart command, or a change of input, subband or integration length restarts the integration immediately. The fine filter bank needs about five spectra to re-synchronise its accumulator, so the wrapper ignores every output that begins within six spectra of a restart and stores an integration only when all 4096 channels have arrived. The first integration after a change therefore contains only new data; it is flagged as “first after restart” for information. Each stored integration carries its sequence number, input, subband, integration length and the ADC sample counter at its end, on the same time base as the trigger timestamps.</w:t>
+      </w:r>
+    </w:p>
+    <w:p>
+      <w:pPr>
+        <w:spacing w:after="120" w:line="276"/>
+      </w:pPr>
+      <w:r>
+        <w:t xml:space="preserve">The fine channels are in FFT order: channel k lies at subband × 122.88 MHz + k × 30 kHz for k &lt; 2048, and at subband × 122.88 MHz + (k − 4096) × 30 kHz for k ≥ 2048.</w:t>
+      </w:r>
+    </w:p>
+    <w:p>
+      <w:pPr>
+        <w:pStyle w:val="Heading2"/>
+        <w:keepNext/>
+      </w:pPr>
+      <w:r>
+        <w:t xml:space="preserve">3.9  Implementation results</w:t>
       </w:r>
     </w:p>
     <w:tbl>
@@ -3668,7 +4435,7 @@
                 <w:sz w:val="19"/>
                 <w:szCs w:val="19"/>
               </w:rPr>
-              <w:t xml:space="preserve">All constraints met: WNS +0.109 ns, WHS +0.010 ns</w:t>
+              <w:t xml:space="preserve">All constraints met (veto branch, trigger core v2.1 with spectrometer): WNS +0.149 ns (491.52 MHz gearbox domain), WHS +0.010 ns; spectrometer clock domain +2.75 ns</w:t>
             </w:r>
           </w:p>
         </w:tc>
@@ -3730,7 +4497,7 @@
                 <w:sz w:val="19"/>
                 <w:szCs w:val="19"/>
               </w:rPr>
-              <w:t xml:space="preserve">Setup slack +0.46 ns, hold slack +1.47 ns (±0.6 ns input budget)</w:t>
+              <w:t xml:space="preserve">Setup slack +0.34 ns, hold slack +1.55 ns (±0.6 ns input budget)</w:t>
             </w:r>
           </w:p>
         </w:tc>
@@ -3792,7 +4559,7 @@
                 <w:sz w:val="19"/>
                 <w:szCs w:val="19"/>
               </w:rPr>
-              <w:t xml:space="preserve">5.8 % LUTs, 3.3 % registers, 32 / 80 UltraRAM, 4 block RAM, 0 DSP</w:t>
+              <w:t xml:space="preserve">9.4 % LUTs, 9.5 % registers, 34 / 80 UltraRAM, 44.5 block RAM, 696 DSP (16 %; the coarse filter bank alone uses 646). The veto adds about 120 LUTs</w:t>
             </w:r>
           </w:p>
         </w:tc>
@@ -3854,7 +4621,131 @@
                 <w:sz w:val="19"/>
                 <w:szCs w:val="19"/>
               </w:rPr>
-              <w:t xml:space="preserve">Trigger logic matches a brute-force Python model on 22 configurations; full-system capture test verifies centring, sample continuity, cross-channel alignment, bank rotation and lost-trigger counting. On hardware: clock programming, MTS, triggering, DMA readout and network streaming confirmed on the ZCU111 (October 2026)</w:t>
+              <w:t xml:space="preserve">Trigger logic matches a brute-force Python model on 31 configurations, 9 of them with a veto channel; full-system capture test verifies centring, sample continuity, cross-channel alignment, bank rotation, lost-trigger counting and the veto (the veto channel alone does not trigger, it blocks a nearby hit on another channel, and the event header records it). On hardware: clock programming, MTS, triggering, DMA readout and network streaming confirmed on the ZCU111, and since October 2026 the spectrometer and the veto as well.</w:t>
+            </w:r>
+          </w:p>
+        </w:tc>
+      </w:tr>
+      <w:tr>
+        <w:tc>
+          <w:tcPr>
+            <w:tcW w:type="dxa" w:w="2600"/>
+            <w:tcBorders>
+              <w:top w:val="single" w:color="A6A6A6" w:sz="4"/>
+              <w:left w:val="single" w:color="A6A6A6" w:sz="4"/>
+              <w:bottom w:val="single" w:color="A6A6A6" w:sz="4"/>
+              <w:right w:val="single" w:color="A6A6A6" w:sz="4"/>
+            </w:tcBorders>
+            <w:tcMar>
+              <w:top w:type="dxa" w:w="60"/>
+              <w:left w:type="dxa" w:w="100"/>
+              <w:bottom w:type="dxa" w:w="60"/>
+              <w:right w:type="dxa" w:w="100"/>
+            </w:tcMar>
+            <w:vAlign w:val="center"/>
+          </w:tcPr>
+          <w:p>
+            <w:pPr>
+              <w:spacing w:after="0"/>
+            </w:pPr>
+            <w:r>
+              <w:rPr>
+                <w:sz w:val="19"/>
+                <w:szCs w:val="19"/>
+              </w:rPr>
+              <w:t xml:space="preserve">Spectrometer verification</w:t>
+            </w:r>
+          </w:p>
+        </w:tc>
+        <w:tc>
+          <w:tcPr>
+            <w:tcW w:type="dxa" w:w="7038"/>
+            <w:tcBorders>
+              <w:top w:val="single" w:color="A6A6A6" w:sz="4"/>
+              <w:left w:val="single" w:color="A6A6A6" w:sz="4"/>
+              <w:bottom w:val="single" w:color="A6A6A6" w:sz="4"/>
+              <w:right w:val="single" w:color="A6A6A6" w:sz="4"/>
+            </w:tcBorders>
+            <w:tcMar>
+              <w:top w:type="dxa" w:w="60"/>
+              <w:left w:type="dxa" w:w="100"/>
+              <w:bottom w:type="dxa" w:w="60"/>
+              <w:right w:type="dxa" w:w="100"/>
+            </w:tcMar>
+            <w:vAlign w:val="center"/>
+          </w:tcPr>
+          <w:p>
+            <w:pPr>
+              <w:spacing w:after="0"/>
+            </w:pPr>
+            <w:r>
+              <w:rPr>
+                <w:sz w:val="19"/>
+                <w:szCs w:val="19"/>
+              </w:rPr>
+              <w:t xml:space="preserve">xsim with the real CSIRO cores: with INPUT = 5, tones on ADC 5 at +25 and −100 fine channels of subband 12 appear in fine channels 25 and 3996 with the expected 16:1 power ratio and about 50 dB to the neighbouring channels; a decoy tone on another ADC does not appear; shortening the integration part way through gives a clean integration. Not yet tested on the board.</w:t>
+            </w:r>
+          </w:p>
+        </w:tc>
+      </w:tr>
+      <w:tr>
+        <w:tc>
+          <w:tcPr>
+            <w:tcW w:type="dxa" w:w="2600"/>
+            <w:tcBorders>
+              <w:top w:val="single" w:color="A6A6A6" w:sz="4"/>
+              <w:left w:val="single" w:color="A6A6A6" w:sz="4"/>
+              <w:bottom w:val="single" w:color="A6A6A6" w:sz="4"/>
+              <w:right w:val="single" w:color="A6A6A6" w:sz="4"/>
+            </w:tcBorders>
+            <w:tcMar>
+              <w:top w:type="dxa" w:w="60"/>
+              <w:left w:type="dxa" w:w="100"/>
+              <w:bottom w:type="dxa" w:w="60"/>
+              <w:right w:type="dxa" w:w="100"/>
+            </w:tcMar>
+            <w:vAlign w:val="center"/>
+          </w:tcPr>
+          <w:p>
+            <w:pPr>
+              <w:spacing w:after="0"/>
+            </w:pPr>
+            <w:r>
+              <w:rPr>
+                <w:sz w:val="19"/>
+                <w:szCs w:val="19"/>
+              </w:rPr>
+              <w:t xml:space="preserve">Trigger-only build (v1.1, on hardware)</w:t>
+            </w:r>
+          </w:p>
+        </w:tc>
+        <w:tc>
+          <w:tcPr>
+            <w:tcW w:type="dxa" w:w="7038"/>
+            <w:tcBorders>
+              <w:top w:val="single" w:color="A6A6A6" w:sz="4"/>
+              <w:left w:val="single" w:color="A6A6A6" w:sz="4"/>
+              <w:bottom w:val="single" w:color="A6A6A6" w:sz="4"/>
+              <w:right w:val="single" w:color="A6A6A6" w:sz="4"/>
+            </w:tcBorders>
+            <w:tcMar>
+              <w:top w:type="dxa" w:w="60"/>
+              <w:left w:type="dxa" w:w="100"/>
+              <w:bottom w:type="dxa" w:w="60"/>
+              <w:right w:type="dxa" w:w="100"/>
+            </w:tcMar>
+            <w:vAlign w:val="center"/>
+          </w:tcPr>
+          <w:p>
+            <w:pPr>
+              <w:spacing w:after="0"/>
+            </w:pPr>
+            <w:r>
+              <w:rPr>
+                <w:sz w:val="19"/>
+                <w:szCs w:val="19"/>
+              </w:rPr>
+              <w:t xml:space="preserve">WNS +0.109 ns, WHS +0.010 ns; 5.8 % LUTs, 32 / 80 UltraRAM, 4 block RAM, 0 DSP</w:t>
             </w:r>
           </w:p>
         </w:tc>
@@ -3954,7 +4845,7 @@
         <w:spacing w:after="60"/>
       </w:pPr>
       <w:r>
-        <w:t xml:space="preserve">Initialise the trigger core, apply the saved configuration and arm the trigger.</w:t>
+        <w:t xml:space="preserve">Initialise the trigger core and, if the bitstream contains it (trigger-core VERSION 2 or later), the spectrometer, and from VERSION 2.1 the VETO register; apply the saved configuration and arm the trigger.</w:t>
       </w:r>
     </w:p>
     <w:p>
@@ -3967,7 +4858,7 @@
         <w:spacing w:after="60"/>
       </w:pPr>
       <w:r>
-        <w:t xml:space="preserve">Open TCP port 5000 (event data) and TCP port 5001 (control) and enter the event loop.</w:t>
+        <w:t xml:space="preserve">Open TCP ports 5000 (event data), 5001 (control) and 5002 (spectra) and enter the event loop.</w:t>
       </w:r>
     </w:p>
     <w:p>
@@ -3983,7 +4874,15 @@
         <w:spacing w:after="120" w:line="276"/>
       </w:pPr>
       <w:r>
-        <w:t xml:space="preserve">Settings changed over the network take effect immediately; the SAVE command writes them to lunaserver.conf on the SD card, from where they are reloaded at the next boot.</w:t>
+        <w:t xml:space="preserve">The spectrometer interrupt is handled in the same loop: the server reads the header registers and the 4096 × 64-bit powers of the oldest full bank over AXI-Lite (about 3 ms), releases the bank and queues the integration for every spectrum client on port 5002, again with a non-blocking queue per client.</w:t>
+      </w:r>
+    </w:p>
+    <w:p>
+      <w:pPr>
+        <w:spacing w:after="120" w:line="276"/>
+      </w:pPr>
+      <w:r>
+        <w:t xml:space="preserve">Settings changed over the network take effect immediately; the SAVE command writes them, including the veto and spectrometer settings, to lunaserver.conf on the SD card, from where they are reloaded at the next boot.</w:t>
       </w:r>
     </w:p>
     <w:p>
@@ -4303,6 +5202,98 @@
           </w:p>
         </w:tc>
       </w:tr>
+      <w:tr>
+        <w:tc>
+          <w:tcPr>
+            <w:tcW w:type="dxa" w:w="1200"/>
+            <w:tcBorders>
+              <w:top w:val="single" w:color="A6A6A6" w:sz="4"/>
+              <w:left w:val="single" w:color="A6A6A6" w:sz="4"/>
+              <w:bottom w:val="single" w:color="A6A6A6" w:sz="4"/>
+              <w:right w:val="single" w:color="A6A6A6" w:sz="4"/>
+            </w:tcBorders>
+            <w:tcMar>
+              <w:top w:type="dxa" w:w="60"/>
+              <w:left w:type="dxa" w:w="100"/>
+              <w:bottom w:type="dxa" w:w="60"/>
+              <w:right w:type="dxa" w:w="100"/>
+            </w:tcMar>
+            <w:vAlign w:val="center"/>
+          </w:tcPr>
+          <w:p>
+            <w:pPr>
+              <w:spacing w:after="0"/>
+            </w:pPr>
+            <w:r>
+              <w:rPr>
+                <w:sz w:val="19"/>
+                <w:szCs w:val="19"/>
+              </w:rPr>
+              <w:t xml:space="preserve">5002</w:t>
+            </w:r>
+          </w:p>
+        </w:tc>
+        <w:tc>
+          <w:tcPr>
+            <w:tcW w:type="dxa" w:w="2000"/>
+            <w:tcBorders>
+              <w:top w:val="single" w:color="A6A6A6" w:sz="4"/>
+              <w:left w:val="single" w:color="A6A6A6" w:sz="4"/>
+              <w:bottom w:val="single" w:color="A6A6A6" w:sz="4"/>
+              <w:right w:val="single" w:color="A6A6A6" w:sz="4"/>
+            </w:tcBorders>
+            <w:tcMar>
+              <w:top w:type="dxa" w:w="60"/>
+              <w:left w:type="dxa" w:w="100"/>
+              <w:bottom w:type="dxa" w:w="60"/>
+              <w:right w:type="dxa" w:w="100"/>
+            </w:tcMar>
+            <w:vAlign w:val="center"/>
+          </w:tcPr>
+          <w:p>
+            <w:pPr>
+              <w:spacing w:after="0"/>
+            </w:pPr>
+            <w:r>
+              <w:rPr>
+                <w:sz w:val="19"/>
+                <w:szCs w:val="19"/>
+              </w:rPr>
+              <w:t xml:space="preserve">server → client</w:t>
+            </w:r>
+          </w:p>
+        </w:tc>
+        <w:tc>
+          <w:tcPr>
+            <w:tcW w:type="dxa" w:w="6438"/>
+            <w:tcBorders>
+              <w:top w:val="single" w:color="A6A6A6" w:sz="4"/>
+              <w:left w:val="single" w:color="A6A6A6" w:sz="4"/>
+              <w:bottom w:val="single" w:color="A6A6A6" w:sz="4"/>
+              <w:right w:val="single" w:color="A6A6A6" w:sz="4"/>
+            </w:tcBorders>
+            <w:tcMar>
+              <w:top w:type="dxa" w:w="60"/>
+              <w:left w:type="dxa" w:w="100"/>
+              <w:bottom w:type="dxa" w:w="60"/>
+              <w:right w:type="dxa" w:w="100"/>
+            </w:tcMar>
+            <w:vAlign w:val="center"/>
+          </w:tcPr>
+          <w:p>
+            <w:pPr>
+              <w:spacing w:after="0"/>
+            </w:pPr>
+            <w:r>
+              <w:rPr>
+                <w:sz w:val="19"/>
+                <w:szCs w:val="19"/>
+              </w:rPr>
+              <w:t xml:space="preserve">One binary frame per spectrometer integration, pushed to every connected client</w:t>
+            </w:r>
+          </w:p>
+        </w:tc>
+      </w:tr>
     </w:tbl>
     <w:p>
       <w:pPr>
@@ -4621,7 +5612,7 @@
                 <w:sz w:val="19"/>
                 <w:szCs w:val="19"/>
               </w:rPr>
-              <w:t xml:space="preserve">Magic "LUNA", sequence number, samples per channel L, trigger sample index, start sample index, trigger offset, trigger mask and source, window, N, mode, lost and trigger counters</w:t>
+              <w:t xml:space="preserve">Magic "LUNA", sequence number, samples per channel L, trigger sample index, start sample index, trigger offset, trigger mask and source, window, N, mode, lost and trigger counters; from header version 2, the veto setting (byte 52: bit 7 enable, bits 2 … 0 channel)</w:t>
             </w:r>
           </w:p>
         </w:tc>
@@ -4729,7 +5720,330 @@
         <w:pStyle w:val="Heading2"/>
       </w:pPr>
       <w:r>
-        <w:t xml:space="preserve">5.2  Control commands</w:t>
+        <w:t xml:space="preserve">5.2  Spectrum frame</w:t>
+      </w:r>
+    </w:p>
+    <w:tbl>
+      <w:tblPr>
+        <w:tblW w:type="dxa" w:w="9638"/>
+        <w:tblBorders>
+          <w:top w:val="single" w:color="auto" w:sz="4"/>
+          <w:left w:val="single" w:color="auto" w:sz="4"/>
+          <w:bottom w:val="single" w:color="auto" w:sz="4"/>
+          <w:right w:val="single" w:color="auto" w:sz="4"/>
+          <w:insideH w:val="single" w:color="auto" w:sz="4"/>
+          <w:insideV w:val="single" w:color="auto" w:sz="4"/>
+        </w:tblBorders>
+        <w:tblLayout w:type="fixed"/>
+      </w:tblPr>
+      <w:tblGrid>
+        <w:gridCol w:w="1800"/>
+        <w:gridCol w:w="1800"/>
+        <w:gridCol w:w="6038"/>
+      </w:tblGrid>
+      <w:tr>
+        <w:trPr>
+          <w:tblHeader/>
+        </w:trPr>
+        <w:tc>
+          <w:tcPr>
+            <w:tcW w:type="dxa" w:w="1800"/>
+            <w:tcBorders>
+              <w:top w:val="single" w:color="A6A6A6" w:sz="4"/>
+              <w:left w:val="single" w:color="A6A6A6" w:sz="4"/>
+              <w:bottom w:val="single" w:color="A6A6A6" w:sz="4"/>
+              <w:right w:val="single" w:color="A6A6A6" w:sz="4"/>
+            </w:tcBorders>
+            <w:shd w:fill="1F4E79" w:color="auto" w:val="clear"/>
+            <w:tcMar>
+              <w:top w:type="dxa" w:w="60"/>
+              <w:left w:type="dxa" w:w="100"/>
+              <w:bottom w:type="dxa" w:w="60"/>
+              <w:right w:type="dxa" w:w="100"/>
+            </w:tcMar>
+            <w:vAlign w:val="center"/>
+          </w:tcPr>
+          <w:p>
+            <w:pPr>
+              <w:spacing w:after="0"/>
+            </w:pPr>
+            <w:r>
+              <w:rPr>
+                <w:b/>
+                <w:bCs/>
+                <w:color w:val="FFFFFF"/>
+                <w:sz w:val="19"/>
+                <w:szCs w:val="19"/>
+              </w:rPr>
+              <w:t xml:space="preserve">Part</w:t>
+            </w:r>
+          </w:p>
+        </w:tc>
+        <w:tc>
+          <w:tcPr>
+            <w:tcW w:type="dxa" w:w="1800"/>
+            <w:tcBorders>
+              <w:top w:val="single" w:color="A6A6A6" w:sz="4"/>
+              <w:left w:val="single" w:color="A6A6A6" w:sz="4"/>
+              <w:bottom w:val="single" w:color="A6A6A6" w:sz="4"/>
+              <w:right w:val="single" w:color="A6A6A6" w:sz="4"/>
+            </w:tcBorders>
+            <w:shd w:fill="1F4E79" w:color="auto" w:val="clear"/>
+            <w:tcMar>
+              <w:top w:type="dxa" w:w="60"/>
+              <w:left w:type="dxa" w:w="100"/>
+              <w:bottom w:type="dxa" w:w="60"/>
+              <w:right w:type="dxa" w:w="100"/>
+            </w:tcMar>
+            <w:vAlign w:val="center"/>
+          </w:tcPr>
+          <w:p>
+            <w:pPr>
+              <w:spacing w:after="0"/>
+            </w:pPr>
+            <w:r>
+              <w:rPr>
+                <w:b/>
+                <w:bCs/>
+                <w:color w:val="FFFFFF"/>
+                <w:sz w:val="19"/>
+                <w:szCs w:val="19"/>
+              </w:rPr>
+              <w:t xml:space="preserve">Size</w:t>
+            </w:r>
+          </w:p>
+        </w:tc>
+        <w:tc>
+          <w:tcPr>
+            <w:tcW w:type="dxa" w:w="6038"/>
+            <w:tcBorders>
+              <w:top w:val="single" w:color="A6A6A6" w:sz="4"/>
+              <w:left w:val="single" w:color="A6A6A6" w:sz="4"/>
+              <w:bottom w:val="single" w:color="A6A6A6" w:sz="4"/>
+              <w:right w:val="single" w:color="A6A6A6" w:sz="4"/>
+            </w:tcBorders>
+            <w:shd w:fill="1F4E79" w:color="auto" w:val="clear"/>
+            <w:tcMar>
+              <w:top w:type="dxa" w:w="60"/>
+              <w:left w:type="dxa" w:w="100"/>
+              <w:bottom w:type="dxa" w:w="60"/>
+              <w:right w:type="dxa" w:w="100"/>
+            </w:tcMar>
+            <w:vAlign w:val="center"/>
+          </w:tcPr>
+          <w:p>
+            <w:pPr>
+              <w:spacing w:after="0"/>
+            </w:pPr>
+            <w:r>
+              <w:rPr>
+                <w:b/>
+                <w:bCs/>
+                <w:color w:val="FFFFFF"/>
+                <w:sz w:val="19"/>
+                <w:szCs w:val="19"/>
+              </w:rPr>
+              <w:t xml:space="preserve">Content</w:t>
+            </w:r>
+          </w:p>
+        </w:tc>
+      </w:tr>
+      <w:tr>
+        <w:tc>
+          <w:tcPr>
+            <w:tcW w:type="dxa" w:w="1800"/>
+            <w:tcBorders>
+              <w:top w:val="single" w:color="A6A6A6" w:sz="4"/>
+              <w:left w:val="single" w:color="A6A6A6" w:sz="4"/>
+              <w:bottom w:val="single" w:color="A6A6A6" w:sz="4"/>
+              <w:right w:val="single" w:color="A6A6A6" w:sz="4"/>
+            </w:tcBorders>
+            <w:tcMar>
+              <w:top w:type="dxa" w:w="60"/>
+              <w:left w:type="dxa" w:w="100"/>
+              <w:bottom w:type="dxa" w:w="60"/>
+              <w:right w:type="dxa" w:w="100"/>
+            </w:tcMar>
+            <w:vAlign w:val="center"/>
+          </w:tcPr>
+          <w:p>
+            <w:pPr>
+              <w:spacing w:after="0"/>
+            </w:pPr>
+            <w:r>
+              <w:rPr>
+                <w:sz w:val="19"/>
+                <w:szCs w:val="19"/>
+              </w:rPr>
+              <w:t xml:space="preserve">Header</w:t>
+            </w:r>
+          </w:p>
+        </w:tc>
+        <w:tc>
+          <w:tcPr>
+            <w:tcW w:type="dxa" w:w="1800"/>
+            <w:tcBorders>
+              <w:top w:val="single" w:color="A6A6A6" w:sz="4"/>
+              <w:left w:val="single" w:color="A6A6A6" w:sz="4"/>
+              <w:bottom w:val="single" w:color="A6A6A6" w:sz="4"/>
+              <w:right w:val="single" w:color="A6A6A6" w:sz="4"/>
+            </w:tcBorders>
+            <w:tcMar>
+              <w:top w:type="dxa" w:w="60"/>
+              <w:left w:type="dxa" w:w="100"/>
+              <w:bottom w:type="dxa" w:w="60"/>
+              <w:right w:type="dxa" w:w="100"/>
+            </w:tcMar>
+            <w:vAlign w:val="center"/>
+          </w:tcPr>
+          <w:p>
+            <w:pPr>
+              <w:spacing w:after="0"/>
+            </w:pPr>
+            <w:r>
+              <w:rPr>
+                <w:sz w:val="19"/>
+                <w:szCs w:val="19"/>
+              </w:rPr>
+              <w:t xml:space="preserve">64 bytes</w:t>
+            </w:r>
+          </w:p>
+        </w:tc>
+        <w:tc>
+          <w:tcPr>
+            <w:tcW w:type="dxa" w:w="6038"/>
+            <w:tcBorders>
+              <w:top w:val="single" w:color="A6A6A6" w:sz="4"/>
+              <w:left w:val="single" w:color="A6A6A6" w:sz="4"/>
+              <w:bottom w:val="single" w:color="A6A6A6" w:sz="4"/>
+              <w:right w:val="single" w:color="A6A6A6" w:sz="4"/>
+            </w:tcBorders>
+            <w:tcMar>
+              <w:top w:type="dxa" w:w="60"/>
+              <w:left w:type="dxa" w:w="100"/>
+              <w:bottom w:type="dxa" w:w="60"/>
+              <w:right w:type="dxa" w:w="100"/>
+            </w:tcMar>
+            <w:vAlign w:val="center"/>
+          </w:tcPr>
+          <w:p>
+            <w:pPr>
+              <w:spacing w:after="0"/>
+            </w:pPr>
+            <w:r>
+              <w:rPr>
+                <w:sz w:val="19"/>
+                <w:szCs w:val="19"/>
+              </w:rPr>
+              <w:t xml:space="preserve">Magic “LSPC”, version, frame size, flags (simulated data, first integration after a restart), host time of readout, ADC sample counter at the end of the integration, sample rate, sequence number, number of spectra, frames dropped for this client, integrations lost in the FPGA, number of channels, subband, ADC input, restart count</w:t>
+            </w:r>
+          </w:p>
+        </w:tc>
+      </w:tr>
+      <w:tr>
+        <w:tc>
+          <w:tcPr>
+            <w:tcW w:type="dxa" w:w="1800"/>
+            <w:tcBorders>
+              <w:top w:val="single" w:color="A6A6A6" w:sz="4"/>
+              <w:left w:val="single" w:color="A6A6A6" w:sz="4"/>
+              <w:bottom w:val="single" w:color="A6A6A6" w:sz="4"/>
+              <w:right w:val="single" w:color="A6A6A6" w:sz="4"/>
+            </w:tcBorders>
+            <w:tcMar>
+              <w:top w:type="dxa" w:w="60"/>
+              <w:left w:type="dxa" w:w="100"/>
+              <w:bottom w:type="dxa" w:w="60"/>
+              <w:right w:type="dxa" w:w="100"/>
+            </w:tcMar>
+            <w:vAlign w:val="center"/>
+          </w:tcPr>
+          <w:p>
+            <w:pPr>
+              <w:spacing w:after="0"/>
+            </w:pPr>
+            <w:r>
+              <w:rPr>
+                <w:sz w:val="19"/>
+                <w:szCs w:val="19"/>
+              </w:rPr>
+              <w:t xml:space="preserve">Power</w:t>
+            </w:r>
+          </w:p>
+        </w:tc>
+        <w:tc>
+          <w:tcPr>
+            <w:tcW w:type="dxa" w:w="1800"/>
+            <w:tcBorders>
+              <w:top w:val="single" w:color="A6A6A6" w:sz="4"/>
+              <w:left w:val="single" w:color="A6A6A6" w:sz="4"/>
+              <w:bottom w:val="single" w:color="A6A6A6" w:sz="4"/>
+              <w:right w:val="single" w:color="A6A6A6" w:sz="4"/>
+            </w:tcBorders>
+            <w:tcMar>
+              <w:top w:type="dxa" w:w="60"/>
+              <w:left w:type="dxa" w:w="100"/>
+              <w:bottom w:type="dxa" w:w="60"/>
+              <w:right w:type="dxa" w:w="100"/>
+            </w:tcMar>
+            <w:vAlign w:val="center"/>
+          </w:tcPr>
+          <w:p>
+            <w:pPr>
+              <w:spacing w:after="0"/>
+            </w:pPr>
+            <w:r>
+              <w:rPr>
+                <w:sz w:val="19"/>
+                <w:szCs w:val="19"/>
+              </w:rPr>
+              <w:t xml:space="preserve">4096 × 8 bytes</w:t>
+            </w:r>
+          </w:p>
+        </w:tc>
+        <w:tc>
+          <w:tcPr>
+            <w:tcW w:type="dxa" w:w="6038"/>
+            <w:tcBorders>
+              <w:top w:val="single" w:color="A6A6A6" w:sz="4"/>
+              <w:left w:val="single" w:color="A6A6A6" w:sz="4"/>
+              <w:bottom w:val="single" w:color="A6A6A6" w:sz="4"/>
+              <w:right w:val="single" w:color="A6A6A6" w:sz="4"/>
+            </w:tcBorders>
+            <w:tcMar>
+              <w:top w:type="dxa" w:w="60"/>
+              <w:left w:type="dxa" w:w="100"/>
+              <w:bottom w:type="dxa" w:w="60"/>
+              <w:right w:type="dxa" w:w="100"/>
+            </w:tcMar>
+            <w:vAlign w:val="center"/>
+          </w:tcPr>
+          <w:p>
+            <w:pPr>
+              <w:spacing w:after="0"/>
+            </w:pPr>
+            <w:r>
+              <w:rPr>
+                <w:sz w:val="19"/>
+                <w:szCs w:val="19"/>
+              </w:rPr>
+              <w:t xml:space="preserve">uint64 little endian, accumulated power per fine channel in FFT order; power / number of spectra is the mean power per spectrum</w:t>
+            </w:r>
+          </w:p>
+        </w:tc>
+      </w:tr>
+    </w:tbl>
+    <w:p>
+      <w:pPr>
+        <w:spacing w:after="120"/>
+      </w:pPr>
+    </w:p>
+    <w:p>
+      <w:pPr>
+        <w:pStyle w:val="Heading2"/>
+      </w:pPr>
+      <w:r>
+        <w:t xml:space="preserve">5.3  Control commands</w:t>
       </w:r>
     </w:p>
     <w:tbl>
@@ -5159,6 +6473,68 @@
                 <w:sz w:val="19"/>
                 <w:szCs w:val="19"/>
               </w:rPr>
+              <w:t xml:space="preserve">SET VETO &lt;0-7|OFF&gt;</w:t>
+            </w:r>
+          </w:p>
+        </w:tc>
+        <w:tc>
+          <w:tcPr>
+            <w:tcW w:type="dxa" w:w="6038"/>
+            <w:tcBorders>
+              <w:top w:val="single" w:color="A6A6A6" w:sz="4"/>
+              <w:left w:val="single" w:color="A6A6A6" w:sz="4"/>
+              <w:bottom w:val="single" w:color="A6A6A6" w:sz="4"/>
+              <w:right w:val="single" w:color="A6A6A6" w:sz="4"/>
+            </w:tcBorders>
+            <w:tcMar>
+              <w:top w:type="dxa" w:w="60"/>
+              <w:left w:type="dxa" w:w="100"/>
+              <w:bottom w:type="dxa" w:w="60"/>
+              <w:right w:type="dxa" w:w="100"/>
+            </w:tcMar>
+            <w:vAlign w:val="center"/>
+          </w:tcPr>
+          <w:p>
+            <w:pPr>
+              <w:spacing w:after="0"/>
+            </w:pPr>
+            <w:r>
+              <w:rPr>
+                <w:sz w:val="19"/>
+                <w:szCs w:val="19"/>
+              </w:rPr>
+              <w:t xml:space="preserve">Anti-coincidence veto channel (default OFF): it never starts a trigger, but its hit within ±W blocks one, whatever its mask bit. GET CONFIG and STATUS report veto=OFF, the channel, or absent (bitstream before trigger core v2.1; the command is then refused)</w:t>
+            </w:r>
+          </w:p>
+        </w:tc>
+      </w:tr>
+      <w:tr>
+        <w:tc>
+          <w:tcPr>
+            <w:tcW w:type="dxa" w:w="3600"/>
+            <w:tcBorders>
+              <w:top w:val="single" w:color="A6A6A6" w:sz="4"/>
+              <w:left w:val="single" w:color="A6A6A6" w:sz="4"/>
+              <w:bottom w:val="single" w:color="A6A6A6" w:sz="4"/>
+              <w:right w:val="single" w:color="A6A6A6" w:sz="4"/>
+            </w:tcBorders>
+            <w:tcMar>
+              <w:top w:type="dxa" w:w="60"/>
+              <w:left w:type="dxa" w:w="100"/>
+              <w:bottom w:type="dxa" w:w="60"/>
+              <w:right w:type="dxa" w:w="100"/>
+            </w:tcMar>
+            <w:vAlign w:val="center"/>
+          </w:tcPr>
+          <w:p>
+            <w:pPr>
+              <w:spacing w:after="0"/>
+            </w:pPr>
+            <w:r>
+              <w:rPr>
+                <w:sz w:val="19"/>
+                <w:szCs w:val="19"/>
+              </w:rPr>
               <w:t xml:space="preserve">SET LEN &lt;4096-16384&gt;</w:t>
             </w:r>
           </w:p>
@@ -5407,6 +6783,316 @@
                 <w:sz w:val="19"/>
                 <w:szCs w:val="19"/>
               </w:rPr>
+              <w:t xml:space="preserve">GET SPEC</w:t>
+            </w:r>
+          </w:p>
+        </w:tc>
+        <w:tc>
+          <w:tcPr>
+            <w:tcW w:type="dxa" w:w="6038"/>
+            <w:tcBorders>
+              <w:top w:val="single" w:color="A6A6A6" w:sz="4"/>
+              <w:left w:val="single" w:color="A6A6A6" w:sz="4"/>
+              <w:bottom w:val="single" w:color="A6A6A6" w:sz="4"/>
+              <w:right w:val="single" w:color="A6A6A6" w:sz="4"/>
+            </w:tcBorders>
+            <w:tcMar>
+              <w:top w:type="dxa" w:w="60"/>
+              <w:left w:type="dxa" w:w="100"/>
+              <w:bottom w:type="dxa" w:w="60"/>
+              <w:right w:type="dxa" w:w="100"/>
+            </w:tcMar>
+            <w:vAlign w:val="center"/>
+          </w:tcPr>
+          <w:p>
+            <w:pPr>
+              <w:spacing w:after="0"/>
+            </w:pPr>
+            <w:r>
+              <w:rPr>
+                <w:sz w:val="19"/>
+                <w:szCs w:val="19"/>
+              </w:rPr>
+              <w:t xml:space="preserve">Spectrometer settings and counters: input, subband, integration time, centre frequency, integrations, lost, restarts, clients</w:t>
+            </w:r>
+          </w:p>
+        </w:tc>
+      </w:tr>
+      <w:tr>
+        <w:tc>
+          <w:tcPr>
+            <w:tcW w:type="dxa" w:w="3600"/>
+            <w:tcBorders>
+              <w:top w:val="single" w:color="A6A6A6" w:sz="4"/>
+              <w:left w:val="single" w:color="A6A6A6" w:sz="4"/>
+              <w:bottom w:val="single" w:color="A6A6A6" w:sz="4"/>
+              <w:right w:val="single" w:color="A6A6A6" w:sz="4"/>
+            </w:tcBorders>
+            <w:tcMar>
+              <w:top w:type="dxa" w:w="60"/>
+              <w:left w:type="dxa" w:w="100"/>
+              <w:bottom w:type="dxa" w:w="60"/>
+              <w:right w:type="dxa" w:w="100"/>
+            </w:tcMar>
+            <w:vAlign w:val="center"/>
+          </w:tcPr>
+          <w:p>
+            <w:pPr>
+              <w:spacing w:after="0"/>
+            </w:pPr>
+            <w:r>
+              <w:rPr>
+                <w:sz w:val="19"/>
+                <w:szCs w:val="19"/>
+              </w:rPr>
+              <w:t xml:space="preserve">SPEC ON | OFF | RESTART</w:t>
+            </w:r>
+          </w:p>
+        </w:tc>
+        <w:tc>
+          <w:tcPr>
+            <w:tcW w:type="dxa" w:w="6038"/>
+            <w:tcBorders>
+              <w:top w:val="single" w:color="A6A6A6" w:sz="4"/>
+              <w:left w:val="single" w:color="A6A6A6" w:sz="4"/>
+              <w:bottom w:val="single" w:color="A6A6A6" w:sz="4"/>
+              <w:right w:val="single" w:color="A6A6A6" w:sz="4"/>
+            </w:tcBorders>
+            <w:tcMar>
+              <w:top w:type="dxa" w:w="60"/>
+              <w:left w:type="dxa" w:w="100"/>
+              <w:bottom w:type="dxa" w:w="60"/>
+              <w:right w:type="dxa" w:w="100"/>
+            </w:tcMar>
+            <w:vAlign w:val="center"/>
+          </w:tcPr>
+          <w:p>
+            <w:pPr>
+              <w:spacing w:after="0"/>
+            </w:pPr>
+            <w:r>
+              <w:rPr>
+                <w:sz w:val="19"/>
+                <w:szCs w:val="19"/>
+              </w:rPr>
+              <w:t xml:space="preserve">Enable or disable the spectrometer; start a fresh integration</w:t>
+            </w:r>
+          </w:p>
+        </w:tc>
+      </w:tr>
+      <w:tr>
+        <w:tc>
+          <w:tcPr>
+            <w:tcW w:type="dxa" w:w="3600"/>
+            <w:tcBorders>
+              <w:top w:val="single" w:color="A6A6A6" w:sz="4"/>
+              <w:left w:val="single" w:color="A6A6A6" w:sz="4"/>
+              <w:bottom w:val="single" w:color="A6A6A6" w:sz="4"/>
+              <w:right w:val="single" w:color="A6A6A6" w:sz="4"/>
+            </w:tcBorders>
+            <w:tcMar>
+              <w:top w:type="dxa" w:w="60"/>
+              <w:left w:type="dxa" w:w="100"/>
+              <w:bottom w:type="dxa" w:w="60"/>
+              <w:right w:type="dxa" w:w="100"/>
+            </w:tcMar>
+            <w:vAlign w:val="center"/>
+          </w:tcPr>
+          <w:p>
+            <w:pPr>
+              <w:spacing w:after="0"/>
+            </w:pPr>
+            <w:r>
+              <w:rPr>
+                <w:sz w:val="19"/>
+                <w:szCs w:val="19"/>
+              </w:rPr>
+              <w:t xml:space="preserve">SET SPEC_INPUT &lt;0-7&gt;</w:t>
+            </w:r>
+          </w:p>
+        </w:tc>
+        <w:tc>
+          <w:tcPr>
+            <w:tcW w:type="dxa" w:w="6038"/>
+            <w:tcBorders>
+              <w:top w:val="single" w:color="A6A6A6" w:sz="4"/>
+              <w:left w:val="single" w:color="A6A6A6" w:sz="4"/>
+              <w:bottom w:val="single" w:color="A6A6A6" w:sz="4"/>
+              <w:right w:val="single" w:color="A6A6A6" w:sz="4"/>
+            </w:tcBorders>
+            <w:tcMar>
+              <w:top w:type="dxa" w:w="60"/>
+              <w:left w:type="dxa" w:w="100"/>
+              <w:bottom w:type="dxa" w:w="60"/>
+              <w:right w:type="dxa" w:w="100"/>
+            </w:tcMar>
+            <w:vAlign w:val="center"/>
+          </w:tcPr>
+          <w:p>
+            <w:pPr>
+              <w:spacing w:after="0"/>
+            </w:pPr>
+            <w:r>
+              <w:rPr>
+                <w:sz w:val="19"/>
+                <w:szCs w:val="19"/>
+              </w:rPr>
+              <w:t xml:space="preserve">ADC channel feeding the spectrometer (default 0)</w:t>
+            </w:r>
+          </w:p>
+        </w:tc>
+      </w:tr>
+      <w:tr>
+        <w:tc>
+          <w:tcPr>
+            <w:tcW w:type="dxa" w:w="3600"/>
+            <w:tcBorders>
+              <w:top w:val="single" w:color="A6A6A6" w:sz="4"/>
+              <w:left w:val="single" w:color="A6A6A6" w:sz="4"/>
+              <w:bottom w:val="single" w:color="A6A6A6" w:sz="4"/>
+              <w:right w:val="single" w:color="A6A6A6" w:sz="4"/>
+            </w:tcBorders>
+            <w:tcMar>
+              <w:top w:type="dxa" w:w="60"/>
+              <w:left w:type="dxa" w:w="100"/>
+              <w:bottom w:type="dxa" w:w="60"/>
+              <w:right w:type="dxa" w:w="100"/>
+            </w:tcMar>
+            <w:vAlign w:val="center"/>
+          </w:tcPr>
+          <w:p>
+            <w:pPr>
+              <w:spacing w:after="0"/>
+            </w:pPr>
+            <w:r>
+              <w:rPr>
+                <w:sz w:val="19"/>
+                <w:szCs w:val="19"/>
+              </w:rPr>
+              <w:t xml:space="preserve">SET SPEC_SUBBAND &lt;0-16&gt;</w:t>
+            </w:r>
+          </w:p>
+        </w:tc>
+        <w:tc>
+          <w:tcPr>
+            <w:tcW w:type="dxa" w:w="6038"/>
+            <w:tcBorders>
+              <w:top w:val="single" w:color="A6A6A6" w:sz="4"/>
+              <w:left w:val="single" w:color="A6A6A6" w:sz="4"/>
+              <w:bottom w:val="single" w:color="A6A6A6" w:sz="4"/>
+              <w:right w:val="single" w:color="A6A6A6" w:sz="4"/>
+            </w:tcBorders>
+            <w:tcMar>
+              <w:top w:type="dxa" w:w="60"/>
+              <w:left w:type="dxa" w:w="100"/>
+              <w:bottom w:type="dxa" w:w="60"/>
+              <w:right w:type="dxa" w:w="100"/>
+            </w:tcMar>
+            <w:vAlign w:val="center"/>
+          </w:tcPr>
+          <w:p>
+            <w:pPr>
+              <w:spacing w:after="0"/>
+            </w:pPr>
+            <w:r>
+              <w:rPr>
+                <w:sz w:val="19"/>
+                <w:szCs w:val="19"/>
+              </w:rPr>
+              <w:t xml:space="preserve">Coarse subband, centred on k × 122.88 MHz (default 12)</w:t>
+            </w:r>
+          </w:p>
+        </w:tc>
+      </w:tr>
+      <w:tr>
+        <w:tc>
+          <w:tcPr>
+            <w:tcW w:type="dxa" w:w="3600"/>
+            <w:tcBorders>
+              <w:top w:val="single" w:color="A6A6A6" w:sz="4"/>
+              <w:left w:val="single" w:color="A6A6A6" w:sz="4"/>
+              <w:bottom w:val="single" w:color="A6A6A6" w:sz="4"/>
+              <w:right w:val="single" w:color="A6A6A6" w:sz="4"/>
+            </w:tcBorders>
+            <w:tcMar>
+              <w:top w:type="dxa" w:w="60"/>
+              <w:left w:type="dxa" w:w="100"/>
+              <w:bottom w:type="dxa" w:w="60"/>
+              <w:right w:type="dxa" w:w="100"/>
+            </w:tcMar>
+            <w:vAlign w:val="center"/>
+          </w:tcPr>
+          <w:p>
+            <w:pPr>
+              <w:spacing w:after="0"/>
+            </w:pPr>
+            <w:r>
+              <w:rPr>
+                <w:sz w:val="19"/>
+                <w:szCs w:val="19"/>
+              </w:rPr>
+              <w:t xml:space="preserve">SET SPEC_TINT &lt;s&gt; | SPEC_NSPEC &lt;n&gt;</w:t>
+            </w:r>
+          </w:p>
+        </w:tc>
+        <w:tc>
+          <w:tcPr>
+            <w:tcW w:type="dxa" w:w="6038"/>
+            <w:tcBorders>
+              <w:top w:val="single" w:color="A6A6A6" w:sz="4"/>
+              <w:left w:val="single" w:color="A6A6A6" w:sz="4"/>
+              <w:bottom w:val="single" w:color="A6A6A6" w:sz="4"/>
+              <w:right w:val="single" w:color="A6A6A6" w:sz="4"/>
+            </w:tcBorders>
+            <w:tcMar>
+              <w:top w:type="dxa" w:w="60"/>
+              <w:left w:type="dxa" w:w="100"/>
+              <w:bottom w:type="dxa" w:w="60"/>
+              <w:right w:type="dxa" w:w="100"/>
+            </w:tcMar>
+            <w:vAlign w:val="center"/>
+          </w:tcPr>
+          <w:p>
+            <w:pPr>
+              <w:spacing w:after="0"/>
+            </w:pPr>
+            <w:r>
+              <w:rPr>
+                <w:sz w:val="19"/>
+                <w:szCs w:val="19"/>
+              </w:rPr>
+              <w:t xml:space="preserve">Integration time in seconds or in spectra of 33.33 µs (default 6.0 s = 180000); any spectrometer setting restarts the integration</w:t>
+            </w:r>
+          </w:p>
+        </w:tc>
+      </w:tr>
+      <w:tr>
+        <w:tc>
+          <w:tcPr>
+            <w:tcW w:type="dxa" w:w="3600"/>
+            <w:tcBorders>
+              <w:top w:val="single" w:color="A6A6A6" w:sz="4"/>
+              <w:left w:val="single" w:color="A6A6A6" w:sz="4"/>
+              <w:bottom w:val="single" w:color="A6A6A6" w:sz="4"/>
+              <w:right w:val="single" w:color="A6A6A6" w:sz="4"/>
+            </w:tcBorders>
+            <w:tcMar>
+              <w:top w:type="dxa" w:w="60"/>
+              <w:left w:type="dxa" w:w="100"/>
+              <w:bottom w:type="dxa" w:w="60"/>
+              <w:right w:type="dxa" w:w="100"/>
+            </w:tcMar>
+            <w:vAlign w:val="center"/>
+          </w:tcPr>
+          <w:p>
+            <w:pPr>
+              <w:spacing w:after="0"/>
+            </w:pPr>
+            <w:r>
+              <w:rPr>
+                <w:sz w:val="19"/>
+                <w:szCs w:val="19"/>
+              </w:rPr>
               <w:t xml:space="preserve">RESYNC / SAVE / HELP</w:t>
             </w:r>
           </w:p>
@@ -5437,7 +7123,7 @@
                 <w:sz w:val="19"/>
                 <w:szCs w:val="19"/>
               </w:rPr>
-              <w:t xml:space="preserve">Repeat multi-tile sync; save settings; list commands</w:t>
+              <w:t xml:space="preserve">Repeat multi-tile sync; save settings (including the spectrometer); list commands</w:t>
             </w:r>
           </w:p>
         </w:tc>
@@ -5453,7 +7139,7 @@
         <w:pStyle w:val="Heading2"/>
       </w:pPr>
       <w:r>
-        <w:t xml:space="preserve">5.3  Python client</w:t>
+        <w:t xml:space="preserve">5.4  Python client</w:t>
       </w:r>
     </w:p>
     <w:p>
@@ -5461,7 +7147,7 @@
         <w:spacing w:after="120" w:line="276"/>
       </w:pPr>
       <w:r>
-        <w:t xml:space="preserve">The client library lunaclient (Python and numpy) provides an EventStream class that returns each event as an 8 × L numpy array with its metadata, a Control class for the commands, and the luna-client command line tool (status, set, watch, record to .npz files). Because data and control use separate connections, a program can adjust thresholds while it receives events, for example to hold the event rate constant:</w:t>
+        <w:t xml:space="preserve">The client library lunaclient (Python and numpy) provides an EventStream class that returns each event as an 8 × L numpy array with its metadata, a SpectrumStream class that returns each spectrometer integration with its frequency axis, a Control class for the commands, and the luna-client and luna-spec command line tools (status, set, watch, record to .npz files; luna-spec also plots live). Because data and control use separate connections, a program can adjust thresholds while it receives events, for example to hold the event rate constant:</w:t>
       </w:r>
     </w:p>
     <w:p>
@@ -5649,10 +7335,68 @@
           <w:sz w:val="19"/>
           <w:szCs w:val="19"/>
         </w:rPr>
+        <w:t xml:space="preserve">luna-client set --mode anti --mask 0x7f --veto 7</w:t>
+      </w:r>
+      <w:r>
+        <w:t xml:space="preserve">, </w:t>
+      </w:r>
+      <w:r>
+        <w:rPr>
+          <w:rFonts w:ascii="Consolas" w:cs="Consolas" w:eastAsia="Consolas" w:hAnsi="Consolas"/>
+          <w:sz w:val="19"/>
+          <w:szCs w:val="19"/>
+        </w:rPr>
         <w:t xml:space="preserve">luna-client record -o data/</w:t>
       </w:r>
       <w:r>
+        <w:t xml:space="preserve">, </w:t>
+      </w:r>
+      <w:r>
+        <w:rPr>
+          <w:rFonts w:ascii="Consolas" w:cs="Consolas" w:eastAsia="Consolas" w:hAnsi="Consolas"/>
+          <w:sz w:val="19"/>
+          <w:szCs w:val="19"/>
+        </w:rPr>
+        <w:t xml:space="preserve">luna-spec set --input 0 --subband 12 --tint 6 --on --save</w:t>
+      </w:r>
+      <w:r>
+        <w:t xml:space="preserve">, </w:t>
+      </w:r>
+      <w:r>
+        <w:rPr>
+          <w:rFonts w:ascii="Consolas" w:cs="Consolas" w:eastAsia="Consolas" w:hAnsi="Consolas"/>
+          <w:sz w:val="19"/>
+          <w:szCs w:val="19"/>
+        </w:rPr>
+        <w:t xml:space="preserve">luna-spec record -o spectra/ --skip-first</w:t>
+      </w:r>
+      <w:r>
         <w:t xml:space="preserve">.</w:t>
+      </w:r>
+    </w:p>
+    <w:p>
+      <w:pPr>
+        <w:spacing w:after="120" w:line="276"/>
+      </w:pPr>
+      <w:r>
+        <w:rPr>
+          <w:b/>
+          <w:bCs/>
+        </w:rPr>
+        <w:t xml:space="preserve">lunaGUI</w:t>
+      </w:r>
+      <w:r>
+        <w:t xml:space="preserve"> (PyQt6) is a graphical front end built on the same library: a control panel for the trigger (including the veto channel) and the spectrometer, live plots of each event (time trace, spectrum and histogram per channel), a spectrum window for the spectrometer, recording to .npz files, and an optional CSV log of each channel’s threshold, hit rate, trigger rate and noise peak at every status poll. </w:t>
+      </w:r>
+      <w:r>
+        <w:rPr>
+          <w:b/>
+          <w:bCs/>
+        </w:rPr>
+        <w:t xml:space="preserve">lunaAnalyser</w:t>
+      </w:r>
+      <w:r>
+        <w:t xml:space="preserve"> (sw/lunaAnalyser) is an offline viewer that steps through a directory of recorded events with the same plots, markers and PNG export; it shows the veto channel of events recorded with one.</w:t>
       </w:r>
     </w:p>
     <w:p>
@@ -6125,6 +7869,192 @@
           </w:p>
         </w:tc>
       </w:tr>
+      <w:tr>
+        <w:tc>
+          <w:tcPr>
+            <w:tcW w:type="dxa" w:w="3400"/>
+            <w:tcBorders>
+              <w:top w:val="single" w:color="A6A6A6" w:sz="4"/>
+              <w:left w:val="single" w:color="A6A6A6" w:sz="4"/>
+              <w:bottom w:val="single" w:color="A6A6A6" w:sz="4"/>
+              <w:right w:val="single" w:color="A6A6A6" w:sz="4"/>
+            </w:tcBorders>
+            <w:tcMar>
+              <w:top w:type="dxa" w:w="60"/>
+              <w:left w:type="dxa" w:w="100"/>
+              <w:bottom w:type="dxa" w:w="60"/>
+              <w:right w:type="dxa" w:w="100"/>
+            </w:tcMar>
+            <w:vAlign w:val="center"/>
+          </w:tcPr>
+          <w:p>
+            <w:pPr>
+              <w:spacing w:after="0"/>
+            </w:pPr>
+            <w:r>
+              <w:rPr>
+                <w:sz w:val="19"/>
+                <w:szCs w:val="19"/>
+              </w:rPr>
+              <w:t xml:space="preserve">Spectrometer resolution</w:t>
+            </w:r>
+          </w:p>
+        </w:tc>
+        <w:tc>
+          <w:tcPr>
+            <w:tcW w:type="dxa" w:w="6238"/>
+            <w:tcBorders>
+              <w:top w:val="single" w:color="A6A6A6" w:sz="4"/>
+              <w:left w:val="single" w:color="A6A6A6" w:sz="4"/>
+              <w:bottom w:val="single" w:color="A6A6A6" w:sz="4"/>
+              <w:right w:val="single" w:color="A6A6A6" w:sz="4"/>
+            </w:tcBorders>
+            <w:tcMar>
+              <w:top w:type="dxa" w:w="60"/>
+              <w:left w:type="dxa" w:w="100"/>
+              <w:bottom w:type="dxa" w:w="60"/>
+              <w:right w:type="dxa" w:w="100"/>
+            </w:tcMar>
+            <w:vAlign w:val="center"/>
+          </w:tcPr>
+          <w:p>
+            <w:pPr>
+              <w:spacing w:after="0"/>
+            </w:pPr>
+            <w:r>
+              <w:rPr>
+                <w:sz w:val="19"/>
+                <w:szCs w:val="19"/>
+              </w:rPr>
+              <w:t xml:space="preserve">30 kHz fine channels (4096 per 122.88 MHz subband); one spectrum every 33.33 µs</w:t>
+            </w:r>
+          </w:p>
+        </w:tc>
+      </w:tr>
+      <w:tr>
+        <w:tc>
+          <w:tcPr>
+            <w:tcW w:type="dxa" w:w="3400"/>
+            <w:tcBorders>
+              <w:top w:val="single" w:color="A6A6A6" w:sz="4"/>
+              <w:left w:val="single" w:color="A6A6A6" w:sz="4"/>
+              <w:bottom w:val="single" w:color="A6A6A6" w:sz="4"/>
+              <w:right w:val="single" w:color="A6A6A6" w:sz="4"/>
+            </w:tcBorders>
+            <w:tcMar>
+              <w:top w:type="dxa" w:w="60"/>
+              <w:left w:type="dxa" w:w="100"/>
+              <w:bottom w:type="dxa" w:w="60"/>
+              <w:right w:type="dxa" w:w="100"/>
+            </w:tcMar>
+            <w:vAlign w:val="center"/>
+          </w:tcPr>
+          <w:p>
+            <w:pPr>
+              <w:spacing w:after="0"/>
+            </w:pPr>
+            <w:r>
+              <w:rPr>
+                <w:sz w:val="19"/>
+                <w:szCs w:val="19"/>
+              </w:rPr>
+              <w:t xml:space="preserve">Spectrometer integration time</w:t>
+            </w:r>
+          </w:p>
+        </w:tc>
+        <w:tc>
+          <w:tcPr>
+            <w:tcW w:type="dxa" w:w="6238"/>
+            <w:tcBorders>
+              <w:top w:val="single" w:color="A6A6A6" w:sz="4"/>
+              <w:left w:val="single" w:color="A6A6A6" w:sz="4"/>
+              <w:bottom w:val="single" w:color="A6A6A6" w:sz="4"/>
+              <w:right w:val="single" w:color="A6A6A6" w:sz="4"/>
+            </w:tcBorders>
+            <w:tcMar>
+              <w:top w:type="dxa" w:w="60"/>
+              <w:left w:type="dxa" w:w="100"/>
+              <w:bottom w:type="dxa" w:w="60"/>
+              <w:right w:type="dxa" w:w="100"/>
+            </w:tcMar>
+            <w:vAlign w:val="center"/>
+          </w:tcPr>
+          <w:p>
+            <w:pPr>
+              <w:spacing w:after="0"/>
+            </w:pPr>
+            <w:r>
+              <w:rPr>
+                <w:sz w:val="19"/>
+                <w:szCs w:val="19"/>
+              </w:rPr>
+              <w:t xml:space="preserve">N × 33.33 µs, default 6.000 s. Integrations shorter than about 50 ms can be lost: 2 banks, about 3 ms server readout each</w:t>
+            </w:r>
+          </w:p>
+        </w:tc>
+      </w:tr>
+      <w:tr>
+        <w:tc>
+          <w:tcPr>
+            <w:tcW w:type="dxa" w:w="3400"/>
+            <w:tcBorders>
+              <w:top w:val="single" w:color="A6A6A6" w:sz="4"/>
+              <w:left w:val="single" w:color="A6A6A6" w:sz="4"/>
+              <w:bottom w:val="single" w:color="A6A6A6" w:sz="4"/>
+              <w:right w:val="single" w:color="A6A6A6" w:sz="4"/>
+            </w:tcBorders>
+            <w:tcMar>
+              <w:top w:type="dxa" w:w="60"/>
+              <w:left w:type="dxa" w:w="100"/>
+              <w:bottom w:type="dxa" w:w="60"/>
+              <w:right w:type="dxa" w:w="100"/>
+            </w:tcMar>
+            <w:vAlign w:val="center"/>
+          </w:tcPr>
+          <w:p>
+            <w:pPr>
+              <w:spacing w:after="0"/>
+            </w:pPr>
+            <w:r>
+              <w:rPr>
+                <w:sz w:val="19"/>
+                <w:szCs w:val="19"/>
+              </w:rPr>
+              <w:t xml:space="preserve">Spectrum data rate</w:t>
+            </w:r>
+          </w:p>
+        </w:tc>
+        <w:tc>
+          <w:tcPr>
+            <w:tcW w:type="dxa" w:w="6238"/>
+            <w:tcBorders>
+              <w:top w:val="single" w:color="A6A6A6" w:sz="4"/>
+              <w:left w:val="single" w:color="A6A6A6" w:sz="4"/>
+              <w:bottom w:val="single" w:color="A6A6A6" w:sz="4"/>
+              <w:right w:val="single" w:color="A6A6A6" w:sz="4"/>
+            </w:tcBorders>
+            <w:tcMar>
+              <w:top w:type="dxa" w:w="60"/>
+              <w:left w:type="dxa" w:w="100"/>
+              <w:bottom w:type="dxa" w:w="60"/>
+              <w:right w:type="dxa" w:w="100"/>
+            </w:tcMar>
+            <w:vAlign w:val="center"/>
+          </w:tcPr>
+          <w:p>
+            <w:pPr>
+              <w:spacing w:after="0"/>
+            </w:pPr>
+            <w:r>
+              <w:rPr>
+                <w:sz w:val="19"/>
+                <w:szCs w:val="19"/>
+              </w:rPr>
+              <w:t xml:space="preserve">32 KiB per integration (≈ 5.5 KiB/s at 6 s), negligible next to the event stream</w:t>
+            </w:r>
+          </w:p>
+        </w:tc>
+      </w:tr>
     </w:tbl>
     <w:p>
       <w:pPr>
@@ -6149,7 +8079,7 @@
         <w:spacing w:after="60"/>
       </w:pPr>
       <w:r>
-        <w:t xml:space="preserve">Simulate the VHDL: hw/sim/run_sim.sh</w:t>
+        <w:t xml:space="preserve">Simulate the VHDL: hw/sim/run_sim.sh (trigger and capture); hw/sim/run_sim.sh spec (spectrometer with the CSIRO cores, much longer)</w:t>
       </w:r>
     </w:p>
     <w:p>
@@ -6162,7 +8092,7 @@
         <w:spacing w:after="60"/>
       </w:pPr>
       <w:r>
-        <w:t xml:space="preserve">Build the FPGA (about 1 hour): vivado -mode batch -source hw/scripts/build.tcl -tclargs all 3</w:t>
+        <w:t xml:space="preserve">Build the FPGA (about 1 hour; needs the CSIRO cores in refernces/PFB or LUNA_PFB_IP): vivado -mode batch -source hw/scripts/build.tcl -tclargs all 3</w:t>
       </w:r>
     </w:p>
     <w:p>
@@ -6214,7 +8144,7 @@
         <w:spacing w:after="60"/>
       </w:pPr>
       <w:r>
-        <w:t xml:space="preserve">On the client PC: cd sw/client; uv sync; uv run luna-client status</w:t>
+        <w:t xml:space="preserve">On the client PC: cd sw/client; uv sync; uv run luna-client status; uv run luna-spec status</w:t>
       </w:r>
     </w:p>
     <w:p>
@@ -6230,7 +8160,7 @@
         <w:spacing w:after="120" w:line="276"/>
       </w:pPr>
       <w:r>
-        <w:t xml:space="preserve">Bring-up on the ZCU111 was completed in October 2026. The clocks, RF data converters and multi-tile synchronisation, threshold triggering, DMA readout and network streaming all work, and event data is being collected. The checks below remain the procedure for a new board or SD card.</w:t>
+        <w:t xml:space="preserve">Bring-up on the ZCU111 was completed in October 2026. The clocks, RF data converters and multi-tile synchronisation, threshold triggering, DMA readout and network streaming all work, and event data is being collected. The checks below remain the procedure for a new board or SD card. The spectrometer and the veto were tested on the board in October 2026; the last five checks are their bring-up procedure (three for the spectrometer, two for the veto).</w:t>
       </w:r>
     </w:p>
     <w:p>
@@ -6283,6 +8213,71 @@
       </w:pPr>
       <w:r>
         <w:t xml:space="preserve">A short pulse split to all eight inputs appears at the same sample index on every channel and at the trigger offset.</w:t>
+      </w:r>
+    </w:p>
+    <w:p>
+      <w:pPr>
+        <w:pStyle w:val="ListParagraph"/>
+        <w:numPr>
+          <w:ilvl w:val="0"/>
+          <w:numId w:val="2"/>
+        </w:numPr>
+        <w:spacing w:after="60"/>
+      </w:pPr>
+      <w:r>
+        <w:t xml:space="preserve">The server log shows “spec: spectrometer v1.1, 2 banks” and GET SPEC shows present=1, enabled=1, input 0, subband 12 and an integration time of 6 s.</w:t>
+      </w:r>
+    </w:p>
+    <w:p>
+      <w:pPr>
+        <w:pStyle w:val="ListParagraph"/>
+        <w:numPr>
+          <w:ilvl w:val="0"/>
+          <w:numId w:val="2"/>
+        </w:numPr>
+        <w:spacing w:after="60"/>
+      </w:pPr>
+      <w:r>
+        <w:t xml:space="preserve">A CW tone of 1476.06 MHz on ADC 0 (subband 12 centre + 1.5 MHz) appears at 1476.06 MHz in every 6 s integration, and disappears with SET SPEC_SUBBAND 11.</w:t>
+      </w:r>
+    </w:p>
+    <w:p>
+      <w:pPr>
+        <w:pStyle w:val="ListParagraph"/>
+        <w:numPr>
+          <w:ilvl w:val="0"/>
+          <w:numId w:val="2"/>
+        </w:numPr>
+        <w:spacing w:after="60"/>
+      </w:pPr>
+      <w:r>
+        <w:t xml:space="preserve">With the tone moved to ADC 5, SET SPEC_INPUT 5 shows it again and the spectra report ADC 5; SET SPEC_TINT 0.1 gives integrations every 0.1 s with nothing lost.</w:t>
+      </w:r>
+    </w:p>
+    <w:p>
+      <w:pPr>
+        <w:pStyle w:val="ListParagraph"/>
+        <w:numPr>
+          <w:ilvl w:val="0"/>
+          <w:numId w:val="2"/>
+        </w:numPr>
+        <w:spacing w:after="60"/>
+      </w:pPr>
+      <w:r>
+        <w:t xml:space="preserve">The server log shows “pl: trigger core v2.1, 4 capture banks, veto”, and GET CONFIG reports veto=OFF.</w:t>
+      </w:r>
+    </w:p>
+    <w:p>
+      <w:pPr>
+        <w:pStyle w:val="ListParagraph"/>
+        <w:numPr>
+          <w:ilvl w:val="0"/>
+          <w:numId w:val="2"/>
+        </w:numPr>
+        <w:spacing w:after="60"/>
+      </w:pPr>
+      <w:r>
+        <w:t xml:space="preserve">With SET MODE ANTI and SET VETO 7: a pulse on channel 7 alone gives no event; a pulse on channel 0 alone triggers, and the event shows veto channel 7; the same pulse split to channels 0 and 7 gives no event.</w:t>
       </w:r>
     </w:p>
     <w:p>
@@ -6440,7 +8435,7 @@
                 <w:sz w:val="19"/>
                 <w:szCs w:val="19"/>
               </w:rPr>
-              <w:t xml:space="preserve">VHDL: gearbox, detector, trigger logic, capture banks, readout, registers, SYSREF capture</w:t>
+              <w:t xml:space="preserve">VHDL: gearbox, detector, trigger logic, capture banks, readout, registers, SYSREF capture, spectrometer (spectrometer_top, spec_regs_axil)</w:t>
             </w:r>
           </w:p>
         </w:tc>
@@ -6502,7 +8497,7 @@
                 <w:sz w:val="19"/>
                 <w:szCs w:val="19"/>
               </w:rPr>
-              <w:t xml:space="preserve">Vivado block design and build scripts</w:t>
+              <w:t xml:space="preserve">Vivado block design and build scripts; spec_ip.tcl creates the CSIRO filter-bank IP</w:t>
             </w:r>
           </w:p>
         </w:tc>
@@ -6564,7 +8559,7 @@
                 <w:sz w:val="19"/>
                 <w:szCs w:val="19"/>
               </w:rPr>
-              <w:t xml:space="preserve">Testbenches, Python golden model, simulation script</w:t>
+              <w:t xml:space="preserve">Testbenches, Python golden models, simulation script (spec: spectrometer with the CSIRO cores)</w:t>
             </w:r>
           </w:p>
         </w:tc>
@@ -6626,7 +8621,7 @@
                 <w:sz w:val="19"/>
                 <w:szCs w:val="19"/>
               </w:rPr>
-              <w:t xml:space="preserve">lunaserver (C): clocks, RFDC/MTS, trigger interrupt, DMA, TCP servers</w:t>
+              <w:t xml:space="preserve">lunaserver (C): clocks, RFDC/MTS, trigger interrupt, DMA, spectrometer readout, TCP servers</w:t>
             </w:r>
           </w:p>
         </w:tc>
@@ -6688,7 +8683,7 @@
                 <w:sz w:val="19"/>
                 <w:szCs w:val="19"/>
               </w:rPr>
-              <w:t xml:space="preserve">Python client library and luna-client command line tool</w:t>
+              <w:t xml:space="preserve">Python client library, luna-client and luna-spec command line tools, lunaGUI (PyQt6)</w:t>
             </w:r>
           </w:p>
         </w:tc>
@@ -6720,6 +8715,68 @@
                 <w:sz w:val="19"/>
                 <w:szCs w:val="19"/>
               </w:rPr>
+              <w:t xml:space="preserve">sw/lunaAnalyser/</w:t>
+            </w:r>
+          </w:p>
+        </w:tc>
+        <w:tc>
+          <w:tcPr>
+            <w:tcW w:type="dxa" w:w="7238"/>
+            <w:tcBorders>
+              <w:top w:val="single" w:color="A6A6A6" w:sz="4"/>
+              <w:left w:val="single" w:color="A6A6A6" w:sz="4"/>
+              <w:bottom w:val="single" w:color="A6A6A6" w:sz="4"/>
+              <w:right w:val="single" w:color="A6A6A6" w:sz="4"/>
+            </w:tcBorders>
+            <w:tcMar>
+              <w:top w:type="dxa" w:w="60"/>
+              <w:left w:type="dxa" w:w="100"/>
+              <w:bottom w:type="dxa" w:w="60"/>
+              <w:right w:type="dxa" w:w="100"/>
+            </w:tcMar>
+            <w:vAlign w:val="center"/>
+          </w:tcPr>
+          <w:p>
+            <w:pPr>
+              <w:spacing w:after="0"/>
+            </w:pPr>
+            <w:r>
+              <w:rPr>
+                <w:sz w:val="19"/>
+                <w:szCs w:val="19"/>
+              </w:rPr>
+              <w:t xml:space="preserve">lunaAnalyser (PyQt6): offline viewer for recorded events</w:t>
+            </w:r>
+          </w:p>
+        </w:tc>
+      </w:tr>
+      <w:tr>
+        <w:tc>
+          <w:tcPr>
+            <w:tcW w:type="dxa" w:w="2400"/>
+            <w:tcBorders>
+              <w:top w:val="single" w:color="A6A6A6" w:sz="4"/>
+              <w:left w:val="single" w:color="A6A6A6" w:sz="4"/>
+              <w:bottom w:val="single" w:color="A6A6A6" w:sz="4"/>
+              <w:right w:val="single" w:color="A6A6A6" w:sz="4"/>
+            </w:tcBorders>
+            <w:tcMar>
+              <w:top w:type="dxa" w:w="60"/>
+              <w:left w:type="dxa" w:w="100"/>
+              <w:bottom w:type="dxa" w:w="60"/>
+              <w:right w:type="dxa" w:w="100"/>
+            </w:tcMar>
+            <w:vAlign w:val="center"/>
+          </w:tcPr>
+          <w:p>
+            <w:pPr>
+              <w:spacing w:after="0"/>
+            </w:pPr>
+            <w:r>
+              <w:rPr>
+                <w:sz w:val="19"/>
+                <w:szCs w:val="19"/>
+              </w:rPr>
               <w:t xml:space="preserve">sw/petalinux/</w:t>
             </w:r>
           </w:p>
@@ -6812,7 +8869,69 @@
                 <w:sz w:val="19"/>
                 <w:szCs w:val="19"/>
               </w:rPr>
-              <w:t xml:space="preserve">System overview diagram, register map, network protocol</w:t>
+              <w:t xml:space="preserve">System overview and block diagrams, Vivado block design picture, register map, network protocol, this document</w:t>
+            </w:r>
+          </w:p>
+        </w:tc>
+      </w:tr>
+      <w:tr>
+        <w:tc>
+          <w:tcPr>
+            <w:tcW w:type="dxa" w:w="2400"/>
+            <w:tcBorders>
+              <w:top w:val="single" w:color="A6A6A6" w:sz="4"/>
+              <w:left w:val="single" w:color="A6A6A6" w:sz="4"/>
+              <w:bottom w:val="single" w:color="A6A6A6" w:sz="4"/>
+              <w:right w:val="single" w:color="A6A6A6" w:sz="4"/>
+            </w:tcBorders>
+            <w:tcMar>
+              <w:top w:type="dxa" w:w="60"/>
+              <w:left w:type="dxa" w:w="100"/>
+              <w:bottom w:type="dxa" w:w="60"/>
+              <w:right w:type="dxa" w:w="100"/>
+            </w:tcMar>
+            <w:vAlign w:val="center"/>
+          </w:tcPr>
+          <w:p>
+            <w:pPr>
+              <w:spacing w:after="0"/>
+            </w:pPr>
+            <w:r>
+              <w:rPr>
+                <w:sz w:val="19"/>
+                <w:szCs w:val="19"/>
+              </w:rPr>
+              <w:t xml:space="preserve">refernces/PFB/</w:t>
+            </w:r>
+          </w:p>
+        </w:tc>
+        <w:tc>
+          <w:tcPr>
+            <w:tcW w:type="dxa" w:w="7238"/>
+            <w:tcBorders>
+              <w:top w:val="single" w:color="A6A6A6" w:sz="4"/>
+              <w:left w:val="single" w:color="A6A6A6" w:sz="4"/>
+              <w:bottom w:val="single" w:color="A6A6A6" w:sz="4"/>
+              <w:right w:val="single" w:color="A6A6A6" w:sz="4"/>
+            </w:tcBorders>
+            <w:tcMar>
+              <w:top w:type="dxa" w:w="60"/>
+              <w:left w:type="dxa" w:w="100"/>
+              <w:bottom w:type="dxa" w:w="60"/>
+              <w:right w:type="dxa" w:w="100"/>
+            </w:tcMar>
+            <w:vAlign w:val="center"/>
+          </w:tcPr>
+          <w:p>
+            <w:pPr>
+              <w:spacing w:after="0"/>
+            </w:pPr>
+            <w:r>
+              <w:rPr>
+                <w:sz w:val="19"/>
+                <w:szCs w:val="19"/>
+              </w:rPr>
+              <w:t xml:space="preserve">Not in git (CSIRO IP, kept locally): System Generator cores pfb32x16t, dfb4096x1c and rnd_23_18, needed by the FPGA build and the spectrometer simulation</w:t>
             </w:r>
           </w:p>
         </w:tc>

</xml_diff>

<commit_message>
docs: oversampled coarse filter bank (System Description v1.4)
Register map, protocol, README, block and overview diagrams, Vivado block
design export and System Description updated for 145.636 MS/s subbands,
35.556 kHz fine channels, 28.125 us spectra and the new build results.

Co-Authored-By: Claude Opus 5.5 <noreply@anthropic.com>
</commit_message>
<xml_diff>
--- a/docs/lunaZCU111_System_Description.docx
+++ b/docs/lunaZCU111_System_Description.docx
@@ -78,7 +78,7 @@
           <w:sz w:val="22"/>
           <w:szCs w:val="22"/>
         </w:rPr>
-        <w:t xml:space="preserve">Document version 1.3 — 14 October 2026</w:t>
+        <w:t xml:space="preserve">Document version 1.4 — 18 October 2026</w:t>
       </w:r>
     </w:p>
     <w:p>
@@ -93,7 +93,7 @@
           <w:sz w:val="21"/>
           <w:szCs w:val="21"/>
         </w:rPr>
-        <w:t xml:space="preserve">Status: the trigger and capture system is complete and working on hardware: clocks, RF converters and multi-tile sync, triggering, DMA readout and network streaming are verified on the ZCU111, and event data is being collected. The integrating spectrometer and the anti-coincidence veto channel (branch veto, which includes the spectrometer) are implemented, simulated (the spectrometer with the CSIRO filter-bank cores) and built with all timing constraints met, and both have been tested on the board (October 2026).</w:t>
+        <w:t xml:space="preserve">Status: the trigger and capture system is complete and working on hardware: clocks, RF converters and multi-tile sync, triggering, DMA readout and network streaming are verified on the ZCU111, and event data is being collected. The integrating spectrometer and the anti-coincidence veto channel (branch veto, which includes the spectrometer) have been tested on the board (October 2026). Version 1.4 describes branch veto-osfb, in which the spectrometer’s critically sampled coarse filter bank is replaced by a 32/27 oversampled one (spectrometer v2.0): implemented, simulated (with the CSIRO fine filter-bank core) and built with all timing constraints met; not yet tested on the board.</w:t>
       </w:r>
     </w:p>
     <w:p>
@@ -139,7 +139,7 @@
         <w:t xml:space="preserve">integrating spectrometer</w:t>
       </w:r>
       <w:r>
-        <w:t xml:space="preserve">: a polyphase filter bank splits it into 17 subbands of 122.88 MHz, a selected subband is split again into 4096 channels of 30 kHz, and the power in each channel is integrated (6 s by default) and streamed to the clients on a separate TCP port.</w:t>
+        <w:t xml:space="preserve">: a 32/27 oversampled polyphase filter bank splits it into 17 subbands spaced 122.88 MHz apart (each sampled at 145.64 MHz, so that its own 122.88 MHz band is free of aliasing), a selected subband is split again into 4096 channels of 35.556 kHz, and the power in each channel is integrated (6 s by default) and streamed to the clients on a separate TCP port.</w:t>
       </w:r>
     </w:p>
     <w:p>
@@ -863,7 +863,7 @@
                 <w:sz w:val="19"/>
                 <w:szCs w:val="19"/>
               </w:rPr>
-              <w:t xml:space="preserve">Any one of the 8 channels (default 0): 17 coarse subbands of 122.88 MHz (polyphase filter bank); the selected subband (default 12, centred on 1474.56 MHz) is split into 4096 fine channels of 30 kHz</w:t>
+              <w:t xml:space="preserve">Any one of the 8 channels (default 0): 17 coarse subbands 122.88 MHz apart (32/27 oversampled polyphase filter bank, 145.64 MS/s per subband); the selected subband (default 12, centred on 1474.56 MHz) is split into 4096 fine channels of 35.556 kHz, of which the central 3456 (±61.44 MHz) are the subband’s own band</w:t>
             </w:r>
           </w:p>
         </w:tc>
@@ -925,7 +925,7 @@
                 <w:sz w:val="19"/>
                 <w:szCs w:val="19"/>
               </w:rPr>
-              <w:t xml:space="preserve">Power accumulated (64 bit) over N spectra of 33.33 µs, default 180000 = 6.000 s; each integration streamed on TCP port 5002</w:t>
+              <w:t xml:space="preserve">Power accumulated (64 bit) over N spectra of 28.125 µs, default 213333 = 6.000 s; each integration streamed on TCP port 5002</w:t>
             </w:r>
           </w:p>
         </w:tc>
@@ -2813,7 +2813,7 @@
                 <w:sz w:val="19"/>
                 <w:szCs w:val="19"/>
               </w:rPr>
-              <w:t xml:space="preserve">MMCM → 491.52 / 245.76 / 122.88 MHz fabric clocks</w:t>
+              <w:t xml:space="preserve">MMCM → 491.52 / 245.76 / 145.636 MHz fabric clocks</w:t>
             </w:r>
           </w:p>
         </w:tc>
@@ -3211,7 +3211,7 @@
         <w:spacing w:after="120" w:line="276"/>
       </w:pPr>
       <w:r>
-        <w:t xml:space="preserve">The PL design is a Vivado block design (Xilinx IP) with the trigger, capture and spectrometer control logic written in VHDL; the spectrometer filter banks are CSIRO System Generator cores. All trigger and capture logic runs at 245.76 MHz and processes 16 samples per channel per clock cycle. The spectrometer runs at 122.88 MHz (clk_spec, a third output of the same MMCM, phase aligned with the 245.76 MHz clock) and processes 32 samples per clock cycle.</w:t>
+        <w:t xml:space="preserve">The PL design is a Vivado block design (Xilinx IP) with the trigger, capture and spectrometer logic written in VHDL; the spectrometer’s fine filter bank is a CSIRO System Generator core. All trigger and capture logic runs at 245.76 MHz and processes 16 samples per channel per clock cycle. The spectrometer runs at 145.636 MHz = fs/27 (clk_spec, from the fractional divider of the same MMCM, 983.04 MHz / 6.75) and processes 27 new samples per clock cycle; it is treated as asynchronous to the 245.76 MHz clock and fed through an asynchronous FIFO.</w:t>
       </w:r>
     </w:p>
     <w:p>
@@ -3730,7 +3730,7 @@
         <w:spacing w:after="120" w:line="276"/>
       </w:pPr>
       <w:r>
-        <w:t xml:space="preserve">Any one of the eight channels can be fed to an integrating spectrometer that runs alongside the trigger (hw/hdl/spectrometer_top.vhd). Its two filter banks are cores developed at CSIRO with System Generator (pfb32x16t, dfb4096x1c and the rounding block rnd_23_18). They are not part of the repository: the build creates them as IP-catalog instances from a local folder (refernces/PFB).</w:t>
+        <w:t xml:space="preserve">Any one of the eight channels can be fed to an integrating spectrometer that runs alongside the trigger (hw/hdl/spectrometer_top.vhd). The coarse filter bank (ospfb) is our own VHDL; the fine filter bank (dfb4096x1c) is a core developed at CSIRO with System Generator. It is not part of the repository: the build creates it as an IP-catalog instance from a local folder (refernces/PFB). Spectrometer v1.x used CSIRO’s critically sampled coarse filter bank pfb32x16t (with the rounding block rnd_23_18); its response is −6 dB at the subband edges, so the outer fine channels contained aliases of the neighbouring subband. v2.0 oversamples by 32/27, which moves those aliases outside the subband’s band.</w:t>
       </w:r>
     </w:p>
     <w:tbl>
@@ -3942,7 +3942,7 @@
                 <w:sz w:val="19"/>
                 <w:szCs w:val="19"/>
               </w:rPr>
-              <w:t xml:space="preserve">2:1, 16 samples at 245.76 MHz → 32 samples at 122.88 MHz (clk_spec)</w:t>
+              <w:t xml:space="preserve">16 → 27: 16 samples per 245.76 MHz cycle are regrouped into words of 27 samples (16 words every 27 cycles), which cross to clk_spec (145.636 MHz) through an XPM asynchronous FIFO, read every cycle once half full</w:t>
             </w:r>
           </w:p>
         </w:tc>
@@ -3974,7 +3974,7 @@
                 <w:sz w:val="19"/>
                 <w:szCs w:val="19"/>
               </w:rPr>
-              <w:t xml:space="preserve">Coarse filter bank (pfb32x16t)</w:t>
+              <w:t xml:space="preserve">Coarse filter bank (ospfb)</w:t>
             </w:r>
           </w:p>
         </w:tc>
@@ -4004,7 +4004,7 @@
                 <w:sz w:val="19"/>
                 <w:szCs w:val="19"/>
               </w:rPr>
-              <w:t xml:space="preserve">16-channel polyphase filter bank: 32 real samples per clock → 17 complex subbands of 122.88 MHz, sampled at 122.88 MS/s; subband k is centred on k × 122.88 MHz (subbands 0 and 16 are real)</w:t>
+              <w:t xml:space="preserve">32-branch real polyphase filter bank oversampled 32/27 (decimation 27), 512-tap equiripple prototype: subbands 122.88 MHz apart, subband k centred on k × 122.88 MHz and sampled at 145.636 MS/s complex; flat (±0.02 dB) to ±58 MHz, −0.5 dB at ±61.44 MHz, −3 dB at ±66.5 MHz; anything aliasing into ±61.44 MHz is ≤ −72 dB (subbands 0 and 16 are real)</w:t>
             </w:r>
           </w:p>
         </w:tc>
@@ -4036,7 +4036,7 @@
                 <w:sz w:val="19"/>
                 <w:szCs w:val="19"/>
               </w:rPr>
-              <w:t xml:space="preserve">Subband select</w:t>
+              <w:t xml:space="preserve">Subband</w:t>
             </w:r>
           </w:p>
         </w:tc>
@@ -4066,7 +4066,7 @@
                 <w:sz w:val="19"/>
                 <w:szCs w:val="19"/>
               </w:rPr>
-              <w:t xml:space="preserve">SUBBAND register (0 … 16, default 12 = 1474.56 MHz) selects one subband; rnd_23_18 rounds it from 23 to 18 bits</w:t>
+              <w:t xml:space="preserve">SUBBAND register (0 … 16, default 12 = 1474.56 MHz): only this subband is computed — polyphase FIR (32 systolic 16-tap DSP chains), single-bin DFT, and a rotation by e^(−j2πk·27m/32) that accounts for the decimation by 27 instead of 32 and corrects the filter gain; 18-bit output with the scale of the old pfb32x16t + rnd_23_18</w:t>
             </w:r>
           </w:p>
         </w:tc>
@@ -4128,7 +4128,7 @@
                 <w:sz w:val="19"/>
                 <w:szCs w:val="19"/>
               </w:rPr>
-              <w:t xml:space="preserve">4096 channels of 30 kHz, one spectrum every 33.33 µs; power accumulated in 64 bits over ACC_LEN + 1 spectra (default 180000 = 6.000 s)</w:t>
+              <w:t xml:space="preserve">4096 channels of 35.556 kHz spanning 145.636 MHz (the central 3456, ±61.44 MHz, are the subband’s own band; the outer 640 overlap the neighbouring subbands), one spectrum every 28.125 µs; power accumulated in 64 bits over ACC_LEN + 1 spectra (default 213333 = 6.000 s)</w:t>
             </w:r>
           </w:p>
         </w:tc>
@@ -4252,7 +4252,7 @@
                 <w:sz w:val="19"/>
                 <w:szCs w:val="19"/>
               </w:rPr>
-              <w:t xml:space="preserve">AXI-Lite at 0xA014_0000 (128 KiB, clk_spec): enable, input, subband, integration length, status, counters and the header of the oldest bank; the banks are read at +0x10000</w:t>
+              <w:t xml:space="preserve">AXI-Lite at 0xA014_0000 (128 KiB, clk_spec): enable, input, subband, integration length, status (including a FIFO-underflow flag), counters, the header of the oldest bank and PFB_CFG (branches 32, decimation 27, taps 16); the banks are read at +0x10000</w:t>
             </w:r>
           </w:p>
         </w:tc>
@@ -4276,7 +4276,7 @@
         <w:spacing w:after="120" w:line="276"/>
       </w:pPr>
       <w:r>
-        <w:t xml:space="preserve">The fine channels are in FFT order: channel k lies at subband × 122.88 MHz + k × 30 kHz for k &lt; 2048, and at subband × 122.88 MHz + (k − 4096) × 30 kHz for k ≥ 2048.</w:t>
+        <w:t xml:space="preserve">The fine channels are in FFT order: channel k lies at subband × 122.88 MHz + k × 35.556 kHz for k &lt; 2048, and at subband × 122.88 MHz + (k − 4096) × 35.556 kHz for k ≥ 2048 (30 kHz with spectrometer v1.x). Channels −1728 … 1727 are the subband’s own band. The server reports the decimation (GET SPEC decim=27) and puts it in each spectrum frame (version 3, flags bits 15:8), so the clients use the right channel width with either bitstream.</w:t>
       </w:r>
     </w:p>
     <w:p>
@@ -4435,7 +4435,7 @@
                 <w:sz w:val="19"/>
                 <w:szCs w:val="19"/>
               </w:rPr>
-              <w:t xml:space="preserve">All constraints met (veto branch, trigger core v2.1 with spectrometer): WNS +0.149 ns (491.52 MHz gearbox domain), WHS +0.010 ns; spectrometer clock domain +2.75 ns</w:t>
+              <w:t xml:space="preserve">All constraints met (branch veto-osfb, spectrometer v2.0 with the oversampled coarse filter bank): WNS +0.029 ns (491.52 → 245.76 MHz gearbox transfer), WHS +0.009 ns; spectrometer clock domain (145.636 MHz) +0.546 ns; FIFO crossing into it +3.1 ns; PL SYSREF capture +0.30 ns setup / +1.20 ns hold, with clk_2x and clk_1x both delayed by 0.763 ns in the MMCM to keep it centred</w:t>
             </w:r>
           </w:p>
         </w:tc>
@@ -4559,7 +4559,7 @@
                 <w:sz w:val="19"/>
                 <w:szCs w:val="19"/>
               </w:rPr>
-              <w:t xml:space="preserve">9.4 % LUTs, 9.5 % registers, 34 / 80 UltraRAM, 44.5 block RAM, 696 DSP (16 %; the coarse filter bank alone uses 646). The veto adds about 120 LUTs</w:t>
+              <w:t xml:space="preserve">7.7 % LUTs, 6.2 % registers, 34 / 80 UltraRAM, 44.5 block RAM, 661 DSP (15.5 %; the oversampled coarse filter bank computes only the selected subband: about 610 DSP, 512 of them in the polyphase FIR). v1.x with the CSIRO coarse filter bank used 9.4 % LUTs and 696 DSP</w:t>
             </w:r>
           </w:p>
         </w:tc>
@@ -4683,7 +4683,7 @@
                 <w:sz w:val="19"/>
                 <w:szCs w:val="19"/>
               </w:rPr>
-              <w:t xml:space="preserve">xsim with the real CSIRO cores: with INPUT = 5, tones on ADC 5 at +25 and −100 fine channels of subband 12 appear in fine channels 25 and 3996 with the expected 16:1 power ratio and about 50 dB to the neighbouring channels; a decoy tone on another ADC does not appear; shortening the integration part way through gives a clean integration. Not yet tested on the board.</w:t>
+              <w:t xml:space="preserve">The coarse filter bank matches its bit-exact Python model on subbands 0, 1, 7, 12, 15 and 16, including near full scale and an input gap. xsim of the whole spectrometer with the real CSIRO fine filter bank: with INPUT = 5, tones on ADC 5 at +25 and −100 fine channels of subband 12 appear in fine channels 25 and 3996 with the expected 16:1 power ratio; a tone at +65 MHz (outside the old band) appears in channel 1828 at the filter’s expected level; a tone at +90 MHz, which would alias to −55.6 MHz, is 73 dB down; a decoy tone on another ADC does not appear; shortening the integration part way through gives a clean integration. v1.x was tested on the board; v2.0 not yet.</w:t>
             </w:r>
           </w:p>
         </w:tc>
@@ -7061,7 +7061,7 @@
                 <w:sz w:val="19"/>
                 <w:szCs w:val="19"/>
               </w:rPr>
-              <w:t xml:space="preserve">Integration time in seconds or in spectra of 33.33 µs (default 6.0 s = 180000); any spectrometer setting restarts the integration</w:t>
+              <w:t xml:space="preserve">Integration time in seconds or in spectra of 28.125 µs (default 6.0 s = 213333); any spectrometer setting restarts the integration. The time is saved in seconds, so it is kept if the spectrum length changes</w:t>
             </w:r>
           </w:p>
         </w:tc>
@@ -7926,7 +7926,7 @@
                 <w:sz w:val="19"/>
                 <w:szCs w:val="19"/>
               </w:rPr>
-              <w:t xml:space="preserve">30 kHz fine channels (4096 per 122.88 MHz subband); one spectrum every 33.33 µs</w:t>
+              <w:t xml:space="preserve">35.556 kHz fine channels (4096 spanning 145.64 MHz; 3456 within each 122.88 MHz subband); one spectrum every 28.125 µs; aliasing into the subband ≤ −72 dB</w:t>
             </w:r>
           </w:p>
         </w:tc>
@@ -7988,7 +7988,7 @@
                 <w:sz w:val="19"/>
                 <w:szCs w:val="19"/>
               </w:rPr>
-              <w:t xml:space="preserve">N × 33.33 µs, default 6.000 s. Integrations shorter than about 50 ms can be lost: 2 banks, about 3 ms server readout each</w:t>
+              <w:t xml:space="preserve">N × 28.125 µs, default 6.000 s. Integrations shorter than about 50 ms can be lost: 2 banks, about 3 ms server readout each</w:t>
             </w:r>
           </w:p>
         </w:tc>
@@ -8225,7 +8225,7 @@
         <w:spacing w:after="60"/>
       </w:pPr>
       <w:r>
-        <w:t xml:space="preserve">The server log shows “spec: spectrometer v1.1, 2 banks” and GET SPEC shows present=1, enabled=1, input 0, subband 12 and an integration time of 6 s.</w:t>
+        <w:t xml:space="preserve">The server log shows “spec: spectrometer v2.0, 2 banks” and the coarse filter bank with decimation 27; GET SPEC shows present=1, enabled=1, input 0, subband 12, decim=27, fine_khz=35.556 and an integration time of 6 s.</w:t>
       </w:r>
     </w:p>
     <w:p>
@@ -8238,7 +8238,7 @@
         <w:spacing w:after="60"/>
       </w:pPr>
       <w:r>
-        <w:t xml:space="preserve">A CW tone of 1476.06 MHz on ADC 0 (subband 12 centre + 1.5 MHz) appears at 1476.06 MHz in every 6 s integration, and disappears with SET SPEC_SUBBAND 11.</w:t>
+        <w:t xml:space="preserve">A CW tone of 1476.06 MHz on ADC 0 (subband 12 centre + 1.5 MHz) appears at 1476.06 MHz in every 6 s integration, and disappears with SET SPEC_SUBBAND 11. Moved to 1539.56 MHz (+65 MHz) it appears in subband 12 outside the band edges about 2 dB down, and in subband 13 inside the band at full level.</w:t>
       </w:r>
     </w:p>
     <w:p>
@@ -8931,7 +8931,7 @@
                 <w:sz w:val="19"/>
                 <w:szCs w:val="19"/>
               </w:rPr>
-              <w:t xml:space="preserve">Not in git (CSIRO IP, kept locally): System Generator cores pfb32x16t, dfb4096x1c and rnd_23_18, needed by the FPGA build and the spectrometer simulation</w:t>
+              <w:t xml:space="preserve">Not in git (CSIRO IP, kept locally): System Generator cores; dfb4096x1c is needed by the FPGA build and the spectrometer simulation (pfb32x16t and rnd_23_18 were used by spectrometer v1.x)</w:t>
             </w:r>
           </w:p>
         </w:tc>

</xml_diff>

<commit_message>
Track the CSIRO DFB core (dfb4096x1c_v2_0) so the branch rebuilds from git
The fine filter bank is the only System Generator core this branch uses;
its IP repository export (component.xml, generated HDL, sub-core .xci and
.coe files) is now tracked in refernces/PFB/dfb4096x1c_v2_0, so a fresh
clone has everything needed for the FPGA build and run_sim.sh spec.  The
redundant export .zip and the unused v1.x cores (pfb32x16t, rnd_*) stay
ignored.  spec_ip.tcl, READMEs, comments and the System Description updated.

Co-Authored-By: Claude Opus 5.5 <noreply@anthropic.com>
</commit_message>
<xml_diff>
--- a/docs/lunaZCU111_System_Description.docx
+++ b/docs/lunaZCU111_System_Description.docx
@@ -78,7 +78,7 @@
           <w:sz w:val="22"/>
           <w:szCs w:val="22"/>
         </w:rPr>
-        <w:t xml:space="preserve">Document version 1.4 — 18 October 2026</w:t>
+        <w:t xml:space="preserve">Document version 1.4 — 19 October 2026</w:t>
       </w:r>
     </w:p>
     <w:p>
@@ -3730,7 +3730,7 @@
         <w:spacing w:after="120" w:line="276"/>
       </w:pPr>
       <w:r>
-        <w:t xml:space="preserve">Any one of the eight channels can be fed to an integrating spectrometer that runs alongside the trigger (hw/hdl/spectrometer_top.vhd). The coarse filter bank (ospfb) is our own VHDL; the fine filter bank (dfb4096x1c) is a core developed at CSIRO with System Generator. It is not part of the repository: the build creates it as an IP-catalog instance from a local folder (refernces/PFB). Spectrometer v1.x used CSIRO’s critically sampled coarse filter bank pfb32x16t (with the rounding block rnd_23_18); its response is −6 dB at the subband edges, so the outer fine channels contained aliases of the neighbouring subband. v2.0 oversamples by 32/27, which moves those aliases outside the subband’s band.</w:t>
+        <w:t xml:space="preserve">Any one of the eight channels can be fed to an integrating spectrometer that runs alongside the trigger (hw/hdl/spectrometer_top.vhd). The coarse filter bank (ospfb) is our own VHDL; the fine filter bank (dfb4096x1c) is a core developed at CSIRO with System Generator. It is in the repository as a System Generator 2018.2 IP-catalog export (refernces/PFB/dfb4096x1c_v2_0), from which the build creates the IP instance, so a fresh clone has everything needed to rebuild the design. Spectrometer v1.x used CSIRO’s critically sampled coarse filter bank pfb32x16t (with the rounding block rnd_23_18); its response is −6 dB at the subband edges, so the outer fine channels contained aliases of the neighbouring subband. v2.0 oversamples by 32/27, which moves those aliases outside the subband’s band.</w:t>
       </w:r>
     </w:p>
     <w:tbl>
@@ -8092,7 +8092,7 @@
         <w:spacing w:after="60"/>
       </w:pPr>
       <w:r>
-        <w:t xml:space="preserve">Build the FPGA (about 1 hour; needs the CSIRO cores in refernces/PFB or LUNA_PFB_IP): vivado -mode batch -source hw/scripts/build.tcl -tclargs all 3</w:t>
+        <w:t xml:space="preserve">Build the FPGA (about 1 hour; uses the CSIRO core in refernces/PFB/dfb4096x1c_v2_0): vivado -mode batch -source hw/scripts/build.tcl -tclargs all 3</w:t>
       </w:r>
     </w:p>
     <w:p>
@@ -8901,7 +8901,7 @@
                 <w:sz w:val="19"/>
                 <w:szCs w:val="19"/>
               </w:rPr>
-              <w:t xml:space="preserve">refernces/PFB/</w:t>
+              <w:t xml:space="preserve">refernces/PFB/dfb4096x1c_v2_0/</w:t>
             </w:r>
           </w:p>
         </w:tc>
@@ -8931,7 +8931,7 @@
                 <w:sz w:val="19"/>
                 <w:szCs w:val="19"/>
               </w:rPr>
-              <w:t xml:space="preserve">Not in git (CSIRO IP, kept locally): System Generator cores; dfb4096x1c is needed by the FPGA build and the spectrometer simulation (pfb32x16t and rnd_23_18 were used by spectrometer v1.x)</w:t>
+              <w:t xml:space="preserve">CSIRO fine filter bank dfb4096x1c (System Generator 2018.2 IP repository), needed by the FPGA build and the spectrometer simulation; the v1.x cores pfb32x16t and rnd_23_18 are not used and not in git</w:t>
             </w:r>
           </w:p>
         </w:tc>

</xml_diff>

<commit_message>
lunaGUI: hide the spectrometer guard channels by default
The 320 fine channels each side of the subband's own +-61.44 MHz band lie
in the coarse filter's transition band and also hold signal wrapped round
from 145.64 MHz away, so the spectrum window now shows only the 3456
in-band channels.  A 'Guard channels' toggle (saved) shows all 4096, with
the guard channels greyed and shaded in the plot and dimmed in the
waterfall.  READMEs and System Description explain the guard channels and
add a wrap-round check (tone at 1400 MHz) to the bring-up list.

Co-Authored-By: Claude Opus 5.5 <noreply@anthropic.com>
</commit_message>
<xml_diff>
--- a/docs/lunaZCU111_System_Description.docx
+++ b/docs/lunaZCU111_System_Description.docx
@@ -4128,7 +4128,7 @@
                 <w:sz w:val="19"/>
                 <w:szCs w:val="19"/>
               </w:rPr>
-              <w:t xml:space="preserve">4096 channels of 35.556 kHz spanning 145.636 MHz (the central 3456, ±61.44 MHz, are the subband’s own band; the outer 640 overlap the neighbouring subbands), one spectrum every 28.125 µs; power accumulated in 64 bits over ACC_LEN + 1 spectra (default 213333 = 6.000 s)</w:t>
+              <w:t xml:space="preserve">4096 channels of 35.556 kHz spanning 145.636 MHz (the central 3456, ±61.44 MHz, are the subband’s own band; the outer 640 are guard channels in the filter’s transition band, which also hold signal from 145.64 MHz away wrapped round; lunaGUI hides them unless asked), one spectrum every 28.125 µs; power accumulated in 64 bits over ACC_LEN + 1 spectra (default 213333 = 6.000 s)</w:t>
             </w:r>
           </w:p>
         </w:tc>
@@ -8238,7 +8238,7 @@
         <w:spacing w:after="60"/>
       </w:pPr>
       <w:r>
-        <w:t xml:space="preserve">A CW tone of 1476.06 MHz on ADC 0 (subband 12 centre + 1.5 MHz) appears at 1476.06 MHz in every 6 s integration, and disappears with SET SPEC_SUBBAND 11. Moved to 1539.56 MHz (+65 MHz) it appears in subband 12 outside the band edges about 2 dB down, and in subband 13 inside the band at full level.</w:t>
+        <w:t xml:space="preserve">A CW tone of 1476.06 MHz on ADC 0 (subband 12 centre + 1.5 MHz) appears at 1476.06 MHz in every 6 s integration, and disappears with SET SPEC_SUBBAND 11. Moved to 1539.56 MHz (+65 MHz) it appears in subband 12 outside the band edges about 2 dB down (lunaGUI: tick Guard channels), and in subband 13 inside the band at full level. A tone at 1400.00 MHz appears in subband 12 only in the upper guard channels at 1545.64 MHz, about 15 dB down, and in subband 11 inside the band at full level.</w:t>
       </w:r>
     </w:p>
     <w:p>

</xml_diff>